<commit_message>
add and update documents, UI + BE of 2 Sprints and report file
</commit_message>
<xml_diff>
--- a/Báo Cáo Tiến Độ Và Kết Quả.docx
+++ b/Báo Cáo Tiến Độ Và Kết Quả.docx
@@ -206,6 +206,8 @@
           <w:lang w:val="vi-VN"/>
         </w:rPr>
       </w:pPr>
+      <w:bookmarkStart w:id="0" w:name="_GoBack"/>
+      <w:bookmarkEnd w:id="0"/>
     </w:p>
     <w:p>
       <w:pPr>
@@ -722,19 +724,7 @@
                 <w:vertAlign w:val="baseline"/>
                 <w:lang w:val="vi-VN"/>
               </w:rPr>
-              <w:t>Product Bac</w:t>
-            </w:r>
-            <w:bookmarkStart w:id="0" w:name="_GoBack"/>
-            <w:bookmarkEnd w:id="0"/>
-            <w:r>
-              <w:rPr>
-                <w:rFonts w:hint="default" w:ascii="Times New Roman" w:hAnsi="Times New Roman" w:cs="Times New Roman"/>
-                <w:sz w:val="26"/>
-                <w:szCs w:val="26"/>
-                <w:vertAlign w:val="baseline"/>
-                <w:lang w:val="vi-VN"/>
-              </w:rPr>
-              <w:t>klog</w:t>
+              <w:t>Product Backlog</w:t>
             </w:r>
           </w:p>
         </w:tc>
@@ -816,6 +806,192 @@
                 <w:lang w:val="vi-VN"/>
               </w:rPr>
               <w:t>Database</w:t>
+            </w:r>
+          </w:p>
+        </w:tc>
+      </w:tr>
+      <w:tr>
+        <w:tblPrEx>
+          <w:tblBorders>
+            <w:top w:val="single" w:color="auto" w:sz="4" w:space="0"/>
+            <w:left w:val="single" w:color="auto" w:sz="4" w:space="0"/>
+            <w:bottom w:val="single" w:color="auto" w:sz="4" w:space="0"/>
+            <w:right w:val="single" w:color="auto" w:sz="4" w:space="0"/>
+            <w:insideH w:val="single" w:color="auto" w:sz="4" w:space="0"/>
+            <w:insideV w:val="single" w:color="auto" w:sz="4" w:space="0"/>
+          </w:tblBorders>
+          <w:tblCellMar>
+            <w:top w:w="0" w:type="dxa"/>
+            <w:left w:w="108" w:type="dxa"/>
+            <w:bottom w:w="0" w:type="dxa"/>
+            <w:right w:w="108" w:type="dxa"/>
+          </w:tblCellMar>
+        </w:tblPrEx>
+        <w:trPr>
+          <w:trHeight w:val="448" w:hRule="atLeast"/>
+        </w:trPr>
+        <w:tc>
+          <w:tcPr>
+            <w:tcW w:w="3991" w:type="dxa"/>
+            <w:vAlign w:val="center"/>
+          </w:tcPr>
+          <w:p>
+            <w:pPr>
+              <w:widowControl w:val="0"/>
+              <w:spacing w:line="360" w:lineRule="auto"/>
+              <w:jc w:val="left"/>
+              <w:rPr>
+                <w:rFonts w:hint="default" w:ascii="Times New Roman" w:hAnsi="Times New Roman" w:cs="Times New Roman"/>
+                <w:sz w:val="26"/>
+                <w:szCs w:val="26"/>
+                <w:vertAlign w:val="baseline"/>
+                <w:lang w:val="vi-VN"/>
+              </w:rPr>
+            </w:pPr>
+            <w:r>
+              <w:rPr>
+                <w:rFonts w:hint="default" w:ascii="Times New Roman" w:hAnsi="Times New Roman" w:cs="Times New Roman"/>
+                <w:sz w:val="26"/>
+                <w:szCs w:val="26"/>
+                <w:vertAlign w:val="baseline"/>
+                <w:lang w:val="vi-VN"/>
+              </w:rPr>
+              <w:t>Lê Trương Ánh Dương,</w:t>
+            </w:r>
+          </w:p>
+          <w:p>
+            <w:pPr>
+              <w:widowControl w:val="0"/>
+              <w:spacing w:line="360" w:lineRule="auto"/>
+              <w:jc w:val="left"/>
+              <w:rPr>
+                <w:rFonts w:hint="default" w:ascii="Times New Roman" w:hAnsi="Times New Roman" w:cs="Times New Roman"/>
+                <w:sz w:val="26"/>
+                <w:szCs w:val="26"/>
+                <w:vertAlign w:val="baseline"/>
+                <w:lang w:val="vi-VN"/>
+              </w:rPr>
+            </w:pPr>
+            <w:r>
+              <w:rPr>
+                <w:rFonts w:hint="default" w:ascii="Times New Roman" w:hAnsi="Times New Roman" w:cs="Times New Roman"/>
+                <w:sz w:val="26"/>
+                <w:szCs w:val="26"/>
+                <w:vertAlign w:val="baseline"/>
+                <w:lang w:val="vi-VN"/>
+              </w:rPr>
+              <w:t>Trương Ngọc Gia Hưng</w:t>
+            </w:r>
+          </w:p>
+        </w:tc>
+        <w:tc>
+          <w:tcPr>
+            <w:tcW w:w="4531" w:type="dxa"/>
+            <w:vAlign w:val="center"/>
+          </w:tcPr>
+          <w:p>
+            <w:pPr>
+              <w:widowControl w:val="0"/>
+              <w:spacing w:line="240" w:lineRule="auto"/>
+              <w:jc w:val="left"/>
+              <w:rPr>
+                <w:rFonts w:hint="default" w:ascii="Times New Roman" w:hAnsi="Times New Roman" w:cs="Times New Roman"/>
+                <w:sz w:val="26"/>
+                <w:szCs w:val="26"/>
+                <w:vertAlign w:val="baseline"/>
+                <w:lang w:val="vi-VN"/>
+              </w:rPr>
+            </w:pPr>
+            <w:r>
+              <w:rPr>
+                <w:rFonts w:hint="default" w:ascii="Times New Roman" w:hAnsi="Times New Roman" w:cs="Times New Roman"/>
+                <w:sz w:val="26"/>
+                <w:szCs w:val="26"/>
+                <w:vertAlign w:val="baseline"/>
+                <w:lang w:val="vi-VN"/>
+              </w:rPr>
+              <w:t>User Interface</w:t>
+            </w:r>
+          </w:p>
+        </w:tc>
+      </w:tr>
+      <w:tr>
+        <w:tblPrEx>
+          <w:tblBorders>
+            <w:top w:val="single" w:color="auto" w:sz="4" w:space="0"/>
+            <w:left w:val="single" w:color="auto" w:sz="4" w:space="0"/>
+            <w:bottom w:val="single" w:color="auto" w:sz="4" w:space="0"/>
+            <w:right w:val="single" w:color="auto" w:sz="4" w:space="0"/>
+            <w:insideH w:val="single" w:color="auto" w:sz="4" w:space="0"/>
+            <w:insideV w:val="single" w:color="auto" w:sz="4" w:space="0"/>
+          </w:tblBorders>
+          <w:tblCellMar>
+            <w:top w:w="0" w:type="dxa"/>
+            <w:left w:w="108" w:type="dxa"/>
+            <w:bottom w:w="0" w:type="dxa"/>
+            <w:right w:w="108" w:type="dxa"/>
+          </w:tblCellMar>
+        </w:tblPrEx>
+        <w:trPr>
+          <w:trHeight w:val="448" w:hRule="atLeast"/>
+        </w:trPr>
+        <w:tc>
+          <w:tcPr>
+            <w:tcW w:w="3991" w:type="dxa"/>
+            <w:vAlign w:val="center"/>
+          </w:tcPr>
+          <w:p>
+            <w:pPr>
+              <w:widowControl w:val="0"/>
+              <w:spacing w:line="240" w:lineRule="auto"/>
+              <w:jc w:val="left"/>
+              <w:rPr>
+                <w:rFonts w:hint="default" w:ascii="Times New Roman" w:hAnsi="Times New Roman" w:cs="Times New Roman"/>
+                <w:sz w:val="26"/>
+                <w:szCs w:val="26"/>
+                <w:vertAlign w:val="baseline"/>
+                <w:lang w:val="vi-VN"/>
+              </w:rPr>
+            </w:pPr>
+            <w:r>
+              <w:rPr>
+                <w:rFonts w:hint="default" w:ascii="Times New Roman" w:hAnsi="Times New Roman" w:cs="Times New Roman"/>
+                <w:sz w:val="26"/>
+                <w:szCs w:val="26"/>
+                <w:vertAlign w:val="baseline"/>
+                <w:lang w:val="vi-VN"/>
+              </w:rPr>
+              <w:t>Đặng Phước Hoàng Long</w:t>
+            </w:r>
+          </w:p>
+        </w:tc>
+        <w:tc>
+          <w:tcPr>
+            <w:tcW w:w="4531" w:type="dxa"/>
+            <w:vAlign w:val="center"/>
+          </w:tcPr>
+          <w:p>
+            <w:pPr>
+              <w:widowControl w:val="0"/>
+              <w:spacing w:line="240" w:lineRule="auto"/>
+              <w:jc w:val="left"/>
+              <w:rPr>
+                <w:rFonts w:hint="default" w:ascii="Times New Roman" w:hAnsi="Times New Roman" w:cs="Times New Roman"/>
+                <w:sz w:val="26"/>
+                <w:szCs w:val="26"/>
+                <w:vertAlign w:val="baseline"/>
+                <w:lang w:val="vi-VN"/>
+              </w:rPr>
+            </w:pPr>
+            <w:r>
+              <w:rPr>
+                <w:rFonts w:hint="default" w:ascii="Times New Roman" w:hAnsi="Times New Roman" w:cs="Times New Roman"/>
+                <w:sz w:val="26"/>
+                <w:szCs w:val="26"/>
+                <w:vertAlign w:val="baseline"/>
+                <w:lang w:val="vi-VN"/>
+              </w:rPr>
+              <w:t>Project Test Plan</w:t>
             </w:r>
           </w:p>
         </w:tc>
@@ -1115,30 +1291,31 @@
         <w:tc>
           <w:tcPr>
             <w:tcW w:w="4531" w:type="dxa"/>
-            <w:vAlign w:val="center"/>
-          </w:tcPr>
-          <w:p>
-            <w:pPr>
-              <w:widowControl w:val="0"/>
-              <w:spacing w:line="240" w:lineRule="auto"/>
-              <w:jc w:val="left"/>
-              <w:rPr>
-                <w:rFonts w:hint="default" w:ascii="Times New Roman" w:hAnsi="Times New Roman" w:cs="Times New Roman"/>
-                <w:sz w:val="26"/>
-                <w:szCs w:val="26"/>
-                <w:vertAlign w:val="baseline"/>
-                <w:lang w:val="vi-VN"/>
-              </w:rPr>
-            </w:pPr>
-            <w:r>
-              <w:rPr>
-                <w:rFonts w:hint="default" w:ascii="Times New Roman" w:hAnsi="Times New Roman"/>
-                <w:sz w:val="26"/>
-                <w:szCs w:val="26"/>
-                <w:vertAlign w:val="baseline"/>
-                <w:lang w:val="vi-VN"/>
-              </w:rPr>
-              <w:t>Danh sách ngành nghề</w:t>
+            <w:shd w:val="clear"/>
+            <w:vAlign w:val="center"/>
+          </w:tcPr>
+          <w:p>
+            <w:pPr>
+              <w:widowControl w:val="0"/>
+              <w:spacing w:line="240" w:lineRule="auto"/>
+              <w:jc w:val="left"/>
+              <w:rPr>
+                <w:rFonts w:hint="default" w:ascii="Times New Roman" w:hAnsi="Times New Roman" w:cs="Times New Roman" w:eastAsiaTheme="minorEastAsia"/>
+                <w:sz w:val="26"/>
+                <w:szCs w:val="26"/>
+                <w:vertAlign w:val="baseline"/>
+                <w:lang w:val="vi-VN" w:eastAsia="zh-CN" w:bidi="ar-SA"/>
+              </w:rPr>
+            </w:pPr>
+            <w:r>
+              <w:rPr>
+                <w:rFonts w:hint="default" w:ascii="Times New Roman" w:hAnsi="Times New Roman"/>
+                <w:sz w:val="26"/>
+                <w:szCs w:val="26"/>
+                <w:vertAlign w:val="baseline"/>
+                <w:lang w:val="vi-VN"/>
+              </w:rPr>
+              <w:t>Quên mật khẩu</w:t>
             </w:r>
           </w:p>
         </w:tc>
@@ -1167,6 +1344,7 @@
           <w:tcPr>
             <w:tcW w:w="3991" w:type="dxa"/>
             <w:vMerge w:val="continue"/>
+            <w:tcBorders/>
             <w:vAlign w:val="center"/>
           </w:tcPr>
           <w:p>
@@ -1210,7 +1388,7 @@
                 <w:vertAlign w:val="baseline"/>
                 <w:lang w:val="vi-VN"/>
               </w:rPr>
-              <w:t>Chi tiết ngành nghề</w:t>
+              <w:t>Danh sách ngành nghề</w:t>
             </w:r>
           </w:p>
         </w:tc>
@@ -1239,6 +1417,7 @@
           <w:tcPr>
             <w:tcW w:w="3991" w:type="dxa"/>
             <w:vMerge w:val="continue"/>
+            <w:tcBorders/>
             <w:vAlign w:val="center"/>
           </w:tcPr>
           <w:p>
@@ -1282,7 +1461,80 @@
                 <w:vertAlign w:val="baseline"/>
                 <w:lang w:val="vi-VN"/>
               </w:rPr>
-              <w:t>Quên mật khẩu</w:t>
+              <w:t>Chi tiết ngành nghề</w:t>
+            </w:r>
+          </w:p>
+        </w:tc>
+      </w:tr>
+      <w:tr>
+        <w:tblPrEx>
+          <w:tblBorders>
+            <w:top w:val="single" w:color="auto" w:sz="4" w:space="0"/>
+            <w:left w:val="single" w:color="auto" w:sz="4" w:space="0"/>
+            <w:bottom w:val="single" w:color="auto" w:sz="4" w:space="0"/>
+            <w:right w:val="single" w:color="auto" w:sz="4" w:space="0"/>
+            <w:insideH w:val="single" w:color="auto" w:sz="4" w:space="0"/>
+            <w:insideV w:val="single" w:color="auto" w:sz="4" w:space="0"/>
+          </w:tblBorders>
+          <w:tblCellMar>
+            <w:top w:w="0" w:type="dxa"/>
+            <w:left w:w="108" w:type="dxa"/>
+            <w:bottom w:w="0" w:type="dxa"/>
+            <w:right w:w="108" w:type="dxa"/>
+          </w:tblCellMar>
+        </w:tblPrEx>
+        <w:trPr>
+          <w:trHeight w:val="448" w:hRule="atLeast"/>
+        </w:trPr>
+        <w:tc>
+          <w:tcPr>
+            <w:tcW w:w="3991" w:type="dxa"/>
+            <w:vMerge w:val="continue"/>
+            <w:tcBorders/>
+            <w:vAlign w:val="center"/>
+          </w:tcPr>
+          <w:p>
+            <w:pPr>
+              <w:widowControl w:val="0"/>
+              <w:spacing w:line="240" w:lineRule="auto"/>
+              <w:jc w:val="left"/>
+              <w:rPr>
+                <w:rFonts w:hint="default" w:ascii="Times New Roman" w:hAnsi="Times New Roman" w:cs="Times New Roman"/>
+                <w:sz w:val="26"/>
+                <w:szCs w:val="26"/>
+                <w:vertAlign w:val="baseline"/>
+                <w:lang w:val="vi-VN"/>
+              </w:rPr>
+            </w:pPr>
+          </w:p>
+        </w:tc>
+        <w:tc>
+          <w:tcPr>
+            <w:tcW w:w="4531" w:type="dxa"/>
+            <w:vAlign w:val="center"/>
+          </w:tcPr>
+          <w:p>
+            <w:pPr>
+              <w:widowControl w:val="0"/>
+              <w:spacing w:line="240" w:lineRule="auto"/>
+              <w:jc w:val="left"/>
+              <w:rPr>
+                <w:rFonts w:hint="default" w:ascii="Times New Roman" w:hAnsi="Times New Roman" w:cs="Times New Roman"/>
+                <w:sz w:val="26"/>
+                <w:szCs w:val="26"/>
+                <w:vertAlign w:val="baseline"/>
+                <w:lang w:val="vi-VN"/>
+              </w:rPr>
+            </w:pPr>
+            <w:r>
+              <w:rPr>
+                <w:rFonts w:hint="default" w:ascii="Times New Roman" w:hAnsi="Times New Roman"/>
+                <w:sz w:val="26"/>
+                <w:szCs w:val="26"/>
+                <w:vertAlign w:val="baseline"/>
+                <w:lang w:val="vi-VN"/>
+              </w:rPr>
+              <w:t>Chi tiết thanh toán</w:t>
             </w:r>
           </w:p>
         </w:tc>
@@ -1393,6 +1645,7 @@
           <w:tcPr>
             <w:tcW w:w="3991" w:type="dxa"/>
             <w:vMerge w:val="continue"/>
+            <w:tcBorders/>
             <w:vAlign w:val="center"/>
           </w:tcPr>
           <w:p>
@@ -1465,6 +1718,7 @@
           <w:tcPr>
             <w:tcW w:w="3991" w:type="dxa"/>
             <w:vMerge w:val="continue"/>
+            <w:tcBorders/>
             <w:vAlign w:val="center"/>
           </w:tcPr>
           <w:p>
@@ -1537,6 +1791,7 @@
           <w:tcPr>
             <w:tcW w:w="3991" w:type="dxa"/>
             <w:vMerge w:val="continue"/>
+            <w:tcBorders/>
             <w:vAlign w:val="center"/>
           </w:tcPr>
           <w:p>
@@ -1581,6 +1836,79 @@
                 <w:lang w:val="vi-VN"/>
               </w:rPr>
               <w:t>Việc làm đã lưu</w:t>
+            </w:r>
+          </w:p>
+        </w:tc>
+      </w:tr>
+      <w:tr>
+        <w:tblPrEx>
+          <w:tblBorders>
+            <w:top w:val="single" w:color="auto" w:sz="4" w:space="0"/>
+            <w:left w:val="single" w:color="auto" w:sz="4" w:space="0"/>
+            <w:bottom w:val="single" w:color="auto" w:sz="4" w:space="0"/>
+            <w:right w:val="single" w:color="auto" w:sz="4" w:space="0"/>
+            <w:insideH w:val="single" w:color="auto" w:sz="4" w:space="0"/>
+            <w:insideV w:val="single" w:color="auto" w:sz="4" w:space="0"/>
+          </w:tblBorders>
+          <w:tblCellMar>
+            <w:top w:w="0" w:type="dxa"/>
+            <w:left w:w="108" w:type="dxa"/>
+            <w:bottom w:w="0" w:type="dxa"/>
+            <w:right w:w="108" w:type="dxa"/>
+          </w:tblCellMar>
+        </w:tblPrEx>
+        <w:trPr>
+          <w:trHeight w:val="448" w:hRule="atLeast"/>
+        </w:trPr>
+        <w:tc>
+          <w:tcPr>
+            <w:tcW w:w="3991" w:type="dxa"/>
+            <w:vMerge w:val="continue"/>
+            <w:tcBorders/>
+            <w:vAlign w:val="center"/>
+          </w:tcPr>
+          <w:p>
+            <w:pPr>
+              <w:widowControl w:val="0"/>
+              <w:spacing w:line="240" w:lineRule="auto"/>
+              <w:jc w:val="left"/>
+              <w:rPr>
+                <w:rFonts w:hint="default" w:ascii="Times New Roman" w:hAnsi="Times New Roman" w:cs="Times New Roman"/>
+                <w:sz w:val="26"/>
+                <w:szCs w:val="26"/>
+                <w:vertAlign w:val="baseline"/>
+                <w:lang w:val="vi-VN"/>
+              </w:rPr>
+            </w:pPr>
+          </w:p>
+        </w:tc>
+        <w:tc>
+          <w:tcPr>
+            <w:tcW w:w="4531" w:type="dxa"/>
+            <w:vAlign w:val="center"/>
+          </w:tcPr>
+          <w:p>
+            <w:pPr>
+              <w:widowControl w:val="0"/>
+              <w:spacing w:line="240" w:lineRule="auto"/>
+              <w:jc w:val="left"/>
+              <w:rPr>
+                <w:rFonts w:hint="default" w:ascii="Times New Roman" w:hAnsi="Times New Roman"/>
+                <w:sz w:val="26"/>
+                <w:szCs w:val="26"/>
+                <w:vertAlign w:val="baseline"/>
+                <w:lang w:val="vi-VN"/>
+              </w:rPr>
+            </w:pPr>
+            <w:r>
+              <w:rPr>
+                <w:rFonts w:hint="default" w:ascii="Times New Roman" w:hAnsi="Times New Roman"/>
+                <w:sz w:val="26"/>
+                <w:szCs w:val="26"/>
+                <w:vertAlign w:val="baseline"/>
+                <w:lang w:val="vi-VN"/>
+              </w:rPr>
+              <w:t>Lịch sử thanh toán</w:t>
             </w:r>
           </w:p>
         </w:tc>
@@ -1691,6 +2019,7 @@
           <w:tcPr>
             <w:tcW w:w="3991" w:type="dxa"/>
             <w:vMerge w:val="continue"/>
+            <w:tcBorders/>
             <w:vAlign w:val="center"/>
           </w:tcPr>
           <w:p>
@@ -1763,6 +2092,7 @@
           <w:tcPr>
             <w:tcW w:w="3991" w:type="dxa"/>
             <w:vMerge w:val="continue"/>
+            <w:tcBorders/>
             <w:vAlign w:val="center"/>
           </w:tcPr>
           <w:p>
@@ -1835,6 +2165,7 @@
           <w:tcPr>
             <w:tcW w:w="3991" w:type="dxa"/>
             <w:vMerge w:val="continue"/>
+            <w:tcBorders/>
             <w:vAlign w:val="center"/>
           </w:tcPr>
           <w:p>
@@ -1907,6 +2238,7 @@
           <w:tcPr>
             <w:tcW w:w="3991" w:type="dxa"/>
             <w:vMerge w:val="continue"/>
+            <w:tcBorders/>
             <w:vAlign w:val="center"/>
           </w:tcPr>
           <w:p>
@@ -1951,6 +2283,152 @@
                 <w:lang w:val="vi-VN"/>
               </w:rPr>
               <w:t>Quản lý CV</w:t>
+            </w:r>
+          </w:p>
+        </w:tc>
+      </w:tr>
+      <w:tr>
+        <w:tblPrEx>
+          <w:tblBorders>
+            <w:top w:val="single" w:color="auto" w:sz="4" w:space="0"/>
+            <w:left w:val="single" w:color="auto" w:sz="4" w:space="0"/>
+            <w:bottom w:val="single" w:color="auto" w:sz="4" w:space="0"/>
+            <w:right w:val="single" w:color="auto" w:sz="4" w:space="0"/>
+            <w:insideH w:val="single" w:color="auto" w:sz="4" w:space="0"/>
+            <w:insideV w:val="single" w:color="auto" w:sz="4" w:space="0"/>
+          </w:tblBorders>
+          <w:tblCellMar>
+            <w:top w:w="0" w:type="dxa"/>
+            <w:left w:w="108" w:type="dxa"/>
+            <w:bottom w:w="0" w:type="dxa"/>
+            <w:right w:w="108" w:type="dxa"/>
+          </w:tblCellMar>
+        </w:tblPrEx>
+        <w:trPr>
+          <w:trHeight w:val="448" w:hRule="atLeast"/>
+        </w:trPr>
+        <w:tc>
+          <w:tcPr>
+            <w:tcW w:w="3991" w:type="dxa"/>
+            <w:vMerge w:val="continue"/>
+            <w:tcBorders/>
+            <w:vAlign w:val="center"/>
+          </w:tcPr>
+          <w:p>
+            <w:pPr>
+              <w:widowControl w:val="0"/>
+              <w:spacing w:line="240" w:lineRule="auto"/>
+              <w:jc w:val="left"/>
+              <w:rPr>
+                <w:rFonts w:hint="default" w:ascii="Times New Roman" w:hAnsi="Times New Roman" w:cs="Times New Roman"/>
+                <w:sz w:val="26"/>
+                <w:szCs w:val="26"/>
+                <w:vertAlign w:val="baseline"/>
+                <w:lang w:val="vi-VN"/>
+              </w:rPr>
+            </w:pPr>
+          </w:p>
+        </w:tc>
+        <w:tc>
+          <w:tcPr>
+            <w:tcW w:w="4531" w:type="dxa"/>
+            <w:vAlign w:val="center"/>
+          </w:tcPr>
+          <w:p>
+            <w:pPr>
+              <w:widowControl w:val="0"/>
+              <w:spacing w:line="240" w:lineRule="auto"/>
+              <w:jc w:val="left"/>
+              <w:rPr>
+                <w:rFonts w:hint="default" w:ascii="Times New Roman" w:hAnsi="Times New Roman"/>
+                <w:sz w:val="26"/>
+                <w:szCs w:val="26"/>
+                <w:vertAlign w:val="baseline"/>
+                <w:lang w:val="vi-VN"/>
+              </w:rPr>
+            </w:pPr>
+            <w:r>
+              <w:rPr>
+                <w:rFonts w:hint="default" w:ascii="Times New Roman" w:hAnsi="Times New Roman"/>
+                <w:sz w:val="26"/>
+                <w:szCs w:val="26"/>
+                <w:vertAlign w:val="baseline"/>
+                <w:lang w:val="vi-VN"/>
+              </w:rPr>
+              <w:t>Công ty đã follow</w:t>
+            </w:r>
+          </w:p>
+        </w:tc>
+      </w:tr>
+      <w:tr>
+        <w:tblPrEx>
+          <w:tblBorders>
+            <w:top w:val="single" w:color="auto" w:sz="4" w:space="0"/>
+            <w:left w:val="single" w:color="auto" w:sz="4" w:space="0"/>
+            <w:bottom w:val="single" w:color="auto" w:sz="4" w:space="0"/>
+            <w:right w:val="single" w:color="auto" w:sz="4" w:space="0"/>
+            <w:insideH w:val="single" w:color="auto" w:sz="4" w:space="0"/>
+            <w:insideV w:val="single" w:color="auto" w:sz="4" w:space="0"/>
+          </w:tblBorders>
+          <w:tblCellMar>
+            <w:top w:w="0" w:type="dxa"/>
+            <w:left w:w="108" w:type="dxa"/>
+            <w:bottom w:w="0" w:type="dxa"/>
+            <w:right w:w="108" w:type="dxa"/>
+          </w:tblCellMar>
+        </w:tblPrEx>
+        <w:trPr>
+          <w:trHeight w:val="448" w:hRule="atLeast"/>
+        </w:trPr>
+        <w:tc>
+          <w:tcPr>
+            <w:tcW w:w="3991" w:type="dxa"/>
+            <w:vMerge w:val="continue"/>
+            <w:tcBorders/>
+            <w:vAlign w:val="center"/>
+          </w:tcPr>
+          <w:p>
+            <w:pPr>
+              <w:widowControl w:val="0"/>
+              <w:spacing w:line="240" w:lineRule="auto"/>
+              <w:jc w:val="left"/>
+              <w:rPr>
+                <w:rFonts w:hint="default" w:ascii="Times New Roman" w:hAnsi="Times New Roman" w:cs="Times New Roman"/>
+                <w:sz w:val="26"/>
+                <w:szCs w:val="26"/>
+                <w:vertAlign w:val="baseline"/>
+                <w:lang w:val="vi-VN"/>
+              </w:rPr>
+            </w:pPr>
+          </w:p>
+        </w:tc>
+        <w:tc>
+          <w:tcPr>
+            <w:tcW w:w="4531" w:type="dxa"/>
+            <w:vAlign w:val="center"/>
+          </w:tcPr>
+          <w:p>
+            <w:pPr>
+              <w:widowControl w:val="0"/>
+              <w:spacing w:line="240" w:lineRule="auto"/>
+              <w:jc w:val="left"/>
+              <w:rPr>
+                <w:rFonts w:hint="default" w:ascii="Times New Roman" w:hAnsi="Times New Roman"/>
+                <w:sz w:val="26"/>
+                <w:szCs w:val="26"/>
+                <w:vertAlign w:val="baseline"/>
+                <w:lang w:val="vi-VN"/>
+              </w:rPr>
+            </w:pPr>
+            <w:r>
+              <w:rPr>
+                <w:rFonts w:hint="default" w:ascii="Times New Roman" w:hAnsi="Times New Roman"/>
+                <w:sz w:val="26"/>
+                <w:szCs w:val="26"/>
+                <w:vertAlign w:val="baseline"/>
+                <w:lang w:val="vi-VN"/>
+              </w:rPr>
+              <w:t>Ví AI</w:t>
             </w:r>
           </w:p>
         </w:tc>
@@ -2061,6 +2539,7 @@
           <w:tcPr>
             <w:tcW w:w="3991" w:type="dxa"/>
             <w:vMerge w:val="continue"/>
+            <w:tcBorders/>
             <w:vAlign w:val="center"/>
           </w:tcPr>
           <w:p>
@@ -2133,6 +2612,7 @@
           <w:tcPr>
             <w:tcW w:w="3991" w:type="dxa"/>
             <w:vMerge w:val="continue"/>
+            <w:tcBorders/>
             <w:vAlign w:val="center"/>
           </w:tcPr>
           <w:p>
@@ -2205,6 +2685,7 @@
           <w:tcPr>
             <w:tcW w:w="3991" w:type="dxa"/>
             <w:vMerge w:val="continue"/>
+            <w:tcBorders/>
             <w:vAlign w:val="center"/>
           </w:tcPr>
           <w:p>
@@ -2249,6 +2730,225 @@
                 <w:lang w:val="vi-VN"/>
               </w:rPr>
               <w:t>Báo cáo định hướng nghề nghiệp</w:t>
+            </w:r>
+          </w:p>
+        </w:tc>
+      </w:tr>
+      <w:tr>
+        <w:tblPrEx>
+          <w:tblBorders>
+            <w:top w:val="single" w:color="auto" w:sz="4" w:space="0"/>
+            <w:left w:val="single" w:color="auto" w:sz="4" w:space="0"/>
+            <w:bottom w:val="single" w:color="auto" w:sz="4" w:space="0"/>
+            <w:right w:val="single" w:color="auto" w:sz="4" w:space="0"/>
+            <w:insideH w:val="single" w:color="auto" w:sz="4" w:space="0"/>
+            <w:insideV w:val="single" w:color="auto" w:sz="4" w:space="0"/>
+          </w:tblBorders>
+          <w:tblCellMar>
+            <w:top w:w="0" w:type="dxa"/>
+            <w:left w:w="108" w:type="dxa"/>
+            <w:bottom w:w="0" w:type="dxa"/>
+            <w:right w:w="108" w:type="dxa"/>
+          </w:tblCellMar>
+        </w:tblPrEx>
+        <w:trPr>
+          <w:trHeight w:val="448" w:hRule="atLeast"/>
+        </w:trPr>
+        <w:tc>
+          <w:tcPr>
+            <w:tcW w:w="3991" w:type="dxa"/>
+            <w:vMerge w:val="continue"/>
+            <w:tcBorders/>
+            <w:vAlign w:val="center"/>
+          </w:tcPr>
+          <w:p>
+            <w:pPr>
+              <w:widowControl w:val="0"/>
+              <w:spacing w:line="240" w:lineRule="auto"/>
+              <w:jc w:val="left"/>
+              <w:rPr>
+                <w:rFonts w:hint="default" w:ascii="Times New Roman" w:hAnsi="Times New Roman" w:cs="Times New Roman"/>
+                <w:sz w:val="26"/>
+                <w:szCs w:val="26"/>
+                <w:vertAlign w:val="baseline"/>
+                <w:lang w:val="vi-VN"/>
+              </w:rPr>
+            </w:pPr>
+          </w:p>
+        </w:tc>
+        <w:tc>
+          <w:tcPr>
+            <w:tcW w:w="4531" w:type="dxa"/>
+            <w:vAlign w:val="center"/>
+          </w:tcPr>
+          <w:p>
+            <w:pPr>
+              <w:widowControl w:val="0"/>
+              <w:spacing w:line="240" w:lineRule="auto"/>
+              <w:jc w:val="left"/>
+              <w:rPr>
+                <w:rFonts w:hint="default" w:ascii="Times New Roman" w:hAnsi="Times New Roman"/>
+                <w:sz w:val="26"/>
+                <w:szCs w:val="26"/>
+                <w:vertAlign w:val="baseline"/>
+                <w:lang w:val="vi-VN"/>
+              </w:rPr>
+            </w:pPr>
+            <w:r>
+              <w:rPr>
+                <w:rFonts w:hint="default" w:ascii="Times New Roman" w:hAnsi="Times New Roman"/>
+                <w:sz w:val="26"/>
+                <w:szCs w:val="26"/>
+                <w:vertAlign w:val="baseline"/>
+                <w:lang w:val="vi-VN"/>
+              </w:rPr>
+              <w:t>Tạo CV</w:t>
+            </w:r>
+          </w:p>
+        </w:tc>
+      </w:tr>
+      <w:tr>
+        <w:tblPrEx>
+          <w:tblBorders>
+            <w:top w:val="single" w:color="auto" w:sz="4" w:space="0"/>
+            <w:left w:val="single" w:color="auto" w:sz="4" w:space="0"/>
+            <w:bottom w:val="single" w:color="auto" w:sz="4" w:space="0"/>
+            <w:right w:val="single" w:color="auto" w:sz="4" w:space="0"/>
+            <w:insideH w:val="single" w:color="auto" w:sz="4" w:space="0"/>
+            <w:insideV w:val="single" w:color="auto" w:sz="4" w:space="0"/>
+          </w:tblBorders>
+          <w:tblCellMar>
+            <w:top w:w="0" w:type="dxa"/>
+            <w:left w:w="108" w:type="dxa"/>
+            <w:bottom w:w="0" w:type="dxa"/>
+            <w:right w:w="108" w:type="dxa"/>
+          </w:tblCellMar>
+        </w:tblPrEx>
+        <w:trPr>
+          <w:trHeight w:val="448" w:hRule="atLeast"/>
+        </w:trPr>
+        <w:tc>
+          <w:tcPr>
+            <w:tcW w:w="3991" w:type="dxa"/>
+            <w:vMerge w:val="continue"/>
+            <w:tcBorders/>
+            <w:vAlign w:val="center"/>
+          </w:tcPr>
+          <w:p>
+            <w:pPr>
+              <w:widowControl w:val="0"/>
+              <w:spacing w:line="240" w:lineRule="auto"/>
+              <w:jc w:val="left"/>
+              <w:rPr>
+                <w:rFonts w:hint="default" w:ascii="Times New Roman" w:hAnsi="Times New Roman" w:cs="Times New Roman"/>
+                <w:sz w:val="26"/>
+                <w:szCs w:val="26"/>
+                <w:vertAlign w:val="baseline"/>
+                <w:lang w:val="vi-VN"/>
+              </w:rPr>
+            </w:pPr>
+          </w:p>
+        </w:tc>
+        <w:tc>
+          <w:tcPr>
+            <w:tcW w:w="4531" w:type="dxa"/>
+            <w:vAlign w:val="center"/>
+          </w:tcPr>
+          <w:p>
+            <w:pPr>
+              <w:widowControl w:val="0"/>
+              <w:spacing w:line="240" w:lineRule="auto"/>
+              <w:jc w:val="left"/>
+              <w:rPr>
+                <w:rFonts w:hint="default" w:ascii="Times New Roman" w:hAnsi="Times New Roman"/>
+                <w:sz w:val="26"/>
+                <w:szCs w:val="26"/>
+                <w:vertAlign w:val="baseline"/>
+                <w:lang w:val="vi-VN"/>
+              </w:rPr>
+            </w:pPr>
+            <w:r>
+              <w:rPr>
+                <w:rFonts w:hint="default" w:ascii="Times New Roman" w:hAnsi="Times New Roman"/>
+                <w:sz w:val="26"/>
+                <w:szCs w:val="26"/>
+                <w:vertAlign w:val="baseline"/>
+                <w:lang w:val="vi-VN"/>
+              </w:rPr>
+              <w:t>Chat tư vấn nghề nghiệp</w:t>
+            </w:r>
+          </w:p>
+        </w:tc>
+      </w:tr>
+      <w:tr>
+        <w:tblPrEx>
+          <w:tblBorders>
+            <w:top w:val="single" w:color="auto" w:sz="4" w:space="0"/>
+            <w:left w:val="single" w:color="auto" w:sz="4" w:space="0"/>
+            <w:bottom w:val="single" w:color="auto" w:sz="4" w:space="0"/>
+            <w:right w:val="single" w:color="auto" w:sz="4" w:space="0"/>
+            <w:insideH w:val="single" w:color="auto" w:sz="4" w:space="0"/>
+            <w:insideV w:val="single" w:color="auto" w:sz="4" w:space="0"/>
+          </w:tblBorders>
+          <w:tblCellMar>
+            <w:top w:w="0" w:type="dxa"/>
+            <w:left w:w="108" w:type="dxa"/>
+            <w:bottom w:w="0" w:type="dxa"/>
+            <w:right w:w="108" w:type="dxa"/>
+          </w:tblCellMar>
+        </w:tblPrEx>
+        <w:trPr>
+          <w:trHeight w:val="448" w:hRule="atLeast"/>
+        </w:trPr>
+        <w:tc>
+          <w:tcPr>
+            <w:tcW w:w="3991" w:type="dxa"/>
+            <w:vMerge w:val="continue"/>
+            <w:tcBorders/>
+            <w:vAlign w:val="center"/>
+          </w:tcPr>
+          <w:p>
+            <w:pPr>
+              <w:widowControl w:val="0"/>
+              <w:spacing w:line="240" w:lineRule="auto"/>
+              <w:jc w:val="left"/>
+              <w:rPr>
+                <w:rFonts w:hint="default" w:ascii="Times New Roman" w:hAnsi="Times New Roman" w:cs="Times New Roman"/>
+                <w:sz w:val="26"/>
+                <w:szCs w:val="26"/>
+                <w:vertAlign w:val="baseline"/>
+                <w:lang w:val="vi-VN"/>
+              </w:rPr>
+            </w:pPr>
+          </w:p>
+        </w:tc>
+        <w:tc>
+          <w:tcPr>
+            <w:tcW w:w="4531" w:type="dxa"/>
+            <w:vAlign w:val="center"/>
+          </w:tcPr>
+          <w:p>
+            <w:pPr>
+              <w:widowControl w:val="0"/>
+              <w:spacing w:line="240" w:lineRule="auto"/>
+              <w:jc w:val="left"/>
+              <w:rPr>
+                <w:rFonts w:hint="default" w:ascii="Times New Roman" w:hAnsi="Times New Roman"/>
+                <w:sz w:val="26"/>
+                <w:szCs w:val="26"/>
+                <w:vertAlign w:val="baseline"/>
+                <w:lang w:val="vi-VN"/>
+              </w:rPr>
+            </w:pPr>
+            <w:r>
+              <w:rPr>
+                <w:rFonts w:hint="default" w:ascii="Times New Roman" w:hAnsi="Times New Roman"/>
+                <w:sz w:val="26"/>
+                <w:szCs w:val="26"/>
+                <w:vertAlign w:val="baseline"/>
+                <w:lang w:val="vi-VN"/>
+              </w:rPr>
+              <w:t>Phỏng vấn thử</w:t>
             </w:r>
           </w:p>
         </w:tc>
@@ -2359,6 +3059,7 @@
           <w:tcPr>
             <w:tcW w:w="3991" w:type="dxa"/>
             <w:vMerge w:val="continue"/>
+            <w:tcBorders/>
             <w:vAlign w:val="center"/>
           </w:tcPr>
           <w:p>
@@ -2431,6 +3132,7 @@
           <w:tcPr>
             <w:tcW w:w="3991" w:type="dxa"/>
             <w:vMerge w:val="continue"/>
+            <w:tcBorders/>
             <w:vAlign w:val="center"/>
           </w:tcPr>
           <w:p>
@@ -2503,6 +3205,7 @@
           <w:tcPr>
             <w:tcW w:w="3991" w:type="dxa"/>
             <w:vMerge w:val="continue"/>
+            <w:tcBorders/>
             <w:vAlign w:val="center"/>
           </w:tcPr>
           <w:p>
@@ -2547,6 +3250,79 @@
                 <w:lang w:val="vi-VN"/>
               </w:rPr>
               <w:t>Theo dõi đơn ứng tuyển</w:t>
+            </w:r>
+          </w:p>
+        </w:tc>
+      </w:tr>
+      <w:tr>
+        <w:tblPrEx>
+          <w:tblBorders>
+            <w:top w:val="single" w:color="auto" w:sz="4" w:space="0"/>
+            <w:left w:val="single" w:color="auto" w:sz="4" w:space="0"/>
+            <w:bottom w:val="single" w:color="auto" w:sz="4" w:space="0"/>
+            <w:right w:val="single" w:color="auto" w:sz="4" w:space="0"/>
+            <w:insideH w:val="single" w:color="auto" w:sz="4" w:space="0"/>
+            <w:insideV w:val="single" w:color="auto" w:sz="4" w:space="0"/>
+          </w:tblBorders>
+          <w:tblCellMar>
+            <w:top w:w="0" w:type="dxa"/>
+            <w:left w:w="108" w:type="dxa"/>
+            <w:bottom w:w="0" w:type="dxa"/>
+            <w:right w:w="108" w:type="dxa"/>
+          </w:tblCellMar>
+        </w:tblPrEx>
+        <w:trPr>
+          <w:trHeight w:val="448" w:hRule="atLeast"/>
+        </w:trPr>
+        <w:tc>
+          <w:tcPr>
+            <w:tcW w:w="3991" w:type="dxa"/>
+            <w:vMerge w:val="continue"/>
+            <w:tcBorders/>
+            <w:vAlign w:val="center"/>
+          </w:tcPr>
+          <w:p>
+            <w:pPr>
+              <w:widowControl w:val="0"/>
+              <w:spacing w:line="240" w:lineRule="auto"/>
+              <w:jc w:val="left"/>
+              <w:rPr>
+                <w:rFonts w:hint="default" w:ascii="Times New Roman" w:hAnsi="Times New Roman" w:cs="Times New Roman"/>
+                <w:sz w:val="26"/>
+                <w:szCs w:val="26"/>
+                <w:vertAlign w:val="baseline"/>
+                <w:lang w:val="vi-VN"/>
+              </w:rPr>
+            </w:pPr>
+          </w:p>
+        </w:tc>
+        <w:tc>
+          <w:tcPr>
+            <w:tcW w:w="4531" w:type="dxa"/>
+            <w:vAlign w:val="center"/>
+          </w:tcPr>
+          <w:p>
+            <w:pPr>
+              <w:widowControl w:val="0"/>
+              <w:spacing w:line="240" w:lineRule="auto"/>
+              <w:jc w:val="left"/>
+              <w:rPr>
+                <w:rFonts w:hint="default" w:ascii="Times New Roman" w:hAnsi="Times New Roman"/>
+                <w:sz w:val="26"/>
+                <w:szCs w:val="26"/>
+                <w:vertAlign w:val="baseline"/>
+                <w:lang w:val="vi-VN"/>
+              </w:rPr>
+            </w:pPr>
+            <w:r>
+              <w:rPr>
+                <w:rFonts w:hint="default" w:ascii="Times New Roman" w:hAnsi="Times New Roman"/>
+                <w:sz w:val="26"/>
+                <w:szCs w:val="26"/>
+                <w:vertAlign w:val="baseline"/>
+                <w:lang w:val="vi-VN"/>
+              </w:rPr>
+              <w:t>Trang trung tâm AI</w:t>
             </w:r>
           </w:p>
         </w:tc>
@@ -2598,7 +3374,9 @@
         </w:tblBorders>
         <w:tblLayout w:type="autofit"/>
         <w:tblCellMar>
+          <w:top w:w="0" w:type="dxa"/>
           <w:left w:w="108" w:type="dxa"/>
+          <w:bottom w:w="0" w:type="dxa"/>
           <w:right w:w="108" w:type="dxa"/>
         </w:tblCellMar>
       </w:tblPr>
@@ -2616,6 +3394,12 @@
             <w:insideH w:val="single" w:color="auto" w:sz="4" w:space="0"/>
             <w:insideV w:val="single" w:color="auto" w:sz="4" w:space="0"/>
           </w:tblBorders>
+          <w:tblCellMar>
+            <w:top w:w="0" w:type="dxa"/>
+            <w:left w:w="108" w:type="dxa"/>
+            <w:bottom w:w="0" w:type="dxa"/>
+            <w:right w:w="108" w:type="dxa"/>
+          </w:tblCellMar>
         </w:tblPrEx>
         <w:trPr>
           <w:trHeight w:val="448" w:hRule="atLeast"/>
@@ -2696,7 +3480,9 @@
             <w:insideV w:val="single" w:color="auto" w:sz="4" w:space="0"/>
           </w:tblBorders>
           <w:tblCellMar>
-            <w:left w:w="108" w:type="dxa"/>
+            <w:top w:w="0" w:type="dxa"/>
+            <w:left w:w="108" w:type="dxa"/>
+            <w:bottom w:w="0" w:type="dxa"/>
             <w:right w:w="108" w:type="dxa"/>
           </w:tblCellMar>
         </w:tblPrEx>
@@ -2741,6 +3527,7 @@
           </w:tcPr>
           <w:p>
             <w:pPr>
+              <w:widowControl w:val="0"/>
               <w:spacing w:line="240" w:lineRule="auto"/>
               <w:jc w:val="left"/>
               <w:rPr>
@@ -2775,7 +3562,1575 @@
             <w:insideV w:val="single" w:color="auto" w:sz="4" w:space="0"/>
           </w:tblBorders>
           <w:tblCellMar>
-            <w:left w:w="108" w:type="dxa"/>
+            <w:top w:w="0" w:type="dxa"/>
+            <w:left w:w="108" w:type="dxa"/>
+            <w:bottom w:w="0" w:type="dxa"/>
+            <w:right w:w="108" w:type="dxa"/>
+          </w:tblCellMar>
+        </w:tblPrEx>
+        <w:trPr>
+          <w:trHeight w:val="448" w:hRule="atLeast"/>
+        </w:trPr>
+        <w:tc>
+          <w:tcPr>
+            <w:tcW w:w="4003" w:type="dxa"/>
+            <w:vMerge w:val="continue"/>
+            <w:vAlign w:val="center"/>
+          </w:tcPr>
+          <w:p>
+            <w:pPr>
+              <w:widowControl w:val="0"/>
+              <w:spacing w:line="240" w:lineRule="auto"/>
+              <w:jc w:val="left"/>
+              <w:rPr>
+                <w:rFonts w:hint="default" w:ascii="Times New Roman" w:hAnsi="Times New Roman" w:cs="Times New Roman"/>
+                <w:sz w:val="26"/>
+                <w:szCs w:val="26"/>
+                <w:vertAlign w:val="baseline"/>
+                <w:lang w:val="vi-VN"/>
+              </w:rPr>
+            </w:pPr>
+          </w:p>
+        </w:tc>
+        <w:tc>
+          <w:tcPr>
+            <w:tcW w:w="4519" w:type="dxa"/>
+            <w:vAlign w:val="center"/>
+          </w:tcPr>
+          <w:p>
+            <w:pPr>
+              <w:widowControl w:val="0"/>
+              <w:spacing w:line="240" w:lineRule="auto"/>
+              <w:jc w:val="left"/>
+              <w:rPr>
+                <w:rFonts w:hint="default" w:ascii="Times New Roman" w:hAnsi="Times New Roman" w:cs="Times New Roman"/>
+                <w:sz w:val="26"/>
+                <w:szCs w:val="26"/>
+                <w:vertAlign w:val="baseline"/>
+                <w:lang w:val="vi-VN"/>
+              </w:rPr>
+            </w:pPr>
+            <w:r>
+              <w:rPr>
+                <w:rFonts w:hint="default" w:ascii="Times New Roman" w:hAnsi="Times New Roman"/>
+                <w:sz w:val="26"/>
+                <w:szCs w:val="26"/>
+                <w:vertAlign w:val="baseline"/>
+                <w:lang w:val="vi-VN"/>
+              </w:rPr>
+              <w:t>Dashboard admin</w:t>
+            </w:r>
+          </w:p>
+        </w:tc>
+      </w:tr>
+      <w:tr>
+        <w:tblPrEx>
+          <w:tblBorders>
+            <w:top w:val="single" w:color="auto" w:sz="4" w:space="0"/>
+            <w:left w:val="single" w:color="auto" w:sz="4" w:space="0"/>
+            <w:bottom w:val="single" w:color="auto" w:sz="4" w:space="0"/>
+            <w:right w:val="single" w:color="auto" w:sz="4" w:space="0"/>
+            <w:insideH w:val="single" w:color="auto" w:sz="4" w:space="0"/>
+            <w:insideV w:val="single" w:color="auto" w:sz="4" w:space="0"/>
+          </w:tblBorders>
+          <w:tblCellMar>
+            <w:top w:w="0" w:type="dxa"/>
+            <w:left w:w="108" w:type="dxa"/>
+            <w:bottom w:w="0" w:type="dxa"/>
+            <w:right w:w="108" w:type="dxa"/>
+          </w:tblCellMar>
+        </w:tblPrEx>
+        <w:trPr>
+          <w:trHeight w:val="448" w:hRule="atLeast"/>
+        </w:trPr>
+        <w:tc>
+          <w:tcPr>
+            <w:tcW w:w="4003" w:type="dxa"/>
+            <w:vMerge w:val="continue"/>
+            <w:vAlign w:val="center"/>
+          </w:tcPr>
+          <w:p>
+            <w:pPr>
+              <w:widowControl w:val="0"/>
+              <w:spacing w:line="240" w:lineRule="auto"/>
+              <w:jc w:val="left"/>
+              <w:rPr>
+                <w:rFonts w:hint="default" w:ascii="Times New Roman" w:hAnsi="Times New Roman" w:cs="Times New Roman"/>
+                <w:sz w:val="26"/>
+                <w:szCs w:val="26"/>
+                <w:vertAlign w:val="baseline"/>
+                <w:lang w:val="vi-VN"/>
+              </w:rPr>
+            </w:pPr>
+          </w:p>
+        </w:tc>
+        <w:tc>
+          <w:tcPr>
+            <w:tcW w:w="4519" w:type="dxa"/>
+            <w:vAlign w:val="center"/>
+          </w:tcPr>
+          <w:p>
+            <w:pPr>
+              <w:widowControl w:val="0"/>
+              <w:spacing w:line="240" w:lineRule="auto"/>
+              <w:jc w:val="left"/>
+              <w:rPr>
+                <w:rFonts w:hint="default" w:ascii="Times New Roman" w:hAnsi="Times New Roman" w:cs="Times New Roman"/>
+                <w:sz w:val="26"/>
+                <w:szCs w:val="26"/>
+                <w:vertAlign w:val="baseline"/>
+                <w:lang w:val="vi-VN"/>
+              </w:rPr>
+            </w:pPr>
+            <w:r>
+              <w:rPr>
+                <w:rFonts w:hint="default" w:ascii="Times New Roman" w:hAnsi="Times New Roman"/>
+                <w:sz w:val="26"/>
+                <w:szCs w:val="26"/>
+                <w:vertAlign w:val="baseline"/>
+                <w:lang w:val="vi-VN"/>
+              </w:rPr>
+              <w:t>Hồ sơ admin</w:t>
+            </w:r>
+          </w:p>
+        </w:tc>
+      </w:tr>
+      <w:tr>
+        <w:tblPrEx>
+          <w:tblBorders>
+            <w:top w:val="single" w:color="auto" w:sz="4" w:space="0"/>
+            <w:left w:val="single" w:color="auto" w:sz="4" w:space="0"/>
+            <w:bottom w:val="single" w:color="auto" w:sz="4" w:space="0"/>
+            <w:right w:val="single" w:color="auto" w:sz="4" w:space="0"/>
+            <w:insideH w:val="single" w:color="auto" w:sz="4" w:space="0"/>
+            <w:insideV w:val="single" w:color="auto" w:sz="4" w:space="0"/>
+          </w:tblBorders>
+          <w:tblCellMar>
+            <w:top w:w="0" w:type="dxa"/>
+            <w:left w:w="108" w:type="dxa"/>
+            <w:bottom w:w="0" w:type="dxa"/>
+            <w:right w:w="108" w:type="dxa"/>
+          </w:tblCellMar>
+        </w:tblPrEx>
+        <w:trPr>
+          <w:trHeight w:val="448" w:hRule="atLeast"/>
+        </w:trPr>
+        <w:tc>
+          <w:tcPr>
+            <w:tcW w:w="4003" w:type="dxa"/>
+            <w:vMerge w:val="continue"/>
+            <w:vAlign w:val="center"/>
+          </w:tcPr>
+          <w:p>
+            <w:pPr>
+              <w:widowControl w:val="0"/>
+              <w:spacing w:line="240" w:lineRule="auto"/>
+              <w:jc w:val="left"/>
+              <w:rPr>
+                <w:rFonts w:hint="default" w:ascii="Times New Roman" w:hAnsi="Times New Roman" w:cs="Times New Roman"/>
+                <w:sz w:val="26"/>
+                <w:szCs w:val="26"/>
+                <w:vertAlign w:val="baseline"/>
+                <w:lang w:val="vi-VN"/>
+              </w:rPr>
+            </w:pPr>
+          </w:p>
+        </w:tc>
+        <w:tc>
+          <w:tcPr>
+            <w:tcW w:w="4519" w:type="dxa"/>
+            <w:vAlign w:val="center"/>
+          </w:tcPr>
+          <w:p>
+            <w:pPr>
+              <w:widowControl w:val="0"/>
+              <w:spacing w:line="240" w:lineRule="auto"/>
+              <w:jc w:val="left"/>
+              <w:rPr>
+                <w:rFonts w:hint="default" w:ascii="Times New Roman" w:hAnsi="Times New Roman" w:cs="Times New Roman"/>
+                <w:sz w:val="26"/>
+                <w:szCs w:val="26"/>
+                <w:vertAlign w:val="baseline"/>
+                <w:lang w:val="vi-VN"/>
+              </w:rPr>
+            </w:pPr>
+            <w:r>
+              <w:rPr>
+                <w:rFonts w:hint="default" w:ascii="Times New Roman" w:hAnsi="Times New Roman"/>
+                <w:sz w:val="26"/>
+                <w:szCs w:val="26"/>
+                <w:vertAlign w:val="baseline"/>
+                <w:lang w:val="vi-VN"/>
+              </w:rPr>
+              <w:t>Quản lý đơn ứng tuyển</w:t>
+            </w:r>
+          </w:p>
+        </w:tc>
+      </w:tr>
+      <w:tr>
+        <w:tblPrEx>
+          <w:tblBorders>
+            <w:top w:val="single" w:color="auto" w:sz="4" w:space="0"/>
+            <w:left w:val="single" w:color="auto" w:sz="4" w:space="0"/>
+            <w:bottom w:val="single" w:color="auto" w:sz="4" w:space="0"/>
+            <w:right w:val="single" w:color="auto" w:sz="4" w:space="0"/>
+            <w:insideH w:val="single" w:color="auto" w:sz="4" w:space="0"/>
+            <w:insideV w:val="single" w:color="auto" w:sz="4" w:space="0"/>
+          </w:tblBorders>
+          <w:tblCellMar>
+            <w:top w:w="0" w:type="dxa"/>
+            <w:left w:w="108" w:type="dxa"/>
+            <w:bottom w:w="0" w:type="dxa"/>
+            <w:right w:w="108" w:type="dxa"/>
+          </w:tblCellMar>
+        </w:tblPrEx>
+        <w:trPr>
+          <w:trHeight w:val="448" w:hRule="atLeast"/>
+        </w:trPr>
+        <w:tc>
+          <w:tcPr>
+            <w:tcW w:w="4003" w:type="dxa"/>
+            <w:vMerge w:val="continue"/>
+            <w:vAlign w:val="center"/>
+          </w:tcPr>
+          <w:p>
+            <w:pPr>
+              <w:widowControl w:val="0"/>
+              <w:spacing w:line="240" w:lineRule="auto"/>
+              <w:jc w:val="left"/>
+              <w:rPr>
+                <w:rFonts w:hint="default" w:ascii="Times New Roman" w:hAnsi="Times New Roman" w:cs="Times New Roman"/>
+                <w:sz w:val="26"/>
+                <w:szCs w:val="26"/>
+                <w:vertAlign w:val="baseline"/>
+                <w:lang w:val="vi-VN"/>
+              </w:rPr>
+            </w:pPr>
+          </w:p>
+        </w:tc>
+        <w:tc>
+          <w:tcPr>
+            <w:tcW w:w="4519" w:type="dxa"/>
+            <w:vAlign w:val="center"/>
+          </w:tcPr>
+          <w:p>
+            <w:pPr>
+              <w:widowControl w:val="0"/>
+              <w:spacing w:line="240" w:lineRule="auto"/>
+              <w:jc w:val="left"/>
+              <w:rPr>
+                <w:rFonts w:hint="default" w:ascii="Times New Roman" w:hAnsi="Times New Roman" w:cs="Times New Roman"/>
+                <w:sz w:val="26"/>
+                <w:szCs w:val="26"/>
+                <w:vertAlign w:val="baseline"/>
+                <w:lang w:val="vi-VN"/>
+              </w:rPr>
+            </w:pPr>
+            <w:r>
+              <w:rPr>
+                <w:rFonts w:hint="default" w:ascii="Times New Roman" w:hAnsi="Times New Roman"/>
+                <w:sz w:val="26"/>
+                <w:szCs w:val="26"/>
+                <w:vertAlign w:val="baseline"/>
+                <w:lang w:val="vi-VN"/>
+              </w:rPr>
+              <w:t>Quản lý kỹ năng</w:t>
+            </w:r>
+          </w:p>
+        </w:tc>
+      </w:tr>
+      <w:tr>
+        <w:tblPrEx>
+          <w:tblBorders>
+            <w:top w:val="single" w:color="auto" w:sz="4" w:space="0"/>
+            <w:left w:val="single" w:color="auto" w:sz="4" w:space="0"/>
+            <w:bottom w:val="single" w:color="auto" w:sz="4" w:space="0"/>
+            <w:right w:val="single" w:color="auto" w:sz="4" w:space="0"/>
+            <w:insideH w:val="single" w:color="auto" w:sz="4" w:space="0"/>
+            <w:insideV w:val="single" w:color="auto" w:sz="4" w:space="0"/>
+          </w:tblBorders>
+          <w:tblCellMar>
+            <w:top w:w="0" w:type="dxa"/>
+            <w:left w:w="108" w:type="dxa"/>
+            <w:bottom w:w="0" w:type="dxa"/>
+            <w:right w:w="108" w:type="dxa"/>
+          </w:tblCellMar>
+        </w:tblPrEx>
+        <w:trPr>
+          <w:trHeight w:val="448" w:hRule="atLeast"/>
+        </w:trPr>
+        <w:tc>
+          <w:tcPr>
+            <w:tcW w:w="4003" w:type="dxa"/>
+            <w:vMerge w:val="restart"/>
+            <w:vAlign w:val="center"/>
+          </w:tcPr>
+          <w:p>
+            <w:pPr>
+              <w:widowControl w:val="0"/>
+              <w:spacing w:line="240" w:lineRule="auto"/>
+              <w:jc w:val="left"/>
+              <w:rPr>
+                <w:rFonts w:hint="default" w:ascii="Times New Roman" w:hAnsi="Times New Roman" w:cs="Times New Roman"/>
+                <w:sz w:val="26"/>
+                <w:szCs w:val="26"/>
+                <w:vertAlign w:val="baseline"/>
+                <w:lang w:val="vi-VN"/>
+              </w:rPr>
+            </w:pPr>
+            <w:r>
+              <w:rPr>
+                <w:rFonts w:hint="default" w:ascii="Times New Roman" w:hAnsi="Times New Roman" w:cs="Times New Roman"/>
+                <w:sz w:val="26"/>
+                <w:szCs w:val="26"/>
+                <w:vertAlign w:val="baseline"/>
+                <w:lang w:val="vi-VN"/>
+              </w:rPr>
+              <w:t>Trương Ngọc Gia Hưng</w:t>
+            </w:r>
+          </w:p>
+        </w:tc>
+        <w:tc>
+          <w:tcPr>
+            <w:tcW w:w="4519" w:type="dxa"/>
+            <w:vAlign w:val="center"/>
+          </w:tcPr>
+          <w:p>
+            <w:pPr>
+              <w:widowControl w:val="0"/>
+              <w:spacing w:line="240" w:lineRule="auto"/>
+              <w:jc w:val="left"/>
+              <w:rPr>
+                <w:rFonts w:hint="default" w:ascii="Times New Roman" w:hAnsi="Times New Roman" w:cs="Times New Roman"/>
+                <w:sz w:val="26"/>
+                <w:szCs w:val="26"/>
+                <w:vertAlign w:val="baseline"/>
+                <w:lang w:val="vi-VN"/>
+              </w:rPr>
+            </w:pPr>
+            <w:r>
+              <w:rPr>
+                <w:rFonts w:hint="default" w:ascii="Times New Roman" w:hAnsi="Times New Roman"/>
+                <w:sz w:val="26"/>
+                <w:szCs w:val="26"/>
+                <w:vertAlign w:val="baseline"/>
+                <w:lang w:val="vi-VN"/>
+              </w:rPr>
+              <w:t>Chi tiết tin tuyển dụng (Nhà tuyển dụng)</w:t>
+            </w:r>
+          </w:p>
+        </w:tc>
+      </w:tr>
+      <w:tr>
+        <w:tblPrEx>
+          <w:tblBorders>
+            <w:top w:val="single" w:color="auto" w:sz="4" w:space="0"/>
+            <w:left w:val="single" w:color="auto" w:sz="4" w:space="0"/>
+            <w:bottom w:val="single" w:color="auto" w:sz="4" w:space="0"/>
+            <w:right w:val="single" w:color="auto" w:sz="4" w:space="0"/>
+            <w:insideH w:val="single" w:color="auto" w:sz="4" w:space="0"/>
+            <w:insideV w:val="single" w:color="auto" w:sz="4" w:space="0"/>
+          </w:tblBorders>
+          <w:tblCellMar>
+            <w:top w:w="0" w:type="dxa"/>
+            <w:left w:w="108" w:type="dxa"/>
+            <w:bottom w:w="0" w:type="dxa"/>
+            <w:right w:w="108" w:type="dxa"/>
+          </w:tblCellMar>
+        </w:tblPrEx>
+        <w:trPr>
+          <w:trHeight w:val="448" w:hRule="atLeast"/>
+        </w:trPr>
+        <w:tc>
+          <w:tcPr>
+            <w:tcW w:w="4003" w:type="dxa"/>
+            <w:vMerge w:val="continue"/>
+            <w:vAlign w:val="center"/>
+          </w:tcPr>
+          <w:p>
+            <w:pPr>
+              <w:widowControl w:val="0"/>
+              <w:spacing w:line="240" w:lineRule="auto"/>
+              <w:jc w:val="left"/>
+              <w:rPr>
+                <w:rFonts w:hint="default" w:ascii="Times New Roman" w:hAnsi="Times New Roman" w:cs="Times New Roman"/>
+                <w:sz w:val="26"/>
+                <w:szCs w:val="26"/>
+                <w:vertAlign w:val="baseline"/>
+                <w:lang w:val="vi-VN"/>
+              </w:rPr>
+            </w:pPr>
+          </w:p>
+        </w:tc>
+        <w:tc>
+          <w:tcPr>
+            <w:tcW w:w="4519" w:type="dxa"/>
+            <w:vAlign w:val="center"/>
+          </w:tcPr>
+          <w:p>
+            <w:pPr>
+              <w:widowControl w:val="0"/>
+              <w:spacing w:line="240" w:lineRule="auto"/>
+              <w:jc w:val="left"/>
+              <w:rPr>
+                <w:rFonts w:hint="default" w:ascii="Times New Roman" w:hAnsi="Times New Roman" w:cs="Times New Roman"/>
+                <w:sz w:val="26"/>
+                <w:szCs w:val="26"/>
+                <w:vertAlign w:val="baseline"/>
+                <w:lang w:val="vi-VN"/>
+              </w:rPr>
+            </w:pPr>
+            <w:r>
+              <w:rPr>
+                <w:rFonts w:hint="default" w:ascii="Times New Roman" w:hAnsi="Times New Roman"/>
+                <w:sz w:val="26"/>
+                <w:szCs w:val="26"/>
+                <w:vertAlign w:val="baseline"/>
+                <w:lang w:val="vi-VN"/>
+              </w:rPr>
+              <w:t>Danh sách ứng viên (Nhà tuyển dụng)</w:t>
+            </w:r>
+          </w:p>
+        </w:tc>
+      </w:tr>
+      <w:tr>
+        <w:tblPrEx>
+          <w:tblBorders>
+            <w:top w:val="single" w:color="auto" w:sz="4" w:space="0"/>
+            <w:left w:val="single" w:color="auto" w:sz="4" w:space="0"/>
+            <w:bottom w:val="single" w:color="auto" w:sz="4" w:space="0"/>
+            <w:right w:val="single" w:color="auto" w:sz="4" w:space="0"/>
+            <w:insideH w:val="single" w:color="auto" w:sz="4" w:space="0"/>
+            <w:insideV w:val="single" w:color="auto" w:sz="4" w:space="0"/>
+          </w:tblBorders>
+          <w:tblCellMar>
+            <w:top w:w="0" w:type="dxa"/>
+            <w:left w:w="108" w:type="dxa"/>
+            <w:bottom w:w="0" w:type="dxa"/>
+            <w:right w:w="108" w:type="dxa"/>
+          </w:tblCellMar>
+        </w:tblPrEx>
+        <w:trPr>
+          <w:trHeight w:val="448" w:hRule="atLeast"/>
+        </w:trPr>
+        <w:tc>
+          <w:tcPr>
+            <w:tcW w:w="4003" w:type="dxa"/>
+            <w:vMerge w:val="continue"/>
+            <w:vAlign w:val="center"/>
+          </w:tcPr>
+          <w:p>
+            <w:pPr>
+              <w:widowControl w:val="0"/>
+              <w:spacing w:line="240" w:lineRule="auto"/>
+              <w:jc w:val="left"/>
+              <w:rPr>
+                <w:rFonts w:hint="default" w:ascii="Times New Roman" w:hAnsi="Times New Roman" w:cs="Times New Roman"/>
+                <w:sz w:val="26"/>
+                <w:szCs w:val="26"/>
+                <w:vertAlign w:val="baseline"/>
+                <w:lang w:val="vi-VN"/>
+              </w:rPr>
+            </w:pPr>
+          </w:p>
+        </w:tc>
+        <w:tc>
+          <w:tcPr>
+            <w:tcW w:w="4519" w:type="dxa"/>
+            <w:vAlign w:val="center"/>
+          </w:tcPr>
+          <w:p>
+            <w:pPr>
+              <w:widowControl w:val="0"/>
+              <w:spacing w:line="240" w:lineRule="auto"/>
+              <w:jc w:val="left"/>
+              <w:rPr>
+                <w:rFonts w:hint="default" w:ascii="Times New Roman" w:hAnsi="Times New Roman" w:cs="Times New Roman"/>
+                <w:sz w:val="26"/>
+                <w:szCs w:val="26"/>
+                <w:vertAlign w:val="baseline"/>
+                <w:lang w:val="vi-VN"/>
+              </w:rPr>
+            </w:pPr>
+            <w:r>
+              <w:rPr>
+                <w:rFonts w:hint="default" w:ascii="Times New Roman" w:hAnsi="Times New Roman"/>
+                <w:sz w:val="26"/>
+                <w:szCs w:val="26"/>
+                <w:vertAlign w:val="baseline"/>
+                <w:lang w:val="vi-VN"/>
+              </w:rPr>
+              <w:t>Quản lý phỏng vấn (Nhà tuyển dụng)</w:t>
+            </w:r>
+          </w:p>
+        </w:tc>
+      </w:tr>
+      <w:tr>
+        <w:tblPrEx>
+          <w:tblBorders>
+            <w:top w:val="single" w:color="auto" w:sz="4" w:space="0"/>
+            <w:left w:val="single" w:color="auto" w:sz="4" w:space="0"/>
+            <w:bottom w:val="single" w:color="auto" w:sz="4" w:space="0"/>
+            <w:right w:val="single" w:color="auto" w:sz="4" w:space="0"/>
+            <w:insideH w:val="single" w:color="auto" w:sz="4" w:space="0"/>
+            <w:insideV w:val="single" w:color="auto" w:sz="4" w:space="0"/>
+          </w:tblBorders>
+          <w:tblCellMar>
+            <w:top w:w="0" w:type="dxa"/>
+            <w:left w:w="108" w:type="dxa"/>
+            <w:bottom w:w="0" w:type="dxa"/>
+            <w:right w:w="108" w:type="dxa"/>
+          </w:tblCellMar>
+        </w:tblPrEx>
+        <w:trPr>
+          <w:trHeight w:val="448" w:hRule="atLeast"/>
+        </w:trPr>
+        <w:tc>
+          <w:tcPr>
+            <w:tcW w:w="4003" w:type="dxa"/>
+            <w:vMerge w:val="continue"/>
+            <w:vAlign w:val="center"/>
+          </w:tcPr>
+          <w:p>
+            <w:pPr>
+              <w:widowControl w:val="0"/>
+              <w:spacing w:line="240" w:lineRule="auto"/>
+              <w:jc w:val="left"/>
+              <w:rPr>
+                <w:rFonts w:hint="default" w:ascii="Times New Roman" w:hAnsi="Times New Roman" w:cs="Times New Roman"/>
+                <w:sz w:val="26"/>
+                <w:szCs w:val="26"/>
+                <w:vertAlign w:val="baseline"/>
+                <w:lang w:val="vi-VN"/>
+              </w:rPr>
+            </w:pPr>
+          </w:p>
+        </w:tc>
+        <w:tc>
+          <w:tcPr>
+            <w:tcW w:w="4519" w:type="dxa"/>
+            <w:vAlign w:val="center"/>
+          </w:tcPr>
+          <w:p>
+            <w:pPr>
+              <w:widowControl w:val="0"/>
+              <w:spacing w:line="240" w:lineRule="auto"/>
+              <w:jc w:val="left"/>
+              <w:rPr>
+                <w:rFonts w:hint="default" w:ascii="Times New Roman" w:hAnsi="Times New Roman" w:cs="Times New Roman"/>
+                <w:sz w:val="26"/>
+                <w:szCs w:val="26"/>
+                <w:vertAlign w:val="baseline"/>
+                <w:lang w:val="vi-VN"/>
+              </w:rPr>
+            </w:pPr>
+            <w:r>
+              <w:rPr>
+                <w:rFonts w:hint="default" w:ascii="Times New Roman" w:hAnsi="Times New Roman"/>
+                <w:sz w:val="26"/>
+                <w:szCs w:val="26"/>
+                <w:vertAlign w:val="baseline"/>
+                <w:lang w:val="vi-VN"/>
+              </w:rPr>
+              <w:t>Quản lý ngành nghề</w:t>
+            </w:r>
+          </w:p>
+        </w:tc>
+      </w:tr>
+      <w:tr>
+        <w:tblPrEx>
+          <w:tblBorders>
+            <w:top w:val="single" w:color="auto" w:sz="4" w:space="0"/>
+            <w:left w:val="single" w:color="auto" w:sz="4" w:space="0"/>
+            <w:bottom w:val="single" w:color="auto" w:sz="4" w:space="0"/>
+            <w:right w:val="single" w:color="auto" w:sz="4" w:space="0"/>
+            <w:insideH w:val="single" w:color="auto" w:sz="4" w:space="0"/>
+            <w:insideV w:val="single" w:color="auto" w:sz="4" w:space="0"/>
+          </w:tblBorders>
+          <w:tblCellMar>
+            <w:top w:w="0" w:type="dxa"/>
+            <w:left w:w="108" w:type="dxa"/>
+            <w:bottom w:w="0" w:type="dxa"/>
+            <w:right w:w="108" w:type="dxa"/>
+          </w:tblCellMar>
+        </w:tblPrEx>
+        <w:trPr>
+          <w:trHeight w:val="448" w:hRule="atLeast"/>
+        </w:trPr>
+        <w:tc>
+          <w:tcPr>
+            <w:tcW w:w="4003" w:type="dxa"/>
+            <w:vMerge w:val="restart"/>
+            <w:vAlign w:val="center"/>
+          </w:tcPr>
+          <w:p>
+            <w:pPr>
+              <w:widowControl w:val="0"/>
+              <w:spacing w:line="240" w:lineRule="auto"/>
+              <w:jc w:val="left"/>
+              <w:rPr>
+                <w:rFonts w:hint="default" w:ascii="Times New Roman" w:hAnsi="Times New Roman" w:cs="Times New Roman"/>
+                <w:sz w:val="26"/>
+                <w:szCs w:val="26"/>
+                <w:vertAlign w:val="baseline"/>
+                <w:lang w:val="vi-VN"/>
+              </w:rPr>
+            </w:pPr>
+            <w:r>
+              <w:rPr>
+                <w:rFonts w:hint="default" w:ascii="Times New Roman" w:hAnsi="Times New Roman" w:cs="Times New Roman"/>
+                <w:sz w:val="26"/>
+                <w:szCs w:val="26"/>
+                <w:vertAlign w:val="baseline"/>
+                <w:lang w:val="vi-VN"/>
+              </w:rPr>
+              <w:t>Đặng Phước Hoàng Long</w:t>
+            </w:r>
+          </w:p>
+        </w:tc>
+        <w:tc>
+          <w:tcPr>
+            <w:tcW w:w="4519" w:type="dxa"/>
+            <w:vAlign w:val="center"/>
+          </w:tcPr>
+          <w:p>
+            <w:pPr>
+              <w:widowControl w:val="0"/>
+              <w:spacing w:line="240" w:lineRule="auto"/>
+              <w:jc w:val="left"/>
+              <w:rPr>
+                <w:rFonts w:hint="default" w:ascii="Times New Roman" w:hAnsi="Times New Roman" w:cs="Times New Roman"/>
+                <w:sz w:val="26"/>
+                <w:szCs w:val="26"/>
+                <w:vertAlign w:val="baseline"/>
+                <w:lang w:val="vi-VN"/>
+              </w:rPr>
+            </w:pPr>
+            <w:r>
+              <w:rPr>
+                <w:rFonts w:hint="default" w:ascii="Times New Roman" w:hAnsi="Times New Roman"/>
+                <w:sz w:val="26"/>
+                <w:szCs w:val="26"/>
+                <w:vertAlign w:val="baseline"/>
+                <w:lang w:val="vi-VN"/>
+              </w:rPr>
+              <w:t>Dashboard nhà tuyển dụng</w:t>
+            </w:r>
+          </w:p>
+        </w:tc>
+      </w:tr>
+      <w:tr>
+        <w:tblPrEx>
+          <w:tblBorders>
+            <w:top w:val="single" w:color="auto" w:sz="4" w:space="0"/>
+            <w:left w:val="single" w:color="auto" w:sz="4" w:space="0"/>
+            <w:bottom w:val="single" w:color="auto" w:sz="4" w:space="0"/>
+            <w:right w:val="single" w:color="auto" w:sz="4" w:space="0"/>
+            <w:insideH w:val="single" w:color="auto" w:sz="4" w:space="0"/>
+            <w:insideV w:val="single" w:color="auto" w:sz="4" w:space="0"/>
+          </w:tblBorders>
+          <w:tblCellMar>
+            <w:top w:w="0" w:type="dxa"/>
+            <w:left w:w="108" w:type="dxa"/>
+            <w:bottom w:w="0" w:type="dxa"/>
+            <w:right w:w="108" w:type="dxa"/>
+          </w:tblCellMar>
+        </w:tblPrEx>
+        <w:trPr>
+          <w:trHeight w:val="448" w:hRule="atLeast"/>
+        </w:trPr>
+        <w:tc>
+          <w:tcPr>
+            <w:tcW w:w="4003" w:type="dxa"/>
+            <w:vMerge w:val="continue"/>
+            <w:vAlign w:val="center"/>
+          </w:tcPr>
+          <w:p>
+            <w:pPr>
+              <w:widowControl w:val="0"/>
+              <w:spacing w:line="240" w:lineRule="auto"/>
+              <w:jc w:val="left"/>
+              <w:rPr>
+                <w:rFonts w:hint="default" w:ascii="Times New Roman" w:hAnsi="Times New Roman" w:cs="Times New Roman"/>
+                <w:sz w:val="26"/>
+                <w:szCs w:val="26"/>
+                <w:vertAlign w:val="baseline"/>
+                <w:lang w:val="vi-VN"/>
+              </w:rPr>
+            </w:pPr>
+          </w:p>
+        </w:tc>
+        <w:tc>
+          <w:tcPr>
+            <w:tcW w:w="4519" w:type="dxa"/>
+            <w:vAlign w:val="center"/>
+          </w:tcPr>
+          <w:p>
+            <w:pPr>
+              <w:widowControl w:val="0"/>
+              <w:spacing w:line="240" w:lineRule="auto"/>
+              <w:jc w:val="left"/>
+              <w:rPr>
+                <w:rFonts w:hint="default" w:ascii="Times New Roman" w:hAnsi="Times New Roman" w:cs="Times New Roman"/>
+                <w:sz w:val="26"/>
+                <w:szCs w:val="26"/>
+                <w:vertAlign w:val="baseline"/>
+                <w:lang w:val="vi-VN"/>
+              </w:rPr>
+            </w:pPr>
+            <w:r>
+              <w:rPr>
+                <w:rFonts w:hint="default" w:ascii="Times New Roman" w:hAnsi="Times New Roman"/>
+                <w:sz w:val="26"/>
+                <w:szCs w:val="26"/>
+                <w:vertAlign w:val="baseline"/>
+                <w:lang w:val="vi-VN"/>
+              </w:rPr>
+              <w:t>Hồ sơ nhà tuyển dụng</w:t>
+            </w:r>
+          </w:p>
+        </w:tc>
+      </w:tr>
+      <w:tr>
+        <w:tblPrEx>
+          <w:tblBorders>
+            <w:top w:val="single" w:color="auto" w:sz="4" w:space="0"/>
+            <w:left w:val="single" w:color="auto" w:sz="4" w:space="0"/>
+            <w:bottom w:val="single" w:color="auto" w:sz="4" w:space="0"/>
+            <w:right w:val="single" w:color="auto" w:sz="4" w:space="0"/>
+            <w:insideH w:val="single" w:color="auto" w:sz="4" w:space="0"/>
+            <w:insideV w:val="single" w:color="auto" w:sz="4" w:space="0"/>
+          </w:tblBorders>
+          <w:tblCellMar>
+            <w:top w:w="0" w:type="dxa"/>
+            <w:left w:w="108" w:type="dxa"/>
+            <w:bottom w:w="0" w:type="dxa"/>
+            <w:right w:w="108" w:type="dxa"/>
+          </w:tblCellMar>
+        </w:tblPrEx>
+        <w:trPr>
+          <w:trHeight w:val="448" w:hRule="atLeast"/>
+        </w:trPr>
+        <w:tc>
+          <w:tcPr>
+            <w:tcW w:w="4003" w:type="dxa"/>
+            <w:vMerge w:val="continue"/>
+            <w:vAlign w:val="center"/>
+          </w:tcPr>
+          <w:p>
+            <w:pPr>
+              <w:widowControl w:val="0"/>
+              <w:spacing w:line="240" w:lineRule="auto"/>
+              <w:jc w:val="left"/>
+              <w:rPr>
+                <w:rFonts w:hint="default" w:ascii="Times New Roman" w:hAnsi="Times New Roman" w:cs="Times New Roman"/>
+                <w:sz w:val="26"/>
+                <w:szCs w:val="26"/>
+                <w:vertAlign w:val="baseline"/>
+                <w:lang w:val="vi-VN"/>
+              </w:rPr>
+            </w:pPr>
+          </w:p>
+        </w:tc>
+        <w:tc>
+          <w:tcPr>
+            <w:tcW w:w="4519" w:type="dxa"/>
+            <w:vAlign w:val="center"/>
+          </w:tcPr>
+          <w:p>
+            <w:pPr>
+              <w:widowControl w:val="0"/>
+              <w:spacing w:line="240" w:lineRule="auto"/>
+              <w:jc w:val="left"/>
+              <w:rPr>
+                <w:rFonts w:hint="default" w:ascii="Times New Roman" w:hAnsi="Times New Roman" w:cs="Times New Roman"/>
+                <w:sz w:val="26"/>
+                <w:szCs w:val="26"/>
+                <w:vertAlign w:val="baseline"/>
+                <w:lang w:val="vi-VN"/>
+              </w:rPr>
+            </w:pPr>
+            <w:r>
+              <w:rPr>
+                <w:rFonts w:hint="default" w:ascii="Times New Roman" w:hAnsi="Times New Roman"/>
+                <w:sz w:val="26"/>
+                <w:szCs w:val="26"/>
+                <w:vertAlign w:val="baseline"/>
+                <w:lang w:val="vi-VN"/>
+              </w:rPr>
+              <w:t>Quản lý tin tuyển dụng (Nhà tuyển dụng)</w:t>
+            </w:r>
+          </w:p>
+        </w:tc>
+      </w:tr>
+      <w:tr>
+        <w:tblPrEx>
+          <w:tblBorders>
+            <w:top w:val="single" w:color="auto" w:sz="4" w:space="0"/>
+            <w:left w:val="single" w:color="auto" w:sz="4" w:space="0"/>
+            <w:bottom w:val="single" w:color="auto" w:sz="4" w:space="0"/>
+            <w:right w:val="single" w:color="auto" w:sz="4" w:space="0"/>
+            <w:insideH w:val="single" w:color="auto" w:sz="4" w:space="0"/>
+            <w:insideV w:val="single" w:color="auto" w:sz="4" w:space="0"/>
+          </w:tblBorders>
+          <w:tblCellMar>
+            <w:top w:w="0" w:type="dxa"/>
+            <w:left w:w="108" w:type="dxa"/>
+            <w:bottom w:w="0" w:type="dxa"/>
+            <w:right w:w="108" w:type="dxa"/>
+          </w:tblCellMar>
+        </w:tblPrEx>
+        <w:trPr>
+          <w:trHeight w:val="448" w:hRule="atLeast"/>
+        </w:trPr>
+        <w:tc>
+          <w:tcPr>
+            <w:tcW w:w="4003" w:type="dxa"/>
+            <w:vMerge w:val="continue"/>
+            <w:vAlign w:val="center"/>
+          </w:tcPr>
+          <w:p>
+            <w:pPr>
+              <w:widowControl w:val="0"/>
+              <w:spacing w:line="240" w:lineRule="auto"/>
+              <w:jc w:val="left"/>
+              <w:rPr>
+                <w:rFonts w:hint="default" w:ascii="Times New Roman" w:hAnsi="Times New Roman" w:cs="Times New Roman"/>
+                <w:sz w:val="26"/>
+                <w:szCs w:val="26"/>
+                <w:vertAlign w:val="baseline"/>
+                <w:lang w:val="vi-VN"/>
+              </w:rPr>
+            </w:pPr>
+          </w:p>
+        </w:tc>
+        <w:tc>
+          <w:tcPr>
+            <w:tcW w:w="4519" w:type="dxa"/>
+            <w:vAlign w:val="center"/>
+          </w:tcPr>
+          <w:p>
+            <w:pPr>
+              <w:widowControl w:val="0"/>
+              <w:spacing w:line="240" w:lineRule="auto"/>
+              <w:jc w:val="left"/>
+              <w:rPr>
+                <w:rFonts w:hint="default" w:ascii="Times New Roman" w:hAnsi="Times New Roman"/>
+                <w:sz w:val="26"/>
+                <w:szCs w:val="26"/>
+                <w:vertAlign w:val="baseline"/>
+                <w:lang w:val="vi-VN"/>
+              </w:rPr>
+            </w:pPr>
+            <w:r>
+              <w:rPr>
+                <w:rFonts w:hint="default" w:ascii="Times New Roman" w:hAnsi="Times New Roman"/>
+                <w:sz w:val="26"/>
+                <w:szCs w:val="26"/>
+                <w:vertAlign w:val="baseline"/>
+                <w:lang w:val="vi-VN"/>
+              </w:rPr>
+              <w:t>Quản lý admin</w:t>
+            </w:r>
+          </w:p>
+        </w:tc>
+      </w:tr>
+      <w:tr>
+        <w:tblPrEx>
+          <w:tblBorders>
+            <w:top w:val="single" w:color="auto" w:sz="4" w:space="0"/>
+            <w:left w:val="single" w:color="auto" w:sz="4" w:space="0"/>
+            <w:bottom w:val="single" w:color="auto" w:sz="4" w:space="0"/>
+            <w:right w:val="single" w:color="auto" w:sz="4" w:space="0"/>
+            <w:insideH w:val="single" w:color="auto" w:sz="4" w:space="0"/>
+            <w:insideV w:val="single" w:color="auto" w:sz="4" w:space="0"/>
+          </w:tblBorders>
+          <w:tblCellMar>
+            <w:top w:w="0" w:type="dxa"/>
+            <w:left w:w="108" w:type="dxa"/>
+            <w:bottom w:w="0" w:type="dxa"/>
+            <w:right w:w="108" w:type="dxa"/>
+          </w:tblCellMar>
+        </w:tblPrEx>
+        <w:trPr>
+          <w:trHeight w:val="448" w:hRule="atLeast"/>
+        </w:trPr>
+        <w:tc>
+          <w:tcPr>
+            <w:tcW w:w="4003" w:type="dxa"/>
+            <w:vMerge w:val="continue"/>
+            <w:vAlign w:val="center"/>
+          </w:tcPr>
+          <w:p>
+            <w:pPr>
+              <w:widowControl w:val="0"/>
+              <w:spacing w:line="240" w:lineRule="auto"/>
+              <w:jc w:val="left"/>
+              <w:rPr>
+                <w:rFonts w:hint="default" w:ascii="Times New Roman" w:hAnsi="Times New Roman" w:cs="Times New Roman"/>
+                <w:sz w:val="26"/>
+                <w:szCs w:val="26"/>
+                <w:vertAlign w:val="baseline"/>
+                <w:lang w:val="vi-VN"/>
+              </w:rPr>
+            </w:pPr>
+          </w:p>
+        </w:tc>
+        <w:tc>
+          <w:tcPr>
+            <w:tcW w:w="4519" w:type="dxa"/>
+            <w:vAlign w:val="center"/>
+          </w:tcPr>
+          <w:p>
+            <w:pPr>
+              <w:widowControl w:val="0"/>
+              <w:spacing w:line="240" w:lineRule="auto"/>
+              <w:jc w:val="left"/>
+              <w:rPr>
+                <w:rFonts w:hint="default" w:ascii="Times New Roman" w:hAnsi="Times New Roman" w:cs="Times New Roman"/>
+                <w:sz w:val="26"/>
+                <w:szCs w:val="26"/>
+                <w:vertAlign w:val="baseline"/>
+                <w:lang w:val="vi-VN"/>
+              </w:rPr>
+            </w:pPr>
+            <w:r>
+              <w:rPr>
+                <w:rFonts w:hint="default" w:ascii="Times New Roman" w:hAnsi="Times New Roman"/>
+                <w:sz w:val="26"/>
+                <w:szCs w:val="26"/>
+                <w:vertAlign w:val="baseline"/>
+                <w:lang w:val="vi-VN"/>
+              </w:rPr>
+              <w:t>Quản lý tư vấn nghề nghiệp</w:t>
+            </w:r>
+          </w:p>
+        </w:tc>
+      </w:tr>
+      <w:tr>
+        <w:tblPrEx>
+          <w:tblBorders>
+            <w:top w:val="single" w:color="auto" w:sz="4" w:space="0"/>
+            <w:left w:val="single" w:color="auto" w:sz="4" w:space="0"/>
+            <w:bottom w:val="single" w:color="auto" w:sz="4" w:space="0"/>
+            <w:right w:val="single" w:color="auto" w:sz="4" w:space="0"/>
+            <w:insideH w:val="single" w:color="auto" w:sz="4" w:space="0"/>
+            <w:insideV w:val="single" w:color="auto" w:sz="4" w:space="0"/>
+          </w:tblBorders>
+          <w:tblCellMar>
+            <w:top w:w="0" w:type="dxa"/>
+            <w:left w:w="108" w:type="dxa"/>
+            <w:bottom w:w="0" w:type="dxa"/>
+            <w:right w:w="108" w:type="dxa"/>
+          </w:tblCellMar>
+        </w:tblPrEx>
+        <w:trPr>
+          <w:trHeight w:val="448" w:hRule="atLeast"/>
+        </w:trPr>
+        <w:tc>
+          <w:tcPr>
+            <w:tcW w:w="4003" w:type="dxa"/>
+            <w:vMerge w:val="continue"/>
+            <w:vAlign w:val="center"/>
+          </w:tcPr>
+          <w:p>
+            <w:pPr>
+              <w:widowControl w:val="0"/>
+              <w:spacing w:line="240" w:lineRule="auto"/>
+              <w:jc w:val="left"/>
+              <w:rPr>
+                <w:rFonts w:hint="default" w:ascii="Times New Roman" w:hAnsi="Times New Roman" w:cs="Times New Roman"/>
+                <w:sz w:val="26"/>
+                <w:szCs w:val="26"/>
+                <w:vertAlign w:val="baseline"/>
+                <w:lang w:val="vi-VN"/>
+              </w:rPr>
+            </w:pPr>
+          </w:p>
+        </w:tc>
+        <w:tc>
+          <w:tcPr>
+            <w:tcW w:w="4519" w:type="dxa"/>
+            <w:vAlign w:val="center"/>
+          </w:tcPr>
+          <w:p>
+            <w:pPr>
+              <w:widowControl w:val="0"/>
+              <w:spacing w:line="240" w:lineRule="auto"/>
+              <w:jc w:val="left"/>
+              <w:rPr>
+                <w:rFonts w:hint="default" w:ascii="Times New Roman" w:hAnsi="Times New Roman"/>
+                <w:sz w:val="26"/>
+                <w:szCs w:val="26"/>
+                <w:vertAlign w:val="baseline"/>
+                <w:lang w:val="vi-VN"/>
+              </w:rPr>
+            </w:pPr>
+            <w:r>
+              <w:rPr>
+                <w:rFonts w:hint="default" w:ascii="Times New Roman" w:hAnsi="Times New Roman"/>
+                <w:sz w:val="26"/>
+                <w:szCs w:val="26"/>
+                <w:vertAlign w:val="baseline"/>
+                <w:lang w:val="vi-VN"/>
+              </w:rPr>
+              <w:t>Quản lý thanh toán</w:t>
+            </w:r>
+          </w:p>
+        </w:tc>
+      </w:tr>
+      <w:tr>
+        <w:tblPrEx>
+          <w:tblBorders>
+            <w:top w:val="single" w:color="auto" w:sz="4" w:space="0"/>
+            <w:left w:val="single" w:color="auto" w:sz="4" w:space="0"/>
+            <w:bottom w:val="single" w:color="auto" w:sz="4" w:space="0"/>
+            <w:right w:val="single" w:color="auto" w:sz="4" w:space="0"/>
+            <w:insideH w:val="single" w:color="auto" w:sz="4" w:space="0"/>
+            <w:insideV w:val="single" w:color="auto" w:sz="4" w:space="0"/>
+          </w:tblBorders>
+          <w:tblCellMar>
+            <w:top w:w="0" w:type="dxa"/>
+            <w:left w:w="108" w:type="dxa"/>
+            <w:bottom w:w="0" w:type="dxa"/>
+            <w:right w:w="108" w:type="dxa"/>
+          </w:tblCellMar>
+        </w:tblPrEx>
+        <w:trPr>
+          <w:trHeight w:val="448" w:hRule="atLeast"/>
+        </w:trPr>
+        <w:tc>
+          <w:tcPr>
+            <w:tcW w:w="4003" w:type="dxa"/>
+            <w:vMerge w:val="continue"/>
+            <w:vAlign w:val="center"/>
+          </w:tcPr>
+          <w:p>
+            <w:pPr>
+              <w:widowControl w:val="0"/>
+              <w:spacing w:line="240" w:lineRule="auto"/>
+              <w:jc w:val="left"/>
+              <w:rPr>
+                <w:rFonts w:hint="default" w:ascii="Times New Roman" w:hAnsi="Times New Roman" w:cs="Times New Roman"/>
+                <w:sz w:val="26"/>
+                <w:szCs w:val="26"/>
+                <w:vertAlign w:val="baseline"/>
+                <w:lang w:val="vi-VN"/>
+              </w:rPr>
+            </w:pPr>
+          </w:p>
+        </w:tc>
+        <w:tc>
+          <w:tcPr>
+            <w:tcW w:w="4519" w:type="dxa"/>
+            <w:vAlign w:val="center"/>
+          </w:tcPr>
+          <w:p>
+            <w:pPr>
+              <w:widowControl w:val="0"/>
+              <w:spacing w:line="240" w:lineRule="auto"/>
+              <w:jc w:val="left"/>
+              <w:rPr>
+                <w:rFonts w:hint="default" w:ascii="Times New Roman" w:hAnsi="Times New Roman" w:cs="Times New Roman"/>
+                <w:sz w:val="26"/>
+                <w:szCs w:val="26"/>
+                <w:vertAlign w:val="baseline"/>
+                <w:lang w:val="vi-VN"/>
+              </w:rPr>
+            </w:pPr>
+            <w:r>
+              <w:rPr>
+                <w:rFonts w:hint="default" w:ascii="Times New Roman" w:hAnsi="Times New Roman"/>
+                <w:sz w:val="26"/>
+                <w:szCs w:val="26"/>
+                <w:vertAlign w:val="baseline"/>
+                <w:lang w:val="vi-VN"/>
+              </w:rPr>
+              <w:t>Quản lý tin tuyển dụng</w:t>
+            </w:r>
+          </w:p>
+        </w:tc>
+      </w:tr>
+      <w:tr>
+        <w:tblPrEx>
+          <w:tblBorders>
+            <w:top w:val="single" w:color="auto" w:sz="4" w:space="0"/>
+            <w:left w:val="single" w:color="auto" w:sz="4" w:space="0"/>
+            <w:bottom w:val="single" w:color="auto" w:sz="4" w:space="0"/>
+            <w:right w:val="single" w:color="auto" w:sz="4" w:space="0"/>
+            <w:insideH w:val="single" w:color="auto" w:sz="4" w:space="0"/>
+            <w:insideV w:val="single" w:color="auto" w:sz="4" w:space="0"/>
+          </w:tblBorders>
+          <w:tblCellMar>
+            <w:top w:w="0" w:type="dxa"/>
+            <w:left w:w="108" w:type="dxa"/>
+            <w:bottom w:w="0" w:type="dxa"/>
+            <w:right w:w="108" w:type="dxa"/>
+          </w:tblCellMar>
+        </w:tblPrEx>
+        <w:trPr>
+          <w:trHeight w:val="448" w:hRule="atLeast"/>
+        </w:trPr>
+        <w:tc>
+          <w:tcPr>
+            <w:tcW w:w="4003" w:type="dxa"/>
+            <w:vMerge w:val="restart"/>
+            <w:vAlign w:val="center"/>
+          </w:tcPr>
+          <w:p>
+            <w:pPr>
+              <w:widowControl w:val="0"/>
+              <w:spacing w:line="240" w:lineRule="auto"/>
+              <w:jc w:val="left"/>
+              <w:rPr>
+                <w:rFonts w:hint="default" w:ascii="Times New Roman" w:hAnsi="Times New Roman" w:cs="Times New Roman"/>
+                <w:sz w:val="26"/>
+                <w:szCs w:val="26"/>
+                <w:vertAlign w:val="baseline"/>
+                <w:lang w:val="vi-VN"/>
+              </w:rPr>
+            </w:pPr>
+            <w:r>
+              <w:rPr>
+                <w:rFonts w:hint="default" w:ascii="Times New Roman" w:hAnsi="Times New Roman" w:cs="Times New Roman"/>
+                <w:sz w:val="26"/>
+                <w:szCs w:val="26"/>
+                <w:vertAlign w:val="baseline"/>
+                <w:lang w:val="vi-VN"/>
+              </w:rPr>
+              <w:t>Doãn Khánh Mai</w:t>
+            </w:r>
+          </w:p>
+        </w:tc>
+        <w:tc>
+          <w:tcPr>
+            <w:tcW w:w="4519" w:type="dxa"/>
+            <w:vAlign w:val="center"/>
+          </w:tcPr>
+          <w:p>
+            <w:pPr>
+              <w:keepNext w:val="0"/>
+              <w:keepLines w:val="0"/>
+              <w:widowControl/>
+              <w:suppressLineNumbers w:val="0"/>
+              <w:jc w:val="left"/>
+              <w:textAlignment w:val="center"/>
+              <w:rPr>
+                <w:rFonts w:hint="default" w:ascii="Times New Roman" w:hAnsi="Times New Roman" w:cs="Times New Roman"/>
+                <w:sz w:val="26"/>
+                <w:szCs w:val="26"/>
+                <w:vertAlign w:val="baseline"/>
+                <w:lang w:val="vi-VN"/>
+              </w:rPr>
+            </w:pPr>
+            <w:r>
+              <w:rPr>
+                <w:rFonts w:hint="default" w:ascii="Times New Roman" w:hAnsi="Times New Roman" w:eastAsia="SimSun" w:cs="Times New Roman"/>
+                <w:i w:val="0"/>
+                <w:iCs w:val="0"/>
+                <w:color w:val="000000"/>
+                <w:kern w:val="0"/>
+                <w:sz w:val="26"/>
+                <w:szCs w:val="26"/>
+                <w:u w:val="none"/>
+                <w:lang w:val="en-US" w:eastAsia="zh-CN" w:bidi="ar"/>
+              </w:rPr>
+              <w:t>Ví và Billing (Nhà tuyển dụng)</w:t>
+            </w:r>
+          </w:p>
+        </w:tc>
+      </w:tr>
+      <w:tr>
+        <w:tblPrEx>
+          <w:tblBorders>
+            <w:top w:val="single" w:color="auto" w:sz="4" w:space="0"/>
+            <w:left w:val="single" w:color="auto" w:sz="4" w:space="0"/>
+            <w:bottom w:val="single" w:color="auto" w:sz="4" w:space="0"/>
+            <w:right w:val="single" w:color="auto" w:sz="4" w:space="0"/>
+            <w:insideH w:val="single" w:color="auto" w:sz="4" w:space="0"/>
+            <w:insideV w:val="single" w:color="auto" w:sz="4" w:space="0"/>
+          </w:tblBorders>
+          <w:tblCellMar>
+            <w:top w:w="0" w:type="dxa"/>
+            <w:left w:w="108" w:type="dxa"/>
+            <w:bottom w:w="0" w:type="dxa"/>
+            <w:right w:w="108" w:type="dxa"/>
+          </w:tblCellMar>
+        </w:tblPrEx>
+        <w:trPr>
+          <w:trHeight w:val="448" w:hRule="atLeast"/>
+        </w:trPr>
+        <w:tc>
+          <w:tcPr>
+            <w:tcW w:w="4003" w:type="dxa"/>
+            <w:vMerge w:val="continue"/>
+            <w:vAlign w:val="center"/>
+          </w:tcPr>
+          <w:p>
+            <w:pPr>
+              <w:widowControl w:val="0"/>
+              <w:spacing w:line="240" w:lineRule="auto"/>
+              <w:jc w:val="left"/>
+              <w:rPr>
+                <w:rFonts w:hint="default" w:ascii="Times New Roman" w:hAnsi="Times New Roman" w:cs="Times New Roman"/>
+                <w:sz w:val="26"/>
+                <w:szCs w:val="26"/>
+                <w:vertAlign w:val="baseline"/>
+                <w:lang w:val="vi-VN"/>
+              </w:rPr>
+            </w:pPr>
+          </w:p>
+        </w:tc>
+        <w:tc>
+          <w:tcPr>
+            <w:tcW w:w="4519" w:type="dxa"/>
+            <w:vAlign w:val="center"/>
+          </w:tcPr>
+          <w:p>
+            <w:pPr>
+              <w:keepNext w:val="0"/>
+              <w:keepLines w:val="0"/>
+              <w:widowControl/>
+              <w:suppressLineNumbers w:val="0"/>
+              <w:jc w:val="left"/>
+              <w:textAlignment w:val="center"/>
+              <w:rPr>
+                <w:rFonts w:hint="default" w:ascii="Times New Roman" w:hAnsi="Times New Roman"/>
+                <w:sz w:val="26"/>
+                <w:szCs w:val="26"/>
+                <w:vertAlign w:val="baseline"/>
+                <w:lang w:val="vi-VN"/>
+              </w:rPr>
+            </w:pPr>
+            <w:r>
+              <w:rPr>
+                <w:rFonts w:hint="default" w:ascii="Times New Roman" w:hAnsi="Times New Roman" w:eastAsia="SimSun" w:cs="Times New Roman"/>
+                <w:i w:val="0"/>
+                <w:iCs w:val="0"/>
+                <w:color w:val="000000"/>
+                <w:kern w:val="0"/>
+                <w:sz w:val="26"/>
+                <w:szCs w:val="26"/>
+                <w:u w:val="none"/>
+                <w:lang w:val="en-US" w:eastAsia="zh-CN" w:bidi="ar"/>
+              </w:rPr>
+              <w:t>Quản lý nhân sự HR (Nhà tuyển dụng)</w:t>
+            </w:r>
+          </w:p>
+        </w:tc>
+      </w:tr>
+      <w:tr>
+        <w:tblPrEx>
+          <w:tblBorders>
+            <w:top w:val="single" w:color="auto" w:sz="4" w:space="0"/>
+            <w:left w:val="single" w:color="auto" w:sz="4" w:space="0"/>
+            <w:bottom w:val="single" w:color="auto" w:sz="4" w:space="0"/>
+            <w:right w:val="single" w:color="auto" w:sz="4" w:space="0"/>
+            <w:insideH w:val="single" w:color="auto" w:sz="4" w:space="0"/>
+            <w:insideV w:val="single" w:color="auto" w:sz="4" w:space="0"/>
+          </w:tblBorders>
+          <w:tblCellMar>
+            <w:top w:w="0" w:type="dxa"/>
+            <w:left w:w="108" w:type="dxa"/>
+            <w:bottom w:w="0" w:type="dxa"/>
+            <w:right w:w="108" w:type="dxa"/>
+          </w:tblCellMar>
+        </w:tblPrEx>
+        <w:trPr>
+          <w:trHeight w:val="448" w:hRule="atLeast"/>
+        </w:trPr>
+        <w:tc>
+          <w:tcPr>
+            <w:tcW w:w="4003" w:type="dxa"/>
+            <w:vMerge w:val="continue"/>
+            <w:vAlign w:val="center"/>
+          </w:tcPr>
+          <w:p>
+            <w:pPr>
+              <w:widowControl w:val="0"/>
+              <w:spacing w:line="240" w:lineRule="auto"/>
+              <w:jc w:val="left"/>
+              <w:rPr>
+                <w:rFonts w:hint="default" w:ascii="Times New Roman" w:hAnsi="Times New Roman" w:cs="Times New Roman"/>
+                <w:sz w:val="26"/>
+                <w:szCs w:val="26"/>
+                <w:vertAlign w:val="baseline"/>
+                <w:lang w:val="vi-VN"/>
+              </w:rPr>
+            </w:pPr>
+          </w:p>
+        </w:tc>
+        <w:tc>
+          <w:tcPr>
+            <w:tcW w:w="4519" w:type="dxa"/>
+            <w:vAlign w:val="center"/>
+          </w:tcPr>
+          <w:p>
+            <w:pPr>
+              <w:widowControl w:val="0"/>
+              <w:spacing w:line="240" w:lineRule="auto"/>
+              <w:jc w:val="left"/>
+              <w:rPr>
+                <w:rFonts w:hint="default" w:ascii="Times New Roman" w:hAnsi="Times New Roman"/>
+                <w:sz w:val="26"/>
+                <w:szCs w:val="26"/>
+                <w:vertAlign w:val="baseline"/>
+                <w:lang w:val="vi-VN"/>
+              </w:rPr>
+            </w:pPr>
+            <w:r>
+              <w:rPr>
+                <w:rFonts w:hint="default" w:ascii="Times New Roman" w:hAnsi="Times New Roman"/>
+                <w:sz w:val="26"/>
+                <w:szCs w:val="26"/>
+                <w:vertAlign w:val="baseline"/>
+                <w:lang w:val="vi-VN"/>
+              </w:rPr>
+              <w:t>Quản lý kết quả matching</w:t>
+            </w:r>
+          </w:p>
+        </w:tc>
+      </w:tr>
+      <w:tr>
+        <w:tblPrEx>
+          <w:tblBorders>
+            <w:top w:val="single" w:color="auto" w:sz="4" w:space="0"/>
+            <w:left w:val="single" w:color="auto" w:sz="4" w:space="0"/>
+            <w:bottom w:val="single" w:color="auto" w:sz="4" w:space="0"/>
+            <w:right w:val="single" w:color="auto" w:sz="4" w:space="0"/>
+            <w:insideH w:val="single" w:color="auto" w:sz="4" w:space="0"/>
+            <w:insideV w:val="single" w:color="auto" w:sz="4" w:space="0"/>
+          </w:tblBorders>
+          <w:tblCellMar>
+            <w:top w:w="0" w:type="dxa"/>
+            <w:left w:w="108" w:type="dxa"/>
+            <w:bottom w:w="0" w:type="dxa"/>
+            <w:right w:w="108" w:type="dxa"/>
+          </w:tblCellMar>
+        </w:tblPrEx>
+        <w:trPr>
+          <w:trHeight w:val="448" w:hRule="atLeast"/>
+        </w:trPr>
+        <w:tc>
+          <w:tcPr>
+            <w:tcW w:w="4003" w:type="dxa"/>
+            <w:vMerge w:val="continue"/>
+            <w:vAlign w:val="center"/>
+          </w:tcPr>
+          <w:p>
+            <w:pPr>
+              <w:widowControl w:val="0"/>
+              <w:spacing w:line="240" w:lineRule="auto"/>
+              <w:jc w:val="left"/>
+              <w:rPr>
+                <w:rFonts w:hint="default" w:ascii="Times New Roman" w:hAnsi="Times New Roman" w:cs="Times New Roman"/>
+                <w:sz w:val="26"/>
+                <w:szCs w:val="26"/>
+                <w:vertAlign w:val="baseline"/>
+                <w:lang w:val="vi-VN"/>
+              </w:rPr>
+            </w:pPr>
+          </w:p>
+        </w:tc>
+        <w:tc>
+          <w:tcPr>
+            <w:tcW w:w="4519" w:type="dxa"/>
+            <w:vAlign w:val="center"/>
+          </w:tcPr>
+          <w:p>
+            <w:pPr>
+              <w:widowControl w:val="0"/>
+              <w:spacing w:line="240" w:lineRule="auto"/>
+              <w:jc w:val="left"/>
+              <w:rPr>
+                <w:rFonts w:hint="default" w:ascii="Times New Roman" w:hAnsi="Times New Roman" w:cs="Times New Roman"/>
+                <w:sz w:val="26"/>
+                <w:szCs w:val="26"/>
+                <w:vertAlign w:val="baseline"/>
+                <w:lang w:val="vi-VN"/>
+              </w:rPr>
+            </w:pPr>
+            <w:r>
+              <w:rPr>
+                <w:rFonts w:hint="default" w:ascii="Times New Roman" w:hAnsi="Times New Roman"/>
+                <w:sz w:val="26"/>
+                <w:szCs w:val="26"/>
+                <w:vertAlign w:val="baseline"/>
+                <w:lang w:val="vi-VN"/>
+              </w:rPr>
+              <w:t>Quản lý sử dụng AI</w:t>
+            </w:r>
+          </w:p>
+        </w:tc>
+      </w:tr>
+      <w:tr>
+        <w:tblPrEx>
+          <w:tblBorders>
+            <w:top w:val="single" w:color="auto" w:sz="4" w:space="0"/>
+            <w:left w:val="single" w:color="auto" w:sz="4" w:space="0"/>
+            <w:bottom w:val="single" w:color="auto" w:sz="4" w:space="0"/>
+            <w:right w:val="single" w:color="auto" w:sz="4" w:space="0"/>
+            <w:insideH w:val="single" w:color="auto" w:sz="4" w:space="0"/>
+            <w:insideV w:val="single" w:color="auto" w:sz="4" w:space="0"/>
+          </w:tblBorders>
+          <w:tblCellMar>
+            <w:top w:w="0" w:type="dxa"/>
+            <w:left w:w="108" w:type="dxa"/>
+            <w:bottom w:w="0" w:type="dxa"/>
+            <w:right w:w="108" w:type="dxa"/>
+          </w:tblCellMar>
+        </w:tblPrEx>
+        <w:trPr>
+          <w:trHeight w:val="448" w:hRule="atLeast"/>
+        </w:trPr>
+        <w:tc>
+          <w:tcPr>
+            <w:tcW w:w="4003" w:type="dxa"/>
+            <w:vMerge w:val="continue"/>
+            <w:vAlign w:val="center"/>
+          </w:tcPr>
+          <w:p>
+            <w:pPr>
+              <w:widowControl w:val="0"/>
+              <w:spacing w:line="240" w:lineRule="auto"/>
+              <w:jc w:val="left"/>
+              <w:rPr>
+                <w:rFonts w:hint="default" w:ascii="Times New Roman" w:hAnsi="Times New Roman" w:cs="Times New Roman"/>
+                <w:sz w:val="26"/>
+                <w:szCs w:val="26"/>
+                <w:vertAlign w:val="baseline"/>
+                <w:lang w:val="vi-VN"/>
+              </w:rPr>
+            </w:pPr>
+          </w:p>
+        </w:tc>
+        <w:tc>
+          <w:tcPr>
+            <w:tcW w:w="4519" w:type="dxa"/>
+            <w:vAlign w:val="center"/>
+          </w:tcPr>
+          <w:p>
+            <w:pPr>
+              <w:widowControl w:val="0"/>
+              <w:spacing w:line="240" w:lineRule="auto"/>
+              <w:jc w:val="left"/>
+              <w:rPr>
+                <w:rFonts w:hint="default" w:ascii="Times New Roman" w:hAnsi="Times New Roman" w:cs="Times New Roman"/>
+                <w:sz w:val="26"/>
+                <w:szCs w:val="26"/>
+                <w:vertAlign w:val="baseline"/>
+                <w:lang w:val="vi-VN"/>
+              </w:rPr>
+            </w:pPr>
+            <w:r>
+              <w:rPr>
+                <w:rFonts w:hint="default" w:ascii="Times New Roman" w:hAnsi="Times New Roman" w:cs="Times New Roman"/>
+                <w:sz w:val="26"/>
+                <w:szCs w:val="26"/>
+                <w:vertAlign w:val="baseline"/>
+                <w:lang w:val="vi-VN"/>
+              </w:rPr>
+              <w:t>Quản lý template cv</w:t>
+            </w:r>
+          </w:p>
+        </w:tc>
+      </w:tr>
+      <w:tr>
+        <w:tblPrEx>
+          <w:tblBorders>
+            <w:top w:val="single" w:color="auto" w:sz="4" w:space="0"/>
+            <w:left w:val="single" w:color="auto" w:sz="4" w:space="0"/>
+            <w:bottom w:val="single" w:color="auto" w:sz="4" w:space="0"/>
+            <w:right w:val="single" w:color="auto" w:sz="4" w:space="0"/>
+            <w:insideH w:val="single" w:color="auto" w:sz="4" w:space="0"/>
+            <w:insideV w:val="single" w:color="auto" w:sz="4" w:space="0"/>
+          </w:tblBorders>
+          <w:tblCellMar>
+            <w:top w:w="0" w:type="dxa"/>
+            <w:left w:w="108" w:type="dxa"/>
+            <w:bottom w:w="0" w:type="dxa"/>
+            <w:right w:w="108" w:type="dxa"/>
+          </w:tblCellMar>
+        </w:tblPrEx>
+        <w:trPr>
+          <w:trHeight w:val="448" w:hRule="atLeast"/>
+        </w:trPr>
+        <w:tc>
+          <w:tcPr>
+            <w:tcW w:w="4003" w:type="dxa"/>
+            <w:vMerge w:val="restart"/>
+            <w:vAlign w:val="center"/>
+          </w:tcPr>
+          <w:p>
+            <w:pPr>
+              <w:widowControl w:val="0"/>
+              <w:spacing w:line="240" w:lineRule="auto"/>
+              <w:jc w:val="left"/>
+              <w:rPr>
+                <w:rFonts w:hint="default" w:ascii="Times New Roman" w:hAnsi="Times New Roman" w:cs="Times New Roman"/>
+                <w:sz w:val="26"/>
+                <w:szCs w:val="26"/>
+                <w:vertAlign w:val="baseline"/>
+                <w:lang w:val="vi-VN"/>
+              </w:rPr>
+            </w:pPr>
+            <w:r>
+              <w:rPr>
+                <w:rFonts w:hint="default" w:ascii="Times New Roman" w:hAnsi="Times New Roman" w:cs="Times New Roman"/>
+                <w:sz w:val="26"/>
+                <w:szCs w:val="26"/>
+                <w:vertAlign w:val="baseline"/>
+                <w:lang w:val="vi-VN"/>
+              </w:rPr>
+              <w:t>Nguyễn Đức Trí</w:t>
+            </w:r>
+          </w:p>
+        </w:tc>
+        <w:tc>
+          <w:tcPr>
+            <w:tcW w:w="4519" w:type="dxa"/>
+            <w:vAlign w:val="center"/>
+          </w:tcPr>
+          <w:p>
+            <w:pPr>
+              <w:widowControl w:val="0"/>
+              <w:spacing w:line="240" w:lineRule="auto"/>
+              <w:jc w:val="left"/>
+              <w:rPr>
+                <w:rFonts w:hint="default" w:ascii="Times New Roman" w:hAnsi="Times New Roman" w:cs="Times New Roman"/>
+                <w:sz w:val="26"/>
+                <w:szCs w:val="26"/>
+                <w:vertAlign w:val="baseline"/>
+                <w:lang w:val="vi-VN"/>
+              </w:rPr>
+            </w:pPr>
+            <w:r>
+              <w:rPr>
+                <w:rFonts w:hint="default" w:ascii="Times New Roman" w:hAnsi="Times New Roman" w:cs="Times New Roman"/>
+                <w:sz w:val="26"/>
+                <w:szCs w:val="26"/>
+                <w:vertAlign w:val="baseline"/>
+                <w:lang w:val="vi-VN"/>
+              </w:rPr>
+              <w:t>Nhật ký công ty</w:t>
+            </w:r>
+          </w:p>
+        </w:tc>
+      </w:tr>
+      <w:tr>
+        <w:tblPrEx>
+          <w:tblBorders>
+            <w:top w:val="single" w:color="auto" w:sz="4" w:space="0"/>
+            <w:left w:val="single" w:color="auto" w:sz="4" w:space="0"/>
+            <w:bottom w:val="single" w:color="auto" w:sz="4" w:space="0"/>
+            <w:right w:val="single" w:color="auto" w:sz="4" w:space="0"/>
+            <w:insideH w:val="single" w:color="auto" w:sz="4" w:space="0"/>
+            <w:insideV w:val="single" w:color="auto" w:sz="4" w:space="0"/>
+          </w:tblBorders>
+          <w:tblCellMar>
+            <w:top w:w="0" w:type="dxa"/>
+            <w:left w:w="108" w:type="dxa"/>
+            <w:bottom w:w="0" w:type="dxa"/>
             <w:right w:w="108" w:type="dxa"/>
           </w:tblCellMar>
         </w:tblPrEx>
@@ -2791,6 +5146,7 @@
           </w:tcPr>
           <w:p>
             <w:pPr>
+              <w:widowControl w:val="0"/>
               <w:spacing w:line="240" w:lineRule="auto"/>
               <w:jc w:val="left"/>
               <w:rPr>
@@ -2810,41 +5166,44 @@
           </w:tcPr>
           <w:p>
             <w:pPr>
-              <w:spacing w:line="240" w:lineRule="auto"/>
-              <w:jc w:val="left"/>
-              <w:rPr>
-                <w:rFonts w:hint="default" w:ascii="Times New Roman" w:hAnsi="Times New Roman" w:cs="Times New Roman"/>
-                <w:sz w:val="26"/>
-                <w:szCs w:val="26"/>
-                <w:vertAlign w:val="baseline"/>
-                <w:lang w:val="vi-VN"/>
-              </w:rPr>
-            </w:pPr>
-            <w:r>
-              <w:rPr>
-                <w:rFonts w:hint="default" w:ascii="Times New Roman" w:hAnsi="Times New Roman"/>
-                <w:sz w:val="26"/>
-                <w:szCs w:val="26"/>
-                <w:vertAlign w:val="baseline"/>
-                <w:lang w:val="vi-VN"/>
-              </w:rPr>
-              <w:t>Dashboard admin</w:t>
-            </w:r>
-          </w:p>
-        </w:tc>
-      </w:tr>
-      <w:tr>
-        <w:tblPrEx>
-          <w:tblBorders>
-            <w:top w:val="single" w:color="auto" w:sz="4" w:space="0"/>
-            <w:left w:val="single" w:color="auto" w:sz="4" w:space="0"/>
-            <w:bottom w:val="single" w:color="auto" w:sz="4" w:space="0"/>
-            <w:right w:val="single" w:color="auto" w:sz="4" w:space="0"/>
-            <w:insideH w:val="single" w:color="auto" w:sz="4" w:space="0"/>
-            <w:insideV w:val="single" w:color="auto" w:sz="4" w:space="0"/>
-          </w:tblBorders>
-          <w:tblCellMar>
-            <w:left w:w="108" w:type="dxa"/>
+              <w:widowControl w:val="0"/>
+              <w:spacing w:line="240" w:lineRule="auto"/>
+              <w:jc w:val="left"/>
+              <w:rPr>
+                <w:rFonts w:hint="default" w:ascii="Times New Roman" w:hAnsi="Times New Roman"/>
+                <w:sz w:val="26"/>
+                <w:szCs w:val="26"/>
+                <w:vertAlign w:val="baseline"/>
+                <w:lang w:val="vi-VN"/>
+              </w:rPr>
+            </w:pPr>
+            <w:r>
+              <w:rPr>
+                <w:rFonts w:hint="default" w:ascii="Times New Roman" w:hAnsi="Times New Roman"/>
+                <w:sz w:val="26"/>
+                <w:szCs w:val="26"/>
+                <w:vertAlign w:val="baseline"/>
+                <w:lang w:val="vi-VN"/>
+              </w:rPr>
+              <w:t>Quản lý người dùng</w:t>
+            </w:r>
+          </w:p>
+        </w:tc>
+      </w:tr>
+      <w:tr>
+        <w:tblPrEx>
+          <w:tblBorders>
+            <w:top w:val="single" w:color="auto" w:sz="4" w:space="0"/>
+            <w:left w:val="single" w:color="auto" w:sz="4" w:space="0"/>
+            <w:bottom w:val="single" w:color="auto" w:sz="4" w:space="0"/>
+            <w:right w:val="single" w:color="auto" w:sz="4" w:space="0"/>
+            <w:insideH w:val="single" w:color="auto" w:sz="4" w:space="0"/>
+            <w:insideV w:val="single" w:color="auto" w:sz="4" w:space="0"/>
+          </w:tblBorders>
+          <w:tblCellMar>
+            <w:top w:w="0" w:type="dxa"/>
+            <w:left w:w="108" w:type="dxa"/>
+            <w:bottom w:w="0" w:type="dxa"/>
             <w:right w:w="108" w:type="dxa"/>
           </w:tblCellMar>
         </w:tblPrEx>
@@ -2860,6 +5219,7 @@
           </w:tcPr>
           <w:p>
             <w:pPr>
+              <w:widowControl w:val="0"/>
               <w:spacing w:line="240" w:lineRule="auto"/>
               <w:jc w:val="left"/>
               <w:rPr>
@@ -2879,41 +5239,44 @@
           </w:tcPr>
           <w:p>
             <w:pPr>
-              <w:spacing w:line="240" w:lineRule="auto"/>
-              <w:jc w:val="left"/>
-              <w:rPr>
-                <w:rFonts w:hint="default" w:ascii="Times New Roman" w:hAnsi="Times New Roman" w:cs="Times New Roman"/>
-                <w:sz w:val="26"/>
-                <w:szCs w:val="26"/>
-                <w:vertAlign w:val="baseline"/>
-                <w:lang w:val="vi-VN"/>
-              </w:rPr>
-            </w:pPr>
-            <w:r>
-              <w:rPr>
-                <w:rFonts w:hint="default" w:ascii="Times New Roman" w:hAnsi="Times New Roman"/>
-                <w:sz w:val="26"/>
-                <w:szCs w:val="26"/>
-                <w:vertAlign w:val="baseline"/>
-                <w:lang w:val="vi-VN"/>
-              </w:rPr>
-              <w:t>Hồ sơ admin</w:t>
-            </w:r>
-          </w:p>
-        </w:tc>
-      </w:tr>
-      <w:tr>
-        <w:tblPrEx>
-          <w:tblBorders>
-            <w:top w:val="single" w:color="auto" w:sz="4" w:space="0"/>
-            <w:left w:val="single" w:color="auto" w:sz="4" w:space="0"/>
-            <w:bottom w:val="single" w:color="auto" w:sz="4" w:space="0"/>
-            <w:right w:val="single" w:color="auto" w:sz="4" w:space="0"/>
-            <w:insideH w:val="single" w:color="auto" w:sz="4" w:space="0"/>
-            <w:insideV w:val="single" w:color="auto" w:sz="4" w:space="0"/>
-          </w:tblBorders>
-          <w:tblCellMar>
-            <w:left w:w="108" w:type="dxa"/>
+              <w:widowControl w:val="0"/>
+              <w:spacing w:line="240" w:lineRule="auto"/>
+              <w:jc w:val="left"/>
+              <w:rPr>
+                <w:rFonts w:hint="default" w:ascii="Times New Roman" w:hAnsi="Times New Roman" w:cs="Times New Roman"/>
+                <w:sz w:val="26"/>
+                <w:szCs w:val="26"/>
+                <w:vertAlign w:val="baseline"/>
+                <w:lang w:val="vi-VN"/>
+              </w:rPr>
+            </w:pPr>
+            <w:r>
+              <w:rPr>
+                <w:rFonts w:hint="default" w:ascii="Times New Roman" w:hAnsi="Times New Roman"/>
+                <w:sz w:val="26"/>
+                <w:szCs w:val="26"/>
+                <w:vertAlign w:val="baseline"/>
+                <w:lang w:val="vi-VN"/>
+              </w:rPr>
+              <w:t>Quản lý công ty</w:t>
+            </w:r>
+          </w:p>
+        </w:tc>
+      </w:tr>
+      <w:tr>
+        <w:tblPrEx>
+          <w:tblBorders>
+            <w:top w:val="single" w:color="auto" w:sz="4" w:space="0"/>
+            <w:left w:val="single" w:color="auto" w:sz="4" w:space="0"/>
+            <w:bottom w:val="single" w:color="auto" w:sz="4" w:space="0"/>
+            <w:right w:val="single" w:color="auto" w:sz="4" w:space="0"/>
+            <w:insideH w:val="single" w:color="auto" w:sz="4" w:space="0"/>
+            <w:insideV w:val="single" w:color="auto" w:sz="4" w:space="0"/>
+          </w:tblBorders>
+          <w:tblCellMar>
+            <w:top w:w="0" w:type="dxa"/>
+            <w:left w:w="108" w:type="dxa"/>
+            <w:bottom w:w="0" w:type="dxa"/>
             <w:right w:w="108" w:type="dxa"/>
           </w:tblCellMar>
         </w:tblPrEx>
@@ -2929,6 +5292,7 @@
           </w:tcPr>
           <w:p>
             <w:pPr>
+              <w:widowControl w:val="0"/>
               <w:spacing w:line="240" w:lineRule="auto"/>
               <w:jc w:val="left"/>
               <w:rPr>
@@ -2948,41 +5312,44 @@
           </w:tcPr>
           <w:p>
             <w:pPr>
-              <w:spacing w:line="240" w:lineRule="auto"/>
-              <w:jc w:val="left"/>
-              <w:rPr>
-                <w:rFonts w:hint="default" w:ascii="Times New Roman" w:hAnsi="Times New Roman" w:cs="Times New Roman"/>
-                <w:sz w:val="26"/>
-                <w:szCs w:val="26"/>
-                <w:vertAlign w:val="baseline"/>
-                <w:lang w:val="vi-VN"/>
-              </w:rPr>
-            </w:pPr>
-            <w:r>
-              <w:rPr>
-                <w:rFonts w:hint="default" w:ascii="Times New Roman" w:hAnsi="Times New Roman"/>
-                <w:sz w:val="26"/>
-                <w:szCs w:val="26"/>
-                <w:vertAlign w:val="baseline"/>
-                <w:lang w:val="vi-VN"/>
-              </w:rPr>
-              <w:t>Quản lý đơn ứng tuyển</w:t>
-            </w:r>
-          </w:p>
-        </w:tc>
-      </w:tr>
-      <w:tr>
-        <w:tblPrEx>
-          <w:tblBorders>
-            <w:top w:val="single" w:color="auto" w:sz="4" w:space="0"/>
-            <w:left w:val="single" w:color="auto" w:sz="4" w:space="0"/>
-            <w:bottom w:val="single" w:color="auto" w:sz="4" w:space="0"/>
-            <w:right w:val="single" w:color="auto" w:sz="4" w:space="0"/>
-            <w:insideH w:val="single" w:color="auto" w:sz="4" w:space="0"/>
-            <w:insideV w:val="single" w:color="auto" w:sz="4" w:space="0"/>
-          </w:tblBorders>
-          <w:tblCellMar>
-            <w:left w:w="108" w:type="dxa"/>
+              <w:widowControl w:val="0"/>
+              <w:spacing w:line="240" w:lineRule="auto"/>
+              <w:jc w:val="left"/>
+              <w:rPr>
+                <w:rFonts w:hint="default" w:ascii="Times New Roman" w:hAnsi="Times New Roman" w:cs="Times New Roman"/>
+                <w:sz w:val="26"/>
+                <w:szCs w:val="26"/>
+                <w:vertAlign w:val="baseline"/>
+                <w:lang w:val="vi-VN"/>
+              </w:rPr>
+            </w:pPr>
+            <w:r>
+              <w:rPr>
+                <w:rFonts w:hint="default" w:ascii="Times New Roman" w:hAnsi="Times New Roman"/>
+                <w:sz w:val="26"/>
+                <w:szCs w:val="26"/>
+                <w:vertAlign w:val="baseline"/>
+                <w:lang w:val="vi-VN"/>
+              </w:rPr>
+              <w:t>Quản lý hồ sơ</w:t>
+            </w:r>
+          </w:p>
+        </w:tc>
+      </w:tr>
+      <w:tr>
+        <w:tblPrEx>
+          <w:tblBorders>
+            <w:top w:val="single" w:color="auto" w:sz="4" w:space="0"/>
+            <w:left w:val="single" w:color="auto" w:sz="4" w:space="0"/>
+            <w:bottom w:val="single" w:color="auto" w:sz="4" w:space="0"/>
+            <w:right w:val="single" w:color="auto" w:sz="4" w:space="0"/>
+            <w:insideH w:val="single" w:color="auto" w:sz="4" w:space="0"/>
+            <w:insideV w:val="single" w:color="auto" w:sz="4" w:space="0"/>
+          </w:tblBorders>
+          <w:tblCellMar>
+            <w:top w:w="0" w:type="dxa"/>
+            <w:left w:w="108" w:type="dxa"/>
+            <w:bottom w:w="0" w:type="dxa"/>
             <w:right w:w="108" w:type="dxa"/>
           </w:tblCellMar>
         </w:tblPrEx>
@@ -2998,6 +5365,7 @@
           </w:tcPr>
           <w:p>
             <w:pPr>
+              <w:widowControl w:val="0"/>
               <w:spacing w:line="240" w:lineRule="auto"/>
               <w:jc w:val="left"/>
               <w:rPr>
@@ -3017,120 +5385,44 @@
           </w:tcPr>
           <w:p>
             <w:pPr>
-              <w:spacing w:line="240" w:lineRule="auto"/>
-              <w:jc w:val="left"/>
-              <w:rPr>
-                <w:rFonts w:hint="default" w:ascii="Times New Roman" w:hAnsi="Times New Roman" w:cs="Times New Roman"/>
-                <w:sz w:val="26"/>
-                <w:szCs w:val="26"/>
-                <w:vertAlign w:val="baseline"/>
-                <w:lang w:val="vi-VN"/>
-              </w:rPr>
-            </w:pPr>
-            <w:r>
-              <w:rPr>
-                <w:rFonts w:hint="default" w:ascii="Times New Roman" w:hAnsi="Times New Roman"/>
-                <w:sz w:val="26"/>
-                <w:szCs w:val="26"/>
-                <w:vertAlign w:val="baseline"/>
-                <w:lang w:val="vi-VN"/>
-              </w:rPr>
-              <w:t>Quản lý kỹ năng</w:t>
-            </w:r>
-          </w:p>
-        </w:tc>
-      </w:tr>
-      <w:tr>
-        <w:tblPrEx>
-          <w:tblBorders>
-            <w:top w:val="single" w:color="auto" w:sz="4" w:space="0"/>
-            <w:left w:val="single" w:color="auto" w:sz="4" w:space="0"/>
-            <w:bottom w:val="single" w:color="auto" w:sz="4" w:space="0"/>
-            <w:right w:val="single" w:color="auto" w:sz="4" w:space="0"/>
-            <w:insideH w:val="single" w:color="auto" w:sz="4" w:space="0"/>
-            <w:insideV w:val="single" w:color="auto" w:sz="4" w:space="0"/>
-          </w:tblBorders>
-          <w:tblCellMar>
-            <w:left w:w="108" w:type="dxa"/>
-            <w:right w:w="108" w:type="dxa"/>
-          </w:tblCellMar>
-        </w:tblPrEx>
-        <w:trPr>
-          <w:trHeight w:val="448" w:hRule="atLeast"/>
-        </w:trPr>
-        <w:tc>
-          <w:tcPr>
-            <w:tcW w:w="4003" w:type="dxa"/>
-            <w:vMerge w:val="restart"/>
-            <w:vAlign w:val="center"/>
-          </w:tcPr>
-          <w:p>
-            <w:pPr>
-              <w:widowControl w:val="0"/>
-              <w:spacing w:line="240" w:lineRule="auto"/>
-              <w:jc w:val="left"/>
-              <w:rPr>
-                <w:rFonts w:hint="default" w:ascii="Times New Roman" w:hAnsi="Times New Roman" w:cs="Times New Roman"/>
-                <w:sz w:val="26"/>
-                <w:szCs w:val="26"/>
-                <w:vertAlign w:val="baseline"/>
-                <w:lang w:val="vi-VN"/>
-              </w:rPr>
-            </w:pPr>
-            <w:r>
-              <w:rPr>
-                <w:rFonts w:hint="default" w:ascii="Times New Roman" w:hAnsi="Times New Roman" w:cs="Times New Roman"/>
-                <w:sz w:val="26"/>
-                <w:szCs w:val="26"/>
-                <w:vertAlign w:val="baseline"/>
-                <w:lang w:val="vi-VN"/>
-              </w:rPr>
-              <w:t>Trương Ngọc Gia Hưng</w:t>
-            </w:r>
-          </w:p>
-        </w:tc>
-        <w:tc>
-          <w:tcPr>
-            <w:tcW w:w="4519" w:type="dxa"/>
-            <w:vAlign w:val="center"/>
-          </w:tcPr>
-          <w:p>
-            <w:pPr>
-              <w:spacing w:line="240" w:lineRule="auto"/>
-              <w:jc w:val="left"/>
-              <w:rPr>
-                <w:rFonts w:hint="default" w:ascii="Times New Roman" w:hAnsi="Times New Roman" w:cs="Times New Roman"/>
-                <w:sz w:val="26"/>
-                <w:szCs w:val="26"/>
-                <w:vertAlign w:val="baseline"/>
-                <w:lang w:val="vi-VN"/>
-              </w:rPr>
-            </w:pPr>
-            <w:r>
-              <w:rPr>
-                <w:rFonts w:hint="default" w:ascii="Times New Roman" w:hAnsi="Times New Roman"/>
-                <w:sz w:val="26"/>
-                <w:szCs w:val="26"/>
-                <w:vertAlign w:val="baseline"/>
-                <w:lang w:val="vi-VN"/>
-              </w:rPr>
-              <w:t>Chi tiết tin tuyển dụng (Nhà tuyển dụng)</w:t>
-            </w:r>
-          </w:p>
-        </w:tc>
-      </w:tr>
-      <w:tr>
-        <w:tblPrEx>
-          <w:tblBorders>
-            <w:top w:val="single" w:color="auto" w:sz="4" w:space="0"/>
-            <w:left w:val="single" w:color="auto" w:sz="4" w:space="0"/>
-            <w:bottom w:val="single" w:color="auto" w:sz="4" w:space="0"/>
-            <w:right w:val="single" w:color="auto" w:sz="4" w:space="0"/>
-            <w:insideH w:val="single" w:color="auto" w:sz="4" w:space="0"/>
-            <w:insideV w:val="single" w:color="auto" w:sz="4" w:space="0"/>
-          </w:tblBorders>
-          <w:tblCellMar>
-            <w:left w:w="108" w:type="dxa"/>
+              <w:widowControl w:val="0"/>
+              <w:spacing w:line="240" w:lineRule="auto"/>
+              <w:jc w:val="left"/>
+              <w:rPr>
+                <w:rFonts w:hint="default" w:ascii="Times New Roman" w:hAnsi="Times New Roman" w:cs="Times New Roman"/>
+                <w:sz w:val="26"/>
+                <w:szCs w:val="26"/>
+                <w:vertAlign w:val="baseline"/>
+                <w:lang w:val="vi-VN"/>
+              </w:rPr>
+            </w:pPr>
+            <w:r>
+              <w:rPr>
+                <w:rFonts w:hint="default" w:ascii="Times New Roman" w:hAnsi="Times New Roman"/>
+                <w:sz w:val="26"/>
+                <w:szCs w:val="26"/>
+                <w:vertAlign w:val="baseline"/>
+                <w:lang w:val="vi-VN"/>
+              </w:rPr>
+              <w:t>Quản lý kỹ năng người dùng</w:t>
+            </w:r>
+          </w:p>
+        </w:tc>
+      </w:tr>
+      <w:tr>
+        <w:tblPrEx>
+          <w:tblBorders>
+            <w:top w:val="single" w:color="auto" w:sz="4" w:space="0"/>
+            <w:left w:val="single" w:color="auto" w:sz="4" w:space="0"/>
+            <w:bottom w:val="single" w:color="auto" w:sz="4" w:space="0"/>
+            <w:right w:val="single" w:color="auto" w:sz="4" w:space="0"/>
+            <w:insideH w:val="single" w:color="auto" w:sz="4" w:space="0"/>
+            <w:insideV w:val="single" w:color="auto" w:sz="4" w:space="0"/>
+          </w:tblBorders>
+          <w:tblCellMar>
+            <w:top w:w="0" w:type="dxa"/>
+            <w:left w:w="108" w:type="dxa"/>
+            <w:bottom w:w="0" w:type="dxa"/>
             <w:right w:w="108" w:type="dxa"/>
           </w:tblCellMar>
         </w:tblPrEx>
@@ -3146,6 +5438,7 @@
           </w:tcPr>
           <w:p>
             <w:pPr>
+              <w:widowControl w:val="0"/>
               <w:spacing w:line="240" w:lineRule="auto"/>
               <w:jc w:val="left"/>
               <w:rPr>
@@ -3165,41 +5458,51 @@
           </w:tcPr>
           <w:p>
             <w:pPr>
-              <w:spacing w:line="240" w:lineRule="auto"/>
-              <w:jc w:val="left"/>
-              <w:rPr>
-                <w:rFonts w:hint="default" w:ascii="Times New Roman" w:hAnsi="Times New Roman" w:cs="Times New Roman"/>
-                <w:sz w:val="26"/>
-                <w:szCs w:val="26"/>
-                <w:vertAlign w:val="baseline"/>
-                <w:lang w:val="vi-VN"/>
-              </w:rPr>
-            </w:pPr>
-            <w:r>
-              <w:rPr>
-                <w:rFonts w:hint="default" w:ascii="Times New Roman" w:hAnsi="Times New Roman"/>
-                <w:sz w:val="26"/>
-                <w:szCs w:val="26"/>
-                <w:vertAlign w:val="baseline"/>
-                <w:lang w:val="vi-VN"/>
-              </w:rPr>
-              <w:t>Danh sách ứng viên (Nhà tuyển dụng)</w:t>
-            </w:r>
-          </w:p>
-        </w:tc>
-      </w:tr>
-      <w:tr>
-        <w:tblPrEx>
-          <w:tblBorders>
-            <w:top w:val="single" w:color="auto" w:sz="4" w:space="0"/>
-            <w:left w:val="single" w:color="auto" w:sz="4" w:space="0"/>
-            <w:bottom w:val="single" w:color="auto" w:sz="4" w:space="0"/>
-            <w:right w:val="single" w:color="auto" w:sz="4" w:space="0"/>
-            <w:insideH w:val="single" w:color="auto" w:sz="4" w:space="0"/>
-            <w:insideV w:val="single" w:color="auto" w:sz="4" w:space="0"/>
-          </w:tblBorders>
-          <w:tblCellMar>
-            <w:left w:w="108" w:type="dxa"/>
+              <w:keepNext w:val="0"/>
+              <w:keepLines w:val="0"/>
+              <w:widowControl/>
+              <w:suppressLineNumbers w:val="0"/>
+              <w:jc w:val="left"/>
+              <w:textAlignment w:val="center"/>
+              <w:rPr>
+                <w:rFonts w:hint="default" w:ascii="Times New Roman" w:hAnsi="Times New Roman" w:cs="Times New Roman"/>
+                <w:sz w:val="26"/>
+                <w:szCs w:val="26"/>
+                <w:vertAlign w:val="baseline"/>
+                <w:lang w:val="vi-VN"/>
+              </w:rPr>
+            </w:pPr>
+            <w:r>
+              <w:rPr>
+                <w:rFonts w:hint="default" w:ascii="Times New Roman" w:hAnsi="Times New Roman" w:eastAsia="SimSun" w:cs="Times New Roman"/>
+                <w:i w:val="0"/>
+                <w:iCs w:val="0"/>
+                <w:color w:val="000000"/>
+                <w:kern w:val="0"/>
+                <w:sz w:val="26"/>
+                <w:szCs w:val="26"/>
+                <w:u w:val="none"/>
+                <w:lang w:val="en-US" w:eastAsia="zh-CN" w:bidi="ar"/>
+              </w:rPr>
+              <w:t>Nhật ký hệ thống</w:t>
+            </w:r>
+          </w:p>
+        </w:tc>
+      </w:tr>
+      <w:tr>
+        <w:tblPrEx>
+          <w:tblBorders>
+            <w:top w:val="single" w:color="auto" w:sz="4" w:space="0"/>
+            <w:left w:val="single" w:color="auto" w:sz="4" w:space="0"/>
+            <w:bottom w:val="single" w:color="auto" w:sz="4" w:space="0"/>
+            <w:right w:val="single" w:color="auto" w:sz="4" w:space="0"/>
+            <w:insideH w:val="single" w:color="auto" w:sz="4" w:space="0"/>
+            <w:insideV w:val="single" w:color="auto" w:sz="4" w:space="0"/>
+          </w:tblBorders>
+          <w:tblCellMar>
+            <w:top w:w="0" w:type="dxa"/>
+            <w:left w:w="108" w:type="dxa"/>
+            <w:bottom w:w="0" w:type="dxa"/>
             <w:right w:w="108" w:type="dxa"/>
           </w:tblCellMar>
         </w:tblPrEx>
@@ -3215,6 +5518,7 @@
           </w:tcPr>
           <w:p>
             <w:pPr>
+              <w:widowControl w:val="0"/>
               <w:spacing w:line="240" w:lineRule="auto"/>
               <w:jc w:val="left"/>
               <w:rPr>
@@ -3234,1090 +5538,33 @@
           </w:tcPr>
           <w:p>
             <w:pPr>
-              <w:spacing w:line="240" w:lineRule="auto"/>
-              <w:jc w:val="left"/>
-              <w:rPr>
-                <w:rFonts w:hint="default" w:ascii="Times New Roman" w:hAnsi="Times New Roman" w:cs="Times New Roman"/>
-                <w:sz w:val="26"/>
-                <w:szCs w:val="26"/>
-                <w:vertAlign w:val="baseline"/>
-                <w:lang w:val="vi-VN"/>
-              </w:rPr>
-            </w:pPr>
-            <w:r>
-              <w:rPr>
-                <w:rFonts w:hint="default" w:ascii="Times New Roman" w:hAnsi="Times New Roman"/>
-                <w:sz w:val="26"/>
-                <w:szCs w:val="26"/>
-                <w:vertAlign w:val="baseline"/>
-                <w:lang w:val="vi-VN"/>
-              </w:rPr>
-              <w:t>Quản lý phỏng vấn (Nhà tuyển dụng)</w:t>
-            </w:r>
-          </w:p>
-        </w:tc>
-      </w:tr>
-      <w:tr>
-        <w:tblPrEx>
-          <w:tblBorders>
-            <w:top w:val="single" w:color="auto" w:sz="4" w:space="0"/>
-            <w:left w:val="single" w:color="auto" w:sz="4" w:space="0"/>
-            <w:bottom w:val="single" w:color="auto" w:sz="4" w:space="0"/>
-            <w:right w:val="single" w:color="auto" w:sz="4" w:space="0"/>
-            <w:insideH w:val="single" w:color="auto" w:sz="4" w:space="0"/>
-            <w:insideV w:val="single" w:color="auto" w:sz="4" w:space="0"/>
-          </w:tblBorders>
-          <w:tblCellMar>
-            <w:left w:w="108" w:type="dxa"/>
-            <w:right w:w="108" w:type="dxa"/>
-          </w:tblCellMar>
-        </w:tblPrEx>
-        <w:trPr>
-          <w:trHeight w:val="448" w:hRule="atLeast"/>
-        </w:trPr>
-        <w:tc>
-          <w:tcPr>
-            <w:tcW w:w="4003" w:type="dxa"/>
-            <w:vMerge w:val="continue"/>
-            <w:tcBorders/>
-            <w:vAlign w:val="center"/>
-          </w:tcPr>
-          <w:p>
-            <w:pPr>
-              <w:spacing w:line="240" w:lineRule="auto"/>
-              <w:jc w:val="left"/>
-              <w:rPr>
-                <w:rFonts w:hint="default" w:ascii="Times New Roman" w:hAnsi="Times New Roman" w:cs="Times New Roman"/>
-                <w:sz w:val="26"/>
-                <w:szCs w:val="26"/>
-                <w:vertAlign w:val="baseline"/>
-                <w:lang w:val="vi-VN"/>
-              </w:rPr>
-            </w:pPr>
-          </w:p>
-        </w:tc>
-        <w:tc>
-          <w:tcPr>
-            <w:tcW w:w="4519" w:type="dxa"/>
-            <w:vAlign w:val="center"/>
-          </w:tcPr>
-          <w:p>
-            <w:pPr>
-              <w:spacing w:line="240" w:lineRule="auto"/>
-              <w:jc w:val="left"/>
-              <w:rPr>
-                <w:rFonts w:hint="default" w:ascii="Times New Roman" w:hAnsi="Times New Roman" w:cs="Times New Roman"/>
-                <w:sz w:val="26"/>
-                <w:szCs w:val="26"/>
-                <w:vertAlign w:val="baseline"/>
-                <w:lang w:val="vi-VN"/>
-              </w:rPr>
-            </w:pPr>
-            <w:r>
-              <w:rPr>
-                <w:rFonts w:hint="default" w:ascii="Times New Roman" w:hAnsi="Times New Roman"/>
-                <w:sz w:val="26"/>
-                <w:szCs w:val="26"/>
-                <w:vertAlign w:val="baseline"/>
-                <w:lang w:val="vi-VN"/>
-              </w:rPr>
-              <w:t>Quản lý ngành nghề</w:t>
-            </w:r>
-          </w:p>
-        </w:tc>
-      </w:tr>
-      <w:tr>
-        <w:tblPrEx>
-          <w:tblBorders>
-            <w:top w:val="single" w:color="auto" w:sz="4" w:space="0"/>
-            <w:left w:val="single" w:color="auto" w:sz="4" w:space="0"/>
-            <w:bottom w:val="single" w:color="auto" w:sz="4" w:space="0"/>
-            <w:right w:val="single" w:color="auto" w:sz="4" w:space="0"/>
-            <w:insideH w:val="single" w:color="auto" w:sz="4" w:space="0"/>
-            <w:insideV w:val="single" w:color="auto" w:sz="4" w:space="0"/>
-          </w:tblBorders>
-          <w:tblCellMar>
-            <w:left w:w="108" w:type="dxa"/>
-            <w:right w:w="108" w:type="dxa"/>
-          </w:tblCellMar>
-        </w:tblPrEx>
-        <w:trPr>
-          <w:trHeight w:val="448" w:hRule="atLeast"/>
-        </w:trPr>
-        <w:tc>
-          <w:tcPr>
-            <w:tcW w:w="4003" w:type="dxa"/>
-            <w:vMerge w:val="restart"/>
-            <w:vAlign w:val="center"/>
-          </w:tcPr>
-          <w:p>
-            <w:pPr>
-              <w:widowControl w:val="0"/>
-              <w:spacing w:line="240" w:lineRule="auto"/>
-              <w:jc w:val="left"/>
-              <w:rPr>
-                <w:rFonts w:hint="default" w:ascii="Times New Roman" w:hAnsi="Times New Roman" w:cs="Times New Roman"/>
-                <w:sz w:val="26"/>
-                <w:szCs w:val="26"/>
-                <w:vertAlign w:val="baseline"/>
-                <w:lang w:val="vi-VN"/>
-              </w:rPr>
-            </w:pPr>
-            <w:r>
-              <w:rPr>
-                <w:rFonts w:hint="default" w:ascii="Times New Roman" w:hAnsi="Times New Roman" w:cs="Times New Roman"/>
-                <w:sz w:val="26"/>
-                <w:szCs w:val="26"/>
-                <w:vertAlign w:val="baseline"/>
-                <w:lang w:val="vi-VN"/>
-              </w:rPr>
-              <w:t>Đặng Phước Hoàng Long</w:t>
-            </w:r>
-          </w:p>
-        </w:tc>
-        <w:tc>
-          <w:tcPr>
-            <w:tcW w:w="4519" w:type="dxa"/>
-            <w:vAlign w:val="center"/>
-          </w:tcPr>
-          <w:p>
-            <w:pPr>
-              <w:spacing w:line="240" w:lineRule="auto"/>
-              <w:jc w:val="left"/>
-              <w:rPr>
-                <w:rFonts w:hint="default" w:ascii="Times New Roman" w:hAnsi="Times New Roman" w:cs="Times New Roman"/>
-                <w:sz w:val="26"/>
-                <w:szCs w:val="26"/>
-                <w:vertAlign w:val="baseline"/>
-                <w:lang w:val="vi-VN"/>
-              </w:rPr>
-            </w:pPr>
-            <w:r>
-              <w:rPr>
-                <w:rFonts w:hint="default" w:ascii="Times New Roman" w:hAnsi="Times New Roman"/>
-                <w:sz w:val="26"/>
-                <w:szCs w:val="26"/>
-                <w:vertAlign w:val="baseline"/>
-                <w:lang w:val="vi-VN"/>
-              </w:rPr>
-              <w:t>Dashboard nhà tuyển dụng</w:t>
-            </w:r>
-          </w:p>
-        </w:tc>
-      </w:tr>
-      <w:tr>
-        <w:tblPrEx>
-          <w:tblBorders>
-            <w:top w:val="single" w:color="auto" w:sz="4" w:space="0"/>
-            <w:left w:val="single" w:color="auto" w:sz="4" w:space="0"/>
-            <w:bottom w:val="single" w:color="auto" w:sz="4" w:space="0"/>
-            <w:right w:val="single" w:color="auto" w:sz="4" w:space="0"/>
-            <w:insideH w:val="single" w:color="auto" w:sz="4" w:space="0"/>
-            <w:insideV w:val="single" w:color="auto" w:sz="4" w:space="0"/>
-          </w:tblBorders>
-          <w:tblCellMar>
-            <w:left w:w="108" w:type="dxa"/>
-            <w:right w:w="108" w:type="dxa"/>
-          </w:tblCellMar>
-        </w:tblPrEx>
-        <w:trPr>
-          <w:trHeight w:val="448" w:hRule="atLeast"/>
-        </w:trPr>
-        <w:tc>
-          <w:tcPr>
-            <w:tcW w:w="4003" w:type="dxa"/>
-            <w:vMerge w:val="continue"/>
-            <w:tcBorders/>
-            <w:vAlign w:val="center"/>
-          </w:tcPr>
-          <w:p>
-            <w:pPr>
-              <w:spacing w:line="240" w:lineRule="auto"/>
-              <w:jc w:val="left"/>
-              <w:rPr>
-                <w:rFonts w:hint="default" w:ascii="Times New Roman" w:hAnsi="Times New Roman" w:cs="Times New Roman"/>
-                <w:sz w:val="26"/>
-                <w:szCs w:val="26"/>
-                <w:vertAlign w:val="baseline"/>
-                <w:lang w:val="vi-VN"/>
-              </w:rPr>
-            </w:pPr>
-          </w:p>
-        </w:tc>
-        <w:tc>
-          <w:tcPr>
-            <w:tcW w:w="4519" w:type="dxa"/>
-            <w:vAlign w:val="center"/>
-          </w:tcPr>
-          <w:p>
-            <w:pPr>
-              <w:spacing w:line="240" w:lineRule="auto"/>
-              <w:jc w:val="left"/>
-              <w:rPr>
-                <w:rFonts w:hint="default" w:ascii="Times New Roman" w:hAnsi="Times New Roman" w:cs="Times New Roman"/>
-                <w:sz w:val="26"/>
-                <w:szCs w:val="26"/>
-                <w:vertAlign w:val="baseline"/>
-                <w:lang w:val="vi-VN"/>
-              </w:rPr>
-            </w:pPr>
-            <w:r>
-              <w:rPr>
-                <w:rFonts w:hint="default" w:ascii="Times New Roman" w:hAnsi="Times New Roman"/>
-                <w:sz w:val="26"/>
-                <w:szCs w:val="26"/>
-                <w:vertAlign w:val="baseline"/>
-                <w:lang w:val="vi-VN"/>
-              </w:rPr>
-              <w:t>Hồ sơ nhà tuyển dụng</w:t>
-            </w:r>
-          </w:p>
-        </w:tc>
-      </w:tr>
-      <w:tr>
-        <w:tblPrEx>
-          <w:tblBorders>
-            <w:top w:val="single" w:color="auto" w:sz="4" w:space="0"/>
-            <w:left w:val="single" w:color="auto" w:sz="4" w:space="0"/>
-            <w:bottom w:val="single" w:color="auto" w:sz="4" w:space="0"/>
-            <w:right w:val="single" w:color="auto" w:sz="4" w:space="0"/>
-            <w:insideH w:val="single" w:color="auto" w:sz="4" w:space="0"/>
-            <w:insideV w:val="single" w:color="auto" w:sz="4" w:space="0"/>
-          </w:tblBorders>
-          <w:tblCellMar>
-            <w:left w:w="108" w:type="dxa"/>
-            <w:right w:w="108" w:type="dxa"/>
-          </w:tblCellMar>
-        </w:tblPrEx>
-        <w:trPr>
-          <w:trHeight w:val="448" w:hRule="atLeast"/>
-        </w:trPr>
-        <w:tc>
-          <w:tcPr>
-            <w:tcW w:w="4003" w:type="dxa"/>
-            <w:vMerge w:val="continue"/>
-            <w:tcBorders/>
-            <w:vAlign w:val="center"/>
-          </w:tcPr>
-          <w:p>
-            <w:pPr>
-              <w:spacing w:line="240" w:lineRule="auto"/>
-              <w:jc w:val="left"/>
-              <w:rPr>
-                <w:rFonts w:hint="default" w:ascii="Times New Roman" w:hAnsi="Times New Roman" w:cs="Times New Roman"/>
-                <w:sz w:val="26"/>
-                <w:szCs w:val="26"/>
-                <w:vertAlign w:val="baseline"/>
-                <w:lang w:val="vi-VN"/>
-              </w:rPr>
-            </w:pPr>
-          </w:p>
-        </w:tc>
-        <w:tc>
-          <w:tcPr>
-            <w:tcW w:w="4519" w:type="dxa"/>
-            <w:vAlign w:val="center"/>
-          </w:tcPr>
-          <w:p>
-            <w:pPr>
-              <w:spacing w:line="240" w:lineRule="auto"/>
-              <w:jc w:val="left"/>
-              <w:rPr>
-                <w:rFonts w:hint="default" w:ascii="Times New Roman" w:hAnsi="Times New Roman" w:cs="Times New Roman"/>
-                <w:sz w:val="26"/>
-                <w:szCs w:val="26"/>
-                <w:vertAlign w:val="baseline"/>
-                <w:lang w:val="vi-VN"/>
-              </w:rPr>
-            </w:pPr>
-            <w:r>
-              <w:rPr>
-                <w:rFonts w:hint="default" w:ascii="Times New Roman" w:hAnsi="Times New Roman"/>
-                <w:sz w:val="26"/>
-                <w:szCs w:val="26"/>
-                <w:vertAlign w:val="baseline"/>
-                <w:lang w:val="vi-VN"/>
-              </w:rPr>
-              <w:t>Quản lý tin tuyển dụng (Nhà tuyển dụng)</w:t>
-            </w:r>
-          </w:p>
-        </w:tc>
-      </w:tr>
-      <w:tr>
-        <w:tblPrEx>
-          <w:tblBorders>
-            <w:top w:val="single" w:color="auto" w:sz="4" w:space="0"/>
-            <w:left w:val="single" w:color="auto" w:sz="4" w:space="0"/>
-            <w:bottom w:val="single" w:color="auto" w:sz="4" w:space="0"/>
-            <w:right w:val="single" w:color="auto" w:sz="4" w:space="0"/>
-            <w:insideH w:val="single" w:color="auto" w:sz="4" w:space="0"/>
-            <w:insideV w:val="single" w:color="auto" w:sz="4" w:space="0"/>
-          </w:tblBorders>
-          <w:tblCellMar>
-            <w:left w:w="108" w:type="dxa"/>
-            <w:right w:w="108" w:type="dxa"/>
-          </w:tblCellMar>
-        </w:tblPrEx>
-        <w:trPr>
-          <w:trHeight w:val="448" w:hRule="atLeast"/>
-        </w:trPr>
-        <w:tc>
-          <w:tcPr>
-            <w:tcW w:w="4003" w:type="dxa"/>
-            <w:vMerge w:val="continue"/>
-            <w:tcBorders/>
-            <w:vAlign w:val="center"/>
-          </w:tcPr>
-          <w:p>
-            <w:pPr>
-              <w:spacing w:line="240" w:lineRule="auto"/>
-              <w:jc w:val="left"/>
-              <w:rPr>
-                <w:rFonts w:hint="default" w:ascii="Times New Roman" w:hAnsi="Times New Roman" w:cs="Times New Roman"/>
-                <w:sz w:val="26"/>
-                <w:szCs w:val="26"/>
-                <w:vertAlign w:val="baseline"/>
-                <w:lang w:val="vi-VN"/>
-              </w:rPr>
-            </w:pPr>
-          </w:p>
-        </w:tc>
-        <w:tc>
-          <w:tcPr>
-            <w:tcW w:w="4519" w:type="dxa"/>
-            <w:vAlign w:val="center"/>
-          </w:tcPr>
-          <w:p>
-            <w:pPr>
-              <w:spacing w:line="240" w:lineRule="auto"/>
-              <w:jc w:val="left"/>
-              <w:rPr>
-                <w:rFonts w:hint="default" w:ascii="Times New Roman" w:hAnsi="Times New Roman" w:cs="Times New Roman"/>
-                <w:sz w:val="26"/>
-                <w:szCs w:val="26"/>
-                <w:vertAlign w:val="baseline"/>
-                <w:lang w:val="vi-VN"/>
-              </w:rPr>
-            </w:pPr>
-            <w:r>
-              <w:rPr>
-                <w:rFonts w:hint="default" w:ascii="Times New Roman" w:hAnsi="Times New Roman"/>
-                <w:sz w:val="26"/>
-                <w:szCs w:val="26"/>
-                <w:vertAlign w:val="baseline"/>
-                <w:lang w:val="vi-VN"/>
-              </w:rPr>
-              <w:t>Quản lý tư vấn nghề nghiệp</w:t>
-            </w:r>
-          </w:p>
-        </w:tc>
-      </w:tr>
-      <w:tr>
-        <w:tblPrEx>
-          <w:tblBorders>
-            <w:top w:val="single" w:color="auto" w:sz="4" w:space="0"/>
-            <w:left w:val="single" w:color="auto" w:sz="4" w:space="0"/>
-            <w:bottom w:val="single" w:color="auto" w:sz="4" w:space="0"/>
-            <w:right w:val="single" w:color="auto" w:sz="4" w:space="0"/>
-            <w:insideH w:val="single" w:color="auto" w:sz="4" w:space="0"/>
-            <w:insideV w:val="single" w:color="auto" w:sz="4" w:space="0"/>
-          </w:tblBorders>
-          <w:tblCellMar>
-            <w:left w:w="108" w:type="dxa"/>
-            <w:right w:w="108" w:type="dxa"/>
-          </w:tblCellMar>
-        </w:tblPrEx>
-        <w:trPr>
-          <w:trHeight w:val="448" w:hRule="atLeast"/>
-        </w:trPr>
-        <w:tc>
-          <w:tcPr>
-            <w:tcW w:w="4003" w:type="dxa"/>
-            <w:vMerge w:val="continue"/>
-            <w:tcBorders/>
-            <w:vAlign w:val="center"/>
-          </w:tcPr>
-          <w:p>
-            <w:pPr>
-              <w:spacing w:line="240" w:lineRule="auto"/>
-              <w:jc w:val="left"/>
-              <w:rPr>
-                <w:rFonts w:hint="default" w:ascii="Times New Roman" w:hAnsi="Times New Roman" w:cs="Times New Roman"/>
-                <w:sz w:val="26"/>
-                <w:szCs w:val="26"/>
-                <w:vertAlign w:val="baseline"/>
-                <w:lang w:val="vi-VN"/>
-              </w:rPr>
-            </w:pPr>
-          </w:p>
-        </w:tc>
-        <w:tc>
-          <w:tcPr>
-            <w:tcW w:w="4519" w:type="dxa"/>
-            <w:vAlign w:val="center"/>
-          </w:tcPr>
-          <w:p>
-            <w:pPr>
-              <w:spacing w:line="240" w:lineRule="auto"/>
-              <w:jc w:val="left"/>
-              <w:rPr>
-                <w:rFonts w:hint="default" w:ascii="Times New Roman" w:hAnsi="Times New Roman" w:cs="Times New Roman"/>
-                <w:sz w:val="26"/>
-                <w:szCs w:val="26"/>
-                <w:vertAlign w:val="baseline"/>
-                <w:lang w:val="vi-VN"/>
-              </w:rPr>
-            </w:pPr>
-            <w:r>
-              <w:rPr>
-                <w:rFonts w:hint="default" w:ascii="Times New Roman" w:hAnsi="Times New Roman"/>
-                <w:sz w:val="26"/>
-                <w:szCs w:val="26"/>
-                <w:vertAlign w:val="baseline"/>
-                <w:lang w:val="vi-VN"/>
-              </w:rPr>
-              <w:t>Quản lý tin tuyển dụng</w:t>
-            </w:r>
-          </w:p>
-        </w:tc>
-      </w:tr>
-      <w:tr>
-        <w:tblPrEx>
-          <w:tblBorders>
-            <w:top w:val="single" w:color="auto" w:sz="4" w:space="0"/>
-            <w:left w:val="single" w:color="auto" w:sz="4" w:space="0"/>
-            <w:bottom w:val="single" w:color="auto" w:sz="4" w:space="0"/>
-            <w:right w:val="single" w:color="auto" w:sz="4" w:space="0"/>
-            <w:insideH w:val="single" w:color="auto" w:sz="4" w:space="0"/>
-            <w:insideV w:val="single" w:color="auto" w:sz="4" w:space="0"/>
-          </w:tblBorders>
-          <w:tblCellMar>
-            <w:left w:w="108" w:type="dxa"/>
-            <w:right w:w="108" w:type="dxa"/>
-          </w:tblCellMar>
-        </w:tblPrEx>
-        <w:trPr>
-          <w:trHeight w:val="448" w:hRule="atLeast"/>
-        </w:trPr>
-        <w:tc>
-          <w:tcPr>
-            <w:tcW w:w="4003" w:type="dxa"/>
-            <w:vMerge w:val="restart"/>
-            <w:vAlign w:val="center"/>
-          </w:tcPr>
-          <w:p>
-            <w:pPr>
-              <w:widowControl w:val="0"/>
-              <w:spacing w:line="240" w:lineRule="auto"/>
-              <w:jc w:val="left"/>
-              <w:rPr>
-                <w:rFonts w:hint="default" w:ascii="Times New Roman" w:hAnsi="Times New Roman" w:cs="Times New Roman"/>
-                <w:sz w:val="26"/>
-                <w:szCs w:val="26"/>
-                <w:vertAlign w:val="baseline"/>
-                <w:lang w:val="vi-VN"/>
-              </w:rPr>
-            </w:pPr>
-            <w:r>
-              <w:rPr>
-                <w:rFonts w:hint="default" w:ascii="Times New Roman" w:hAnsi="Times New Roman" w:cs="Times New Roman"/>
-                <w:sz w:val="26"/>
-                <w:szCs w:val="26"/>
-                <w:vertAlign w:val="baseline"/>
-                <w:lang w:val="vi-VN"/>
-              </w:rPr>
-              <w:t>Doãn Khánh Mai</w:t>
-            </w:r>
-          </w:p>
-        </w:tc>
-        <w:tc>
-          <w:tcPr>
-            <w:tcW w:w="4519" w:type="dxa"/>
-            <w:vAlign w:val="center"/>
-          </w:tcPr>
-          <w:p>
-            <w:pPr>
-              <w:spacing w:line="240" w:lineRule="auto"/>
-              <w:jc w:val="left"/>
-              <w:rPr>
-                <w:rFonts w:hint="default" w:ascii="Times New Roman" w:hAnsi="Times New Roman" w:cs="Times New Roman"/>
-                <w:sz w:val="26"/>
-                <w:szCs w:val="26"/>
-                <w:vertAlign w:val="baseline"/>
-                <w:lang w:val="vi-VN"/>
-              </w:rPr>
-            </w:pPr>
-            <w:r>
-              <w:rPr>
-                <w:rFonts w:hint="default" w:ascii="Times New Roman" w:hAnsi="Times New Roman"/>
-                <w:sz w:val="26"/>
-                <w:szCs w:val="26"/>
-                <w:vertAlign w:val="baseline"/>
-                <w:lang w:val="vi-VN"/>
-              </w:rPr>
-              <w:t>Trang trung tâm AI</w:t>
-            </w:r>
-          </w:p>
-        </w:tc>
-      </w:tr>
-      <w:tr>
-        <w:tblPrEx>
-          <w:tblBorders>
-            <w:top w:val="single" w:color="auto" w:sz="4" w:space="0"/>
-            <w:left w:val="single" w:color="auto" w:sz="4" w:space="0"/>
-            <w:bottom w:val="single" w:color="auto" w:sz="4" w:space="0"/>
-            <w:right w:val="single" w:color="auto" w:sz="4" w:space="0"/>
-            <w:insideH w:val="single" w:color="auto" w:sz="4" w:space="0"/>
-            <w:insideV w:val="single" w:color="auto" w:sz="4" w:space="0"/>
-          </w:tblBorders>
-          <w:tblCellMar>
-            <w:left w:w="108" w:type="dxa"/>
-            <w:right w:w="108" w:type="dxa"/>
-          </w:tblCellMar>
-        </w:tblPrEx>
-        <w:trPr>
-          <w:trHeight w:val="448" w:hRule="atLeast"/>
-        </w:trPr>
-        <w:tc>
-          <w:tcPr>
-            <w:tcW w:w="4003" w:type="dxa"/>
-            <w:vMerge w:val="continue"/>
-            <w:tcBorders/>
-            <w:vAlign w:val="center"/>
-          </w:tcPr>
-          <w:p>
-            <w:pPr>
-              <w:spacing w:line="240" w:lineRule="auto"/>
-              <w:jc w:val="left"/>
-              <w:rPr>
-                <w:rFonts w:hint="default" w:ascii="Times New Roman" w:hAnsi="Times New Roman" w:cs="Times New Roman"/>
-                <w:sz w:val="26"/>
-                <w:szCs w:val="26"/>
-                <w:vertAlign w:val="baseline"/>
-                <w:lang w:val="vi-VN"/>
-              </w:rPr>
-            </w:pPr>
-          </w:p>
-        </w:tc>
-        <w:tc>
-          <w:tcPr>
-            <w:tcW w:w="4519" w:type="dxa"/>
-            <w:vAlign w:val="center"/>
-          </w:tcPr>
-          <w:p>
-            <w:pPr>
-              <w:spacing w:line="240" w:lineRule="auto"/>
-              <w:jc w:val="left"/>
-              <w:rPr>
-                <w:rFonts w:hint="default" w:ascii="Times New Roman" w:hAnsi="Times New Roman" w:cs="Times New Roman"/>
-                <w:sz w:val="26"/>
-                <w:szCs w:val="26"/>
-                <w:vertAlign w:val="baseline"/>
-                <w:lang w:val="vi-VN"/>
-              </w:rPr>
-            </w:pPr>
-            <w:r>
-              <w:rPr>
-                <w:rFonts w:hint="default" w:ascii="Times New Roman" w:hAnsi="Times New Roman"/>
-                <w:sz w:val="26"/>
-                <w:szCs w:val="26"/>
-                <w:vertAlign w:val="baseline"/>
-                <w:lang w:val="vi-VN"/>
-              </w:rPr>
-              <w:t>Chat tư vấn nghề nghiệp</w:t>
-            </w:r>
-          </w:p>
-        </w:tc>
-      </w:tr>
-      <w:tr>
-        <w:tblPrEx>
-          <w:tblBorders>
-            <w:top w:val="single" w:color="auto" w:sz="4" w:space="0"/>
-            <w:left w:val="single" w:color="auto" w:sz="4" w:space="0"/>
-            <w:bottom w:val="single" w:color="auto" w:sz="4" w:space="0"/>
-            <w:right w:val="single" w:color="auto" w:sz="4" w:space="0"/>
-            <w:insideH w:val="single" w:color="auto" w:sz="4" w:space="0"/>
-            <w:insideV w:val="single" w:color="auto" w:sz="4" w:space="0"/>
-          </w:tblBorders>
-          <w:tblCellMar>
-            <w:left w:w="108" w:type="dxa"/>
-            <w:right w:w="108" w:type="dxa"/>
-          </w:tblCellMar>
-        </w:tblPrEx>
-        <w:trPr>
-          <w:trHeight w:val="448" w:hRule="atLeast"/>
-        </w:trPr>
-        <w:tc>
-          <w:tcPr>
-            <w:tcW w:w="4003" w:type="dxa"/>
-            <w:vMerge w:val="continue"/>
-            <w:tcBorders/>
-            <w:vAlign w:val="center"/>
-          </w:tcPr>
-          <w:p>
-            <w:pPr>
-              <w:spacing w:line="240" w:lineRule="auto"/>
-              <w:jc w:val="left"/>
-              <w:rPr>
-                <w:rFonts w:hint="default" w:ascii="Times New Roman" w:hAnsi="Times New Roman" w:cs="Times New Roman"/>
-                <w:sz w:val="26"/>
-                <w:szCs w:val="26"/>
-                <w:vertAlign w:val="baseline"/>
-                <w:lang w:val="vi-VN"/>
-              </w:rPr>
-            </w:pPr>
-          </w:p>
-        </w:tc>
-        <w:tc>
-          <w:tcPr>
-            <w:tcW w:w="4519" w:type="dxa"/>
-            <w:vAlign w:val="center"/>
-          </w:tcPr>
-          <w:p>
-            <w:pPr>
-              <w:spacing w:line="240" w:lineRule="auto"/>
-              <w:jc w:val="left"/>
-              <w:rPr>
-                <w:rFonts w:hint="default" w:ascii="Times New Roman" w:hAnsi="Times New Roman" w:cs="Times New Roman"/>
-                <w:sz w:val="26"/>
-                <w:szCs w:val="26"/>
-                <w:vertAlign w:val="baseline"/>
-                <w:lang w:val="vi-VN"/>
-              </w:rPr>
-            </w:pPr>
-            <w:r>
-              <w:rPr>
-                <w:rFonts w:hint="default" w:ascii="Times New Roman" w:hAnsi="Times New Roman"/>
-                <w:sz w:val="26"/>
-                <w:szCs w:val="26"/>
-                <w:vertAlign w:val="baseline"/>
-                <w:lang w:val="vi-VN"/>
-              </w:rPr>
-              <w:t>Phỏng vấn thử</w:t>
-            </w:r>
-          </w:p>
-        </w:tc>
-      </w:tr>
-      <w:tr>
-        <w:tblPrEx>
-          <w:tblBorders>
-            <w:top w:val="single" w:color="auto" w:sz="4" w:space="0"/>
-            <w:left w:val="single" w:color="auto" w:sz="4" w:space="0"/>
-            <w:bottom w:val="single" w:color="auto" w:sz="4" w:space="0"/>
-            <w:right w:val="single" w:color="auto" w:sz="4" w:space="0"/>
-            <w:insideH w:val="single" w:color="auto" w:sz="4" w:space="0"/>
-            <w:insideV w:val="single" w:color="auto" w:sz="4" w:space="0"/>
-          </w:tblBorders>
-          <w:tblCellMar>
-            <w:left w:w="108" w:type="dxa"/>
-            <w:right w:w="108" w:type="dxa"/>
-          </w:tblCellMar>
-        </w:tblPrEx>
-        <w:trPr>
-          <w:trHeight w:val="448" w:hRule="atLeast"/>
-        </w:trPr>
-        <w:tc>
-          <w:tcPr>
-            <w:tcW w:w="4003" w:type="dxa"/>
-            <w:vMerge w:val="continue"/>
-            <w:tcBorders/>
-            <w:vAlign w:val="center"/>
-          </w:tcPr>
-          <w:p>
-            <w:pPr>
-              <w:spacing w:line="240" w:lineRule="auto"/>
-              <w:jc w:val="left"/>
-              <w:rPr>
-                <w:rFonts w:hint="default" w:ascii="Times New Roman" w:hAnsi="Times New Roman" w:cs="Times New Roman"/>
-                <w:sz w:val="26"/>
-                <w:szCs w:val="26"/>
-                <w:vertAlign w:val="baseline"/>
-                <w:lang w:val="vi-VN"/>
-              </w:rPr>
-            </w:pPr>
-          </w:p>
-        </w:tc>
-        <w:tc>
-          <w:tcPr>
-            <w:tcW w:w="4519" w:type="dxa"/>
-            <w:vAlign w:val="center"/>
-          </w:tcPr>
-          <w:p>
-            <w:pPr>
-              <w:spacing w:line="240" w:lineRule="auto"/>
-              <w:jc w:val="left"/>
-              <w:rPr>
-                <w:rFonts w:hint="default" w:ascii="Times New Roman" w:hAnsi="Times New Roman" w:cs="Times New Roman"/>
-                <w:sz w:val="26"/>
-                <w:szCs w:val="26"/>
-                <w:vertAlign w:val="baseline"/>
-                <w:lang w:val="vi-VN"/>
-              </w:rPr>
-            </w:pPr>
-            <w:r>
-              <w:rPr>
-                <w:rFonts w:hint="default" w:ascii="Times New Roman" w:hAnsi="Times New Roman"/>
-                <w:sz w:val="26"/>
-                <w:szCs w:val="26"/>
-                <w:vertAlign w:val="baseline"/>
-                <w:lang w:val="vi-VN"/>
-              </w:rPr>
-              <w:t>Quản lý kết quả matching</w:t>
-            </w:r>
-          </w:p>
-        </w:tc>
-      </w:tr>
-      <w:tr>
-        <w:tblPrEx>
-          <w:tblBorders>
-            <w:top w:val="single" w:color="auto" w:sz="4" w:space="0"/>
-            <w:left w:val="single" w:color="auto" w:sz="4" w:space="0"/>
-            <w:bottom w:val="single" w:color="auto" w:sz="4" w:space="0"/>
-            <w:right w:val="single" w:color="auto" w:sz="4" w:space="0"/>
-            <w:insideH w:val="single" w:color="auto" w:sz="4" w:space="0"/>
-            <w:insideV w:val="single" w:color="auto" w:sz="4" w:space="0"/>
-          </w:tblBorders>
-          <w:tblCellMar>
-            <w:left w:w="108" w:type="dxa"/>
-            <w:right w:w="108" w:type="dxa"/>
-          </w:tblCellMar>
-        </w:tblPrEx>
-        <w:trPr>
-          <w:trHeight w:val="448" w:hRule="atLeast"/>
-        </w:trPr>
-        <w:tc>
-          <w:tcPr>
-            <w:tcW w:w="4003" w:type="dxa"/>
-            <w:vMerge w:val="restart"/>
-            <w:vAlign w:val="center"/>
-          </w:tcPr>
-          <w:p>
-            <w:pPr>
-              <w:widowControl w:val="0"/>
-              <w:spacing w:line="240" w:lineRule="auto"/>
-              <w:jc w:val="left"/>
-              <w:rPr>
-                <w:rFonts w:hint="default" w:ascii="Times New Roman" w:hAnsi="Times New Roman" w:cs="Times New Roman"/>
-                <w:sz w:val="26"/>
-                <w:szCs w:val="26"/>
-                <w:vertAlign w:val="baseline"/>
-                <w:lang w:val="vi-VN"/>
-              </w:rPr>
-            </w:pPr>
-            <w:r>
-              <w:rPr>
-                <w:rFonts w:hint="default" w:ascii="Times New Roman" w:hAnsi="Times New Roman" w:cs="Times New Roman"/>
-                <w:sz w:val="26"/>
-                <w:szCs w:val="26"/>
-                <w:vertAlign w:val="baseline"/>
-                <w:lang w:val="vi-VN"/>
-              </w:rPr>
-              <w:t>Nguyễn Đức Trí</w:t>
-            </w:r>
-          </w:p>
-        </w:tc>
-        <w:tc>
-          <w:tcPr>
-            <w:tcW w:w="4519" w:type="dxa"/>
-            <w:vAlign w:val="center"/>
-          </w:tcPr>
-          <w:p>
-            <w:pPr>
-              <w:spacing w:line="240" w:lineRule="auto"/>
-              <w:jc w:val="left"/>
-              <w:rPr>
-                <w:rFonts w:hint="default" w:ascii="Times New Roman" w:hAnsi="Times New Roman" w:cs="Times New Roman"/>
-                <w:sz w:val="26"/>
-                <w:szCs w:val="26"/>
-                <w:vertAlign w:val="baseline"/>
-                <w:lang w:val="vi-VN"/>
-              </w:rPr>
-            </w:pPr>
-            <w:r>
-              <w:rPr>
-                <w:rFonts w:hint="default" w:ascii="Times New Roman" w:hAnsi="Times New Roman"/>
-                <w:sz w:val="26"/>
-                <w:szCs w:val="26"/>
-                <w:vertAlign w:val="baseline"/>
-                <w:lang w:val="vi-VN"/>
-              </w:rPr>
-              <w:t>Quản lý người dùng</w:t>
-            </w:r>
-          </w:p>
-        </w:tc>
-      </w:tr>
-      <w:tr>
-        <w:tblPrEx>
-          <w:tblBorders>
-            <w:top w:val="single" w:color="auto" w:sz="4" w:space="0"/>
-            <w:left w:val="single" w:color="auto" w:sz="4" w:space="0"/>
-            <w:bottom w:val="single" w:color="auto" w:sz="4" w:space="0"/>
-            <w:right w:val="single" w:color="auto" w:sz="4" w:space="0"/>
-            <w:insideH w:val="single" w:color="auto" w:sz="4" w:space="0"/>
-            <w:insideV w:val="single" w:color="auto" w:sz="4" w:space="0"/>
-          </w:tblBorders>
-          <w:tblCellMar>
-            <w:left w:w="108" w:type="dxa"/>
-            <w:right w:w="108" w:type="dxa"/>
-          </w:tblCellMar>
-        </w:tblPrEx>
-        <w:trPr>
-          <w:trHeight w:val="448" w:hRule="atLeast"/>
-        </w:trPr>
-        <w:tc>
-          <w:tcPr>
-            <w:tcW w:w="4003" w:type="dxa"/>
-            <w:vMerge w:val="continue"/>
-            <w:tcBorders/>
-            <w:vAlign w:val="center"/>
-          </w:tcPr>
-          <w:p>
-            <w:pPr>
-              <w:spacing w:line="240" w:lineRule="auto"/>
-              <w:jc w:val="left"/>
-              <w:rPr>
-                <w:rFonts w:hint="default" w:ascii="Times New Roman" w:hAnsi="Times New Roman" w:cs="Times New Roman"/>
-                <w:sz w:val="26"/>
-                <w:szCs w:val="26"/>
-                <w:vertAlign w:val="baseline"/>
-                <w:lang w:val="vi-VN"/>
-              </w:rPr>
-            </w:pPr>
-          </w:p>
-        </w:tc>
-        <w:tc>
-          <w:tcPr>
-            <w:tcW w:w="4519" w:type="dxa"/>
-            <w:vAlign w:val="center"/>
-          </w:tcPr>
-          <w:p>
-            <w:pPr>
-              <w:spacing w:line="240" w:lineRule="auto"/>
-              <w:jc w:val="left"/>
-              <w:rPr>
-                <w:rFonts w:hint="default" w:ascii="Times New Roman" w:hAnsi="Times New Roman" w:cs="Times New Roman"/>
-                <w:sz w:val="26"/>
-                <w:szCs w:val="26"/>
-                <w:vertAlign w:val="baseline"/>
-                <w:lang w:val="vi-VN"/>
-              </w:rPr>
-            </w:pPr>
-            <w:r>
-              <w:rPr>
-                <w:rFonts w:hint="default" w:ascii="Times New Roman" w:hAnsi="Times New Roman"/>
-                <w:sz w:val="26"/>
-                <w:szCs w:val="26"/>
-                <w:vertAlign w:val="baseline"/>
-                <w:lang w:val="vi-VN"/>
-              </w:rPr>
-              <w:t>Quản lý công ty</w:t>
-            </w:r>
-          </w:p>
-        </w:tc>
-      </w:tr>
-      <w:tr>
-        <w:tblPrEx>
-          <w:tblBorders>
-            <w:top w:val="single" w:color="auto" w:sz="4" w:space="0"/>
-            <w:left w:val="single" w:color="auto" w:sz="4" w:space="0"/>
-            <w:bottom w:val="single" w:color="auto" w:sz="4" w:space="0"/>
-            <w:right w:val="single" w:color="auto" w:sz="4" w:space="0"/>
-            <w:insideH w:val="single" w:color="auto" w:sz="4" w:space="0"/>
-            <w:insideV w:val="single" w:color="auto" w:sz="4" w:space="0"/>
-          </w:tblBorders>
-          <w:tblCellMar>
-            <w:left w:w="108" w:type="dxa"/>
-            <w:right w:w="108" w:type="dxa"/>
-          </w:tblCellMar>
-        </w:tblPrEx>
-        <w:trPr>
-          <w:trHeight w:val="448" w:hRule="atLeast"/>
-        </w:trPr>
-        <w:tc>
-          <w:tcPr>
-            <w:tcW w:w="4003" w:type="dxa"/>
-            <w:vMerge w:val="continue"/>
-            <w:tcBorders/>
-            <w:vAlign w:val="center"/>
-          </w:tcPr>
-          <w:p>
-            <w:pPr>
-              <w:spacing w:line="240" w:lineRule="auto"/>
-              <w:jc w:val="left"/>
-              <w:rPr>
-                <w:rFonts w:hint="default" w:ascii="Times New Roman" w:hAnsi="Times New Roman" w:cs="Times New Roman"/>
-                <w:sz w:val="26"/>
-                <w:szCs w:val="26"/>
-                <w:vertAlign w:val="baseline"/>
-                <w:lang w:val="vi-VN"/>
-              </w:rPr>
-            </w:pPr>
-          </w:p>
-        </w:tc>
-        <w:tc>
-          <w:tcPr>
-            <w:tcW w:w="4519" w:type="dxa"/>
-            <w:vAlign w:val="center"/>
-          </w:tcPr>
-          <w:p>
-            <w:pPr>
-              <w:spacing w:line="240" w:lineRule="auto"/>
-              <w:jc w:val="left"/>
-              <w:rPr>
-                <w:rFonts w:hint="default" w:ascii="Times New Roman" w:hAnsi="Times New Roman" w:cs="Times New Roman"/>
-                <w:sz w:val="26"/>
-                <w:szCs w:val="26"/>
-                <w:vertAlign w:val="baseline"/>
-                <w:lang w:val="vi-VN"/>
-              </w:rPr>
-            </w:pPr>
-            <w:r>
-              <w:rPr>
-                <w:rFonts w:hint="default" w:ascii="Times New Roman" w:hAnsi="Times New Roman"/>
-                <w:sz w:val="26"/>
-                <w:szCs w:val="26"/>
-                <w:vertAlign w:val="baseline"/>
-                <w:lang w:val="vi-VN"/>
-              </w:rPr>
-              <w:t>Quản lý hồ sơ</w:t>
-            </w:r>
-          </w:p>
-        </w:tc>
-      </w:tr>
-      <w:tr>
-        <w:tblPrEx>
-          <w:tblBorders>
-            <w:top w:val="single" w:color="auto" w:sz="4" w:space="0"/>
-            <w:left w:val="single" w:color="auto" w:sz="4" w:space="0"/>
-            <w:bottom w:val="single" w:color="auto" w:sz="4" w:space="0"/>
-            <w:right w:val="single" w:color="auto" w:sz="4" w:space="0"/>
-            <w:insideH w:val="single" w:color="auto" w:sz="4" w:space="0"/>
-            <w:insideV w:val="single" w:color="auto" w:sz="4" w:space="0"/>
-          </w:tblBorders>
-          <w:tblCellMar>
-            <w:left w:w="108" w:type="dxa"/>
-            <w:right w:w="108" w:type="dxa"/>
-          </w:tblCellMar>
-        </w:tblPrEx>
-        <w:trPr>
-          <w:trHeight w:val="448" w:hRule="atLeast"/>
-        </w:trPr>
-        <w:tc>
-          <w:tcPr>
-            <w:tcW w:w="4003" w:type="dxa"/>
-            <w:vMerge w:val="continue"/>
-            <w:tcBorders/>
-            <w:vAlign w:val="center"/>
-          </w:tcPr>
-          <w:p>
-            <w:pPr>
-              <w:spacing w:line="240" w:lineRule="auto"/>
-              <w:jc w:val="left"/>
-              <w:rPr>
-                <w:rFonts w:hint="default" w:ascii="Times New Roman" w:hAnsi="Times New Roman" w:cs="Times New Roman"/>
-                <w:sz w:val="26"/>
-                <w:szCs w:val="26"/>
-                <w:vertAlign w:val="baseline"/>
-                <w:lang w:val="vi-VN"/>
-              </w:rPr>
-            </w:pPr>
-          </w:p>
-        </w:tc>
-        <w:tc>
-          <w:tcPr>
-            <w:tcW w:w="4519" w:type="dxa"/>
-            <w:vAlign w:val="center"/>
-          </w:tcPr>
-          <w:p>
-            <w:pPr>
-              <w:spacing w:line="240" w:lineRule="auto"/>
-              <w:jc w:val="left"/>
-              <w:rPr>
-                <w:rFonts w:hint="default" w:ascii="Times New Roman" w:hAnsi="Times New Roman" w:cs="Times New Roman"/>
-                <w:sz w:val="26"/>
-                <w:szCs w:val="26"/>
-                <w:vertAlign w:val="baseline"/>
-                <w:lang w:val="vi-VN"/>
-              </w:rPr>
-            </w:pPr>
-            <w:r>
-              <w:rPr>
-                <w:rFonts w:hint="default" w:ascii="Times New Roman" w:hAnsi="Times New Roman"/>
-                <w:sz w:val="26"/>
-                <w:szCs w:val="26"/>
-                <w:vertAlign w:val="baseline"/>
-                <w:lang w:val="vi-VN"/>
-              </w:rPr>
-              <w:t>Quản lý kỹ năng người dùng</w:t>
-            </w:r>
-          </w:p>
-        </w:tc>
-      </w:tr>
-      <w:tr>
-        <w:tblPrEx>
-          <w:tblBorders>
-            <w:top w:val="single" w:color="auto" w:sz="4" w:space="0"/>
-            <w:left w:val="single" w:color="auto" w:sz="4" w:space="0"/>
-            <w:bottom w:val="single" w:color="auto" w:sz="4" w:space="0"/>
-            <w:right w:val="single" w:color="auto" w:sz="4" w:space="0"/>
-            <w:insideH w:val="single" w:color="auto" w:sz="4" w:space="0"/>
-            <w:insideV w:val="single" w:color="auto" w:sz="4" w:space="0"/>
-          </w:tblBorders>
-          <w:tblCellMar>
-            <w:left w:w="108" w:type="dxa"/>
-            <w:right w:w="108" w:type="dxa"/>
-          </w:tblCellMar>
-        </w:tblPrEx>
-        <w:trPr>
-          <w:trHeight w:val="448" w:hRule="atLeast"/>
-        </w:trPr>
-        <w:tc>
-          <w:tcPr>
-            <w:tcW w:w="4003" w:type="dxa"/>
-            <w:vMerge w:val="continue"/>
-            <w:tcBorders/>
-            <w:vAlign w:val="center"/>
-          </w:tcPr>
-          <w:p>
-            <w:pPr>
-              <w:spacing w:line="240" w:lineRule="auto"/>
-              <w:jc w:val="left"/>
-              <w:rPr>
-                <w:rFonts w:hint="default" w:ascii="Times New Roman" w:hAnsi="Times New Roman" w:cs="Times New Roman"/>
-                <w:sz w:val="26"/>
-                <w:szCs w:val="26"/>
-                <w:vertAlign w:val="baseline"/>
-                <w:lang w:val="vi-VN"/>
-              </w:rPr>
-            </w:pPr>
-          </w:p>
-        </w:tc>
-        <w:tc>
-          <w:tcPr>
-            <w:tcW w:w="4519" w:type="dxa"/>
-            <w:vAlign w:val="center"/>
-          </w:tcPr>
-          <w:p>
-            <w:pPr>
-              <w:spacing w:line="240" w:lineRule="auto"/>
-              <w:jc w:val="left"/>
-              <w:rPr>
-                <w:rFonts w:hint="default" w:ascii="Times New Roman" w:hAnsi="Times New Roman" w:cs="Times New Roman"/>
-                <w:sz w:val="26"/>
-                <w:szCs w:val="26"/>
-                <w:vertAlign w:val="baseline"/>
-                <w:lang w:val="vi-VN"/>
-              </w:rPr>
-            </w:pPr>
-            <w:r>
-              <w:rPr>
-                <w:rFonts w:hint="default" w:ascii="Times New Roman" w:hAnsi="Times New Roman"/>
-                <w:sz w:val="26"/>
-                <w:szCs w:val="26"/>
-                <w:vertAlign w:val="baseline"/>
-                <w:lang w:val="vi-VN"/>
-              </w:rPr>
-              <w:t>Quản lý thống kê</w:t>
+              <w:keepNext w:val="0"/>
+              <w:keepLines w:val="0"/>
+              <w:widowControl/>
+              <w:suppressLineNumbers w:val="0"/>
+              <w:jc w:val="left"/>
+              <w:textAlignment w:val="center"/>
+              <w:rPr>
+                <w:rFonts w:hint="default" w:ascii="Times New Roman" w:hAnsi="Times New Roman"/>
+                <w:sz w:val="26"/>
+                <w:szCs w:val="26"/>
+                <w:vertAlign w:val="baseline"/>
+                <w:lang w:val="vi-VN"/>
+              </w:rPr>
+            </w:pPr>
+            <w:r>
+              <w:rPr>
+                <w:rFonts w:hint="default" w:ascii="Times New Roman" w:hAnsi="Times New Roman" w:eastAsia="SimSun" w:cs="Times New Roman"/>
+                <w:i w:val="0"/>
+                <w:iCs w:val="0"/>
+                <w:color w:val="000000"/>
+                <w:kern w:val="0"/>
+                <w:sz w:val="26"/>
+                <w:szCs w:val="26"/>
+                <w:u w:val="none"/>
+                <w:lang w:val="en-US" w:eastAsia="zh-CN" w:bidi="ar"/>
+              </w:rPr>
+              <w:t>Báo cáo và phân tích</w:t>
             </w:r>
           </w:p>
         </w:tc>
@@ -4349,7 +5596,7 @@
   <w:docDefaults>
     <w:rPrDefault>
       <w:rPr>
-        <w:rFonts w:asciiTheme="minorHAnsi" w:hAnsiTheme="minorHAnsi" w:eastAsiaTheme="minorEastAsia" w:cstheme="minorBidi"/>
+        <w:rFonts w:ascii="Times New Roman" w:hAnsi="Times New Roman" w:eastAsia="SimSun" w:cs="Times New Roman"/>
       </w:rPr>
     </w:rPrDefault>
     <w:pPrDefault/>

</xml_diff>

<commit_message>
complete code and documents
</commit_message>
<xml_diff>
--- a/Báo Cáo Tiến Độ Và Kết Quả.docx
+++ b/Báo Cáo Tiến Độ Và Kết Quả.docx
@@ -206,8 +206,6 @@
           <w:lang w:val="vi-VN"/>
         </w:rPr>
       </w:pPr>
-      <w:bookmarkStart w:id="0" w:name="_GoBack"/>
-      <w:bookmarkEnd w:id="0"/>
     </w:p>
     <w:p>
       <w:pPr>
@@ -550,7 +548,7 @@
           <w:p>
             <w:pPr>
               <w:widowControl w:val="0"/>
-              <w:spacing w:line="360" w:lineRule="auto"/>
+              <w:spacing w:line="240" w:lineRule="auto"/>
               <w:jc w:val="left"/>
               <w:rPr>
                 <w:rFonts w:hint="default" w:ascii="Times New Roman" w:hAnsi="Times New Roman" w:cs="Times New Roman"/>
@@ -574,7 +572,7 @@
           <w:p>
             <w:pPr>
               <w:widowControl w:val="0"/>
-              <w:spacing w:line="360" w:lineRule="auto"/>
+              <w:spacing w:line="240" w:lineRule="auto"/>
               <w:jc w:val="left"/>
               <w:rPr>
                 <w:rFonts w:hint="default" w:ascii="Times New Roman" w:hAnsi="Times New Roman" w:cs="Times New Roman"/>
@@ -604,7 +602,7 @@
           <w:p>
             <w:pPr>
               <w:widowControl w:val="0"/>
-              <w:spacing w:line="360" w:lineRule="auto"/>
+              <w:spacing w:line="240" w:lineRule="auto"/>
               <w:jc w:val="left"/>
               <w:rPr>
                 <w:rFonts w:hint="default" w:ascii="Times New Roman" w:hAnsi="Times New Roman" w:cs="Times New Roman"/>
@@ -652,7 +650,7 @@
           <w:p>
             <w:pPr>
               <w:widowControl w:val="0"/>
-              <w:spacing w:line="360" w:lineRule="auto"/>
+              <w:spacing w:line="240" w:lineRule="auto"/>
               <w:jc w:val="left"/>
               <w:rPr>
                 <w:rFonts w:hint="default" w:ascii="Times New Roman" w:hAnsi="Times New Roman" w:cs="Times New Roman"/>
@@ -676,7 +674,7 @@
           <w:p>
             <w:pPr>
               <w:widowControl w:val="0"/>
-              <w:spacing w:line="360" w:lineRule="auto"/>
+              <w:spacing w:line="240" w:lineRule="auto"/>
               <w:jc w:val="left"/>
               <w:rPr>
                 <w:rFonts w:hint="default" w:ascii="Times New Roman" w:hAnsi="Times New Roman" w:cs="Times New Roman"/>
@@ -706,7 +704,7 @@
           <w:p>
             <w:pPr>
               <w:widowControl w:val="0"/>
-              <w:spacing w:line="360" w:lineRule="auto"/>
+              <w:spacing w:line="240" w:lineRule="auto"/>
               <w:jc w:val="left"/>
               <w:rPr>
                 <w:rFonts w:hint="default" w:ascii="Times New Roman" w:hAnsi="Times New Roman" w:cs="Times New Roman"/>
@@ -838,7 +836,7 @@
           <w:p>
             <w:pPr>
               <w:widowControl w:val="0"/>
-              <w:spacing w:line="360" w:lineRule="auto"/>
+              <w:spacing w:line="240" w:lineRule="auto"/>
               <w:jc w:val="left"/>
               <w:rPr>
                 <w:rFonts w:hint="default" w:ascii="Times New Roman" w:hAnsi="Times New Roman" w:cs="Times New Roman"/>
@@ -862,7 +860,7 @@
           <w:p>
             <w:pPr>
               <w:widowControl w:val="0"/>
-              <w:spacing w:line="360" w:lineRule="auto"/>
+              <w:spacing w:line="240" w:lineRule="auto"/>
               <w:jc w:val="left"/>
               <w:rPr>
                 <w:rFonts w:hint="default" w:ascii="Times New Roman" w:hAnsi="Times New Roman" w:cs="Times New Roman"/>
@@ -992,6 +990,710 @@
                 <w:lang w:val="vi-VN"/>
               </w:rPr>
               <w:t>Project Test Plan</w:t>
+            </w:r>
+          </w:p>
+        </w:tc>
+      </w:tr>
+      <w:tr>
+        <w:tblPrEx>
+          <w:tblBorders>
+            <w:top w:val="single" w:color="auto" w:sz="4" w:space="0"/>
+            <w:left w:val="single" w:color="auto" w:sz="4" w:space="0"/>
+            <w:bottom w:val="single" w:color="auto" w:sz="4" w:space="0"/>
+            <w:right w:val="single" w:color="auto" w:sz="4" w:space="0"/>
+            <w:insideH w:val="single" w:color="auto" w:sz="4" w:space="0"/>
+            <w:insideV w:val="single" w:color="auto" w:sz="4" w:space="0"/>
+          </w:tblBorders>
+          <w:tblCellMar>
+            <w:top w:w="0" w:type="dxa"/>
+            <w:left w:w="108" w:type="dxa"/>
+            <w:bottom w:w="0" w:type="dxa"/>
+            <w:right w:w="108" w:type="dxa"/>
+          </w:tblCellMar>
+        </w:tblPrEx>
+        <w:trPr>
+          <w:trHeight w:val="448" w:hRule="atLeast"/>
+        </w:trPr>
+        <w:tc>
+          <w:tcPr>
+            <w:tcW w:w="3991" w:type="dxa"/>
+            <w:vAlign w:val="center"/>
+          </w:tcPr>
+          <w:p>
+            <w:pPr>
+              <w:widowControl w:val="0"/>
+              <w:spacing w:line="240" w:lineRule="auto"/>
+              <w:jc w:val="left"/>
+              <w:rPr>
+                <w:rFonts w:hint="default" w:ascii="Times New Roman" w:hAnsi="Times New Roman" w:cs="Times New Roman"/>
+                <w:sz w:val="26"/>
+                <w:szCs w:val="26"/>
+                <w:vertAlign w:val="baseline"/>
+                <w:lang w:val="vi-VN"/>
+              </w:rPr>
+            </w:pPr>
+            <w:r>
+              <w:rPr>
+                <w:rFonts w:hint="default" w:ascii="Times New Roman" w:hAnsi="Times New Roman" w:cs="Times New Roman"/>
+                <w:sz w:val="26"/>
+                <w:szCs w:val="26"/>
+                <w:vertAlign w:val="baseline"/>
+                <w:lang w:val="vi-VN"/>
+              </w:rPr>
+              <w:t>All team</w:t>
+            </w:r>
+          </w:p>
+        </w:tc>
+        <w:tc>
+          <w:tcPr>
+            <w:tcW w:w="4531" w:type="dxa"/>
+            <w:vAlign w:val="center"/>
+          </w:tcPr>
+          <w:p>
+            <w:pPr>
+              <w:widowControl w:val="0"/>
+              <w:spacing w:line="240" w:lineRule="auto"/>
+              <w:jc w:val="left"/>
+              <w:rPr>
+                <w:rFonts w:hint="default" w:ascii="Times New Roman" w:hAnsi="Times New Roman" w:cs="Times New Roman"/>
+                <w:sz w:val="26"/>
+                <w:szCs w:val="26"/>
+                <w:vertAlign w:val="baseline"/>
+                <w:lang w:val="vi-VN"/>
+              </w:rPr>
+            </w:pPr>
+            <w:r>
+              <w:rPr>
+                <w:rFonts w:hint="default" w:ascii="Times New Roman" w:hAnsi="Times New Roman" w:cs="Times New Roman"/>
+                <w:sz w:val="26"/>
+                <w:szCs w:val="26"/>
+                <w:vertAlign w:val="baseline"/>
+                <w:lang w:val="vi-VN"/>
+              </w:rPr>
+              <w:t>Testcase Sprint 1</w:t>
+            </w:r>
+          </w:p>
+        </w:tc>
+      </w:tr>
+      <w:tr>
+        <w:tblPrEx>
+          <w:tblBorders>
+            <w:top w:val="single" w:color="auto" w:sz="4" w:space="0"/>
+            <w:left w:val="single" w:color="auto" w:sz="4" w:space="0"/>
+            <w:bottom w:val="single" w:color="auto" w:sz="4" w:space="0"/>
+            <w:right w:val="single" w:color="auto" w:sz="4" w:space="0"/>
+            <w:insideH w:val="single" w:color="auto" w:sz="4" w:space="0"/>
+            <w:insideV w:val="single" w:color="auto" w:sz="4" w:space="0"/>
+          </w:tblBorders>
+          <w:tblCellMar>
+            <w:top w:w="0" w:type="dxa"/>
+            <w:left w:w="108" w:type="dxa"/>
+            <w:bottom w:w="0" w:type="dxa"/>
+            <w:right w:w="108" w:type="dxa"/>
+          </w:tblCellMar>
+        </w:tblPrEx>
+        <w:trPr>
+          <w:trHeight w:val="448" w:hRule="atLeast"/>
+        </w:trPr>
+        <w:tc>
+          <w:tcPr>
+            <w:tcW w:w="3991" w:type="dxa"/>
+            <w:vAlign w:val="center"/>
+          </w:tcPr>
+          <w:p>
+            <w:pPr>
+              <w:widowControl w:val="0"/>
+              <w:spacing w:line="240" w:lineRule="auto"/>
+              <w:jc w:val="left"/>
+              <w:rPr>
+                <w:rFonts w:hint="default" w:ascii="Times New Roman" w:hAnsi="Times New Roman" w:cs="Times New Roman"/>
+                <w:sz w:val="26"/>
+                <w:szCs w:val="26"/>
+                <w:vertAlign w:val="baseline"/>
+                <w:lang w:val="vi-VN"/>
+              </w:rPr>
+            </w:pPr>
+            <w:r>
+              <w:rPr>
+                <w:rFonts w:hint="default" w:ascii="Times New Roman" w:hAnsi="Times New Roman" w:cs="Times New Roman"/>
+                <w:sz w:val="26"/>
+                <w:szCs w:val="26"/>
+                <w:vertAlign w:val="baseline"/>
+                <w:lang w:val="vi-VN"/>
+              </w:rPr>
+              <w:t>All team</w:t>
+            </w:r>
+          </w:p>
+        </w:tc>
+        <w:tc>
+          <w:tcPr>
+            <w:tcW w:w="4531" w:type="dxa"/>
+            <w:vAlign w:val="center"/>
+          </w:tcPr>
+          <w:p>
+            <w:pPr>
+              <w:widowControl w:val="0"/>
+              <w:spacing w:line="240" w:lineRule="auto"/>
+              <w:jc w:val="left"/>
+              <w:rPr>
+                <w:rFonts w:hint="default" w:ascii="Times New Roman" w:hAnsi="Times New Roman" w:cs="Times New Roman"/>
+                <w:sz w:val="26"/>
+                <w:szCs w:val="26"/>
+                <w:vertAlign w:val="baseline"/>
+                <w:lang w:val="vi-VN"/>
+              </w:rPr>
+            </w:pPr>
+            <w:r>
+              <w:rPr>
+                <w:rFonts w:hint="default" w:ascii="Times New Roman" w:hAnsi="Times New Roman" w:cs="Times New Roman"/>
+                <w:sz w:val="26"/>
+                <w:szCs w:val="26"/>
+                <w:vertAlign w:val="baseline"/>
+                <w:lang w:val="vi-VN"/>
+              </w:rPr>
+              <w:t>Testcase Sprint 2</w:t>
+            </w:r>
+          </w:p>
+        </w:tc>
+      </w:tr>
+      <w:tr>
+        <w:tblPrEx>
+          <w:tblBorders>
+            <w:top w:val="single" w:color="auto" w:sz="4" w:space="0"/>
+            <w:left w:val="single" w:color="auto" w:sz="4" w:space="0"/>
+            <w:bottom w:val="single" w:color="auto" w:sz="4" w:space="0"/>
+            <w:right w:val="single" w:color="auto" w:sz="4" w:space="0"/>
+            <w:insideH w:val="single" w:color="auto" w:sz="4" w:space="0"/>
+            <w:insideV w:val="single" w:color="auto" w:sz="4" w:space="0"/>
+          </w:tblBorders>
+          <w:tblCellMar>
+            <w:top w:w="0" w:type="dxa"/>
+            <w:left w:w="108" w:type="dxa"/>
+            <w:bottom w:w="0" w:type="dxa"/>
+            <w:right w:w="108" w:type="dxa"/>
+          </w:tblCellMar>
+        </w:tblPrEx>
+        <w:trPr>
+          <w:trHeight w:val="448" w:hRule="atLeast"/>
+        </w:trPr>
+        <w:tc>
+          <w:tcPr>
+            <w:tcW w:w="3991" w:type="dxa"/>
+            <w:shd w:val="clear" w:color="auto" w:fill="auto"/>
+            <w:vAlign w:val="center"/>
+          </w:tcPr>
+          <w:p>
+            <w:pPr>
+              <w:widowControl w:val="0"/>
+              <w:spacing w:line="240" w:lineRule="auto"/>
+              <w:jc w:val="left"/>
+              <w:rPr>
+                <w:rFonts w:hint="default" w:ascii="Times New Roman" w:hAnsi="Times New Roman" w:cs="Times New Roman" w:eastAsiaTheme="minorEastAsia"/>
+                <w:sz w:val="26"/>
+                <w:szCs w:val="26"/>
+                <w:vertAlign w:val="baseline"/>
+                <w:lang w:val="vi-VN" w:eastAsia="zh-CN" w:bidi="ar-SA"/>
+              </w:rPr>
+            </w:pPr>
+            <w:r>
+              <w:rPr>
+                <w:rFonts w:hint="default" w:ascii="Times New Roman" w:hAnsi="Times New Roman" w:cs="Times New Roman"/>
+                <w:sz w:val="26"/>
+                <w:szCs w:val="26"/>
+                <w:vertAlign w:val="baseline"/>
+                <w:lang w:val="vi-VN"/>
+              </w:rPr>
+              <w:t>Đặng Phước Hoàng Long</w:t>
+            </w:r>
+          </w:p>
+        </w:tc>
+        <w:tc>
+          <w:tcPr>
+            <w:tcW w:w="4531" w:type="dxa"/>
+            <w:vAlign w:val="center"/>
+          </w:tcPr>
+          <w:p>
+            <w:pPr>
+              <w:widowControl w:val="0"/>
+              <w:spacing w:line="240" w:lineRule="auto"/>
+              <w:jc w:val="left"/>
+              <w:rPr>
+                <w:rFonts w:hint="default" w:ascii="Times New Roman" w:hAnsi="Times New Roman" w:cs="Times New Roman"/>
+                <w:sz w:val="26"/>
+                <w:szCs w:val="26"/>
+                <w:vertAlign w:val="baseline"/>
+                <w:lang w:val="vi-VN"/>
+              </w:rPr>
+            </w:pPr>
+            <w:r>
+              <w:rPr>
+                <w:rFonts w:hint="default" w:ascii="Times New Roman" w:hAnsi="Times New Roman" w:cs="Times New Roman"/>
+                <w:sz w:val="26"/>
+                <w:szCs w:val="26"/>
+                <w:vertAlign w:val="baseline"/>
+                <w:lang w:val="vi-VN"/>
+              </w:rPr>
+              <w:t>Test Report</w:t>
+            </w:r>
+          </w:p>
+        </w:tc>
+      </w:tr>
+      <w:tr>
+        <w:tblPrEx>
+          <w:tblBorders>
+            <w:top w:val="single" w:color="auto" w:sz="4" w:space="0"/>
+            <w:left w:val="single" w:color="auto" w:sz="4" w:space="0"/>
+            <w:bottom w:val="single" w:color="auto" w:sz="4" w:space="0"/>
+            <w:right w:val="single" w:color="auto" w:sz="4" w:space="0"/>
+            <w:insideH w:val="single" w:color="auto" w:sz="4" w:space="0"/>
+            <w:insideV w:val="single" w:color="auto" w:sz="4" w:space="0"/>
+          </w:tblBorders>
+          <w:tblCellMar>
+            <w:top w:w="0" w:type="dxa"/>
+            <w:left w:w="108" w:type="dxa"/>
+            <w:bottom w:w="0" w:type="dxa"/>
+            <w:right w:w="108" w:type="dxa"/>
+          </w:tblCellMar>
+        </w:tblPrEx>
+        <w:trPr>
+          <w:trHeight w:val="448" w:hRule="atLeast"/>
+        </w:trPr>
+        <w:tc>
+          <w:tcPr>
+            <w:tcW w:w="3991" w:type="dxa"/>
+            <w:shd w:val="clear" w:color="auto" w:fill="auto"/>
+            <w:vAlign w:val="center"/>
+          </w:tcPr>
+          <w:p>
+            <w:pPr>
+              <w:widowControl w:val="0"/>
+              <w:spacing w:line="240" w:lineRule="auto"/>
+              <w:jc w:val="left"/>
+              <w:rPr>
+                <w:rFonts w:hint="default" w:ascii="Times New Roman" w:hAnsi="Times New Roman" w:cs="Times New Roman"/>
+                <w:sz w:val="26"/>
+                <w:szCs w:val="26"/>
+                <w:vertAlign w:val="baseline"/>
+                <w:lang w:val="vi-VN"/>
+              </w:rPr>
+            </w:pPr>
+            <w:r>
+              <w:rPr>
+                <w:rFonts w:hint="default" w:ascii="Times New Roman" w:hAnsi="Times New Roman" w:cs="Times New Roman"/>
+                <w:sz w:val="26"/>
+                <w:szCs w:val="26"/>
+                <w:vertAlign w:val="baseline"/>
+                <w:lang w:val="vi-VN"/>
+              </w:rPr>
+              <w:t>Đặng Phước Hoàng Long</w:t>
+            </w:r>
+          </w:p>
+        </w:tc>
+        <w:tc>
+          <w:tcPr>
+            <w:tcW w:w="4531" w:type="dxa"/>
+            <w:vAlign w:val="center"/>
+          </w:tcPr>
+          <w:p>
+            <w:pPr>
+              <w:widowControl w:val="0"/>
+              <w:spacing w:line="240" w:lineRule="auto"/>
+              <w:jc w:val="left"/>
+              <w:rPr>
+                <w:rFonts w:hint="default" w:ascii="Times New Roman" w:hAnsi="Times New Roman" w:cs="Times New Roman"/>
+                <w:sz w:val="26"/>
+                <w:szCs w:val="26"/>
+                <w:vertAlign w:val="baseline"/>
+                <w:lang w:val="vi-VN"/>
+              </w:rPr>
+            </w:pPr>
+            <w:r>
+              <w:rPr>
+                <w:rFonts w:hint="default" w:ascii="Times New Roman" w:hAnsi="Times New Roman" w:cs="Times New Roman"/>
+                <w:sz w:val="26"/>
+                <w:szCs w:val="26"/>
+                <w:vertAlign w:val="baseline"/>
+                <w:lang w:val="vi-VN"/>
+              </w:rPr>
+              <w:t>Sprint Backlog</w:t>
+            </w:r>
+          </w:p>
+        </w:tc>
+      </w:tr>
+      <w:tr>
+        <w:tblPrEx>
+          <w:tblBorders>
+            <w:top w:val="single" w:color="auto" w:sz="4" w:space="0"/>
+            <w:left w:val="single" w:color="auto" w:sz="4" w:space="0"/>
+            <w:bottom w:val="single" w:color="auto" w:sz="4" w:space="0"/>
+            <w:right w:val="single" w:color="auto" w:sz="4" w:space="0"/>
+            <w:insideH w:val="single" w:color="auto" w:sz="4" w:space="0"/>
+            <w:insideV w:val="single" w:color="auto" w:sz="4" w:space="0"/>
+          </w:tblBorders>
+          <w:tblCellMar>
+            <w:top w:w="0" w:type="dxa"/>
+            <w:left w:w="108" w:type="dxa"/>
+            <w:bottom w:w="0" w:type="dxa"/>
+            <w:right w:w="108" w:type="dxa"/>
+          </w:tblCellMar>
+        </w:tblPrEx>
+        <w:trPr>
+          <w:trHeight w:val="448" w:hRule="atLeast"/>
+        </w:trPr>
+        <w:tc>
+          <w:tcPr>
+            <w:tcW w:w="3991" w:type="dxa"/>
+            <w:shd w:val="clear" w:color="auto" w:fill="auto"/>
+            <w:vAlign w:val="center"/>
+          </w:tcPr>
+          <w:p>
+            <w:pPr>
+              <w:widowControl w:val="0"/>
+              <w:spacing w:line="240" w:lineRule="auto"/>
+              <w:jc w:val="left"/>
+              <w:rPr>
+                <w:rFonts w:hint="default" w:ascii="Times New Roman" w:hAnsi="Times New Roman" w:cs="Times New Roman"/>
+                <w:sz w:val="26"/>
+                <w:szCs w:val="26"/>
+                <w:vertAlign w:val="baseline"/>
+                <w:lang w:val="vi-VN"/>
+              </w:rPr>
+            </w:pPr>
+            <w:r>
+              <w:rPr>
+                <w:rFonts w:hint="default" w:ascii="Times New Roman" w:hAnsi="Times New Roman" w:cs="Times New Roman"/>
+                <w:sz w:val="26"/>
+                <w:szCs w:val="26"/>
+                <w:vertAlign w:val="baseline"/>
+                <w:lang w:val="vi-VN"/>
+              </w:rPr>
+              <w:t>Nguyễn Đức Trí</w:t>
+            </w:r>
+          </w:p>
+        </w:tc>
+        <w:tc>
+          <w:tcPr>
+            <w:tcW w:w="4531" w:type="dxa"/>
+            <w:vAlign w:val="center"/>
+          </w:tcPr>
+          <w:p>
+            <w:pPr>
+              <w:widowControl w:val="0"/>
+              <w:spacing w:line="240" w:lineRule="auto"/>
+              <w:jc w:val="left"/>
+              <w:rPr>
+                <w:rFonts w:hint="default" w:ascii="Times New Roman" w:hAnsi="Times New Roman" w:cs="Times New Roman"/>
+                <w:sz w:val="26"/>
+                <w:szCs w:val="26"/>
+                <w:vertAlign w:val="baseline"/>
+                <w:lang w:val="vi-VN"/>
+              </w:rPr>
+            </w:pPr>
+            <w:r>
+              <w:rPr>
+                <w:rFonts w:hint="default" w:ascii="Times New Roman" w:hAnsi="Times New Roman" w:cs="Times New Roman"/>
+                <w:sz w:val="26"/>
+                <w:szCs w:val="26"/>
+                <w:vertAlign w:val="baseline"/>
+                <w:lang w:val="vi-VN"/>
+              </w:rPr>
+              <w:t>Meeting Report</w:t>
+            </w:r>
+          </w:p>
+        </w:tc>
+      </w:tr>
+      <w:tr>
+        <w:tblPrEx>
+          <w:tblBorders>
+            <w:top w:val="single" w:color="auto" w:sz="4" w:space="0"/>
+            <w:left w:val="single" w:color="auto" w:sz="4" w:space="0"/>
+            <w:bottom w:val="single" w:color="auto" w:sz="4" w:space="0"/>
+            <w:right w:val="single" w:color="auto" w:sz="4" w:space="0"/>
+            <w:insideH w:val="single" w:color="auto" w:sz="4" w:space="0"/>
+            <w:insideV w:val="single" w:color="auto" w:sz="4" w:space="0"/>
+          </w:tblBorders>
+          <w:tblCellMar>
+            <w:top w:w="0" w:type="dxa"/>
+            <w:left w:w="108" w:type="dxa"/>
+            <w:bottom w:w="0" w:type="dxa"/>
+            <w:right w:w="108" w:type="dxa"/>
+          </w:tblCellMar>
+        </w:tblPrEx>
+        <w:trPr>
+          <w:trHeight w:val="448" w:hRule="atLeast"/>
+        </w:trPr>
+        <w:tc>
+          <w:tcPr>
+            <w:tcW w:w="3991" w:type="dxa"/>
+            <w:shd w:val="clear" w:color="auto" w:fill="auto"/>
+            <w:vAlign w:val="center"/>
+          </w:tcPr>
+          <w:p>
+            <w:pPr>
+              <w:widowControl w:val="0"/>
+              <w:spacing w:after="0" w:line="240" w:lineRule="auto"/>
+              <w:jc w:val="left"/>
+              <w:rPr>
+                <w:rFonts w:hint="default" w:ascii="Times New Roman" w:hAnsi="Times New Roman" w:eastAsia="Calibri" w:cs="Times New Roman"/>
+                <w:sz w:val="26"/>
+                <w:szCs w:val="26"/>
+                <w:lang w:val="vi-VN"/>
+              </w:rPr>
+            </w:pPr>
+            <w:r>
+              <w:rPr>
+                <w:rFonts w:hint="default" w:ascii="Times New Roman" w:hAnsi="Times New Roman" w:eastAsia="Calibri" w:cs="Times New Roman"/>
+                <w:sz w:val="26"/>
+                <w:szCs w:val="26"/>
+                <w:lang w:val="en-US"/>
+              </w:rPr>
+              <w:t>L</w:t>
+            </w:r>
+            <w:r>
+              <w:rPr>
+                <w:rFonts w:hint="default" w:ascii="Times New Roman" w:hAnsi="Times New Roman" w:eastAsia="Calibri" w:cs="Times New Roman"/>
+                <w:sz w:val="26"/>
+                <w:szCs w:val="26"/>
+                <w:lang w:val="vi-VN"/>
+              </w:rPr>
+              <w:t>ê Trương Ánh Dương,</w:t>
+            </w:r>
+          </w:p>
+          <w:p>
+            <w:pPr>
+              <w:widowControl w:val="0"/>
+              <w:spacing w:line="240" w:lineRule="auto"/>
+              <w:jc w:val="left"/>
+              <w:rPr>
+                <w:rFonts w:hint="default" w:ascii="Times New Roman" w:hAnsi="Times New Roman" w:cs="Times New Roman"/>
+                <w:sz w:val="26"/>
+                <w:szCs w:val="26"/>
+                <w:vertAlign w:val="baseline"/>
+                <w:lang w:val="vi-VN"/>
+              </w:rPr>
+            </w:pPr>
+            <w:r>
+              <w:rPr>
+                <w:rFonts w:hint="default" w:ascii="Times New Roman" w:hAnsi="Times New Roman" w:eastAsia="Calibri" w:cs="Times New Roman"/>
+                <w:sz w:val="26"/>
+                <w:szCs w:val="26"/>
+              </w:rPr>
+              <w:t xml:space="preserve">Nguyễn </w:t>
+            </w:r>
+            <w:r>
+              <w:rPr>
+                <w:rFonts w:hint="default" w:ascii="Times New Roman" w:hAnsi="Times New Roman" w:eastAsia="Calibri" w:cs="Times New Roman"/>
+                <w:sz w:val="26"/>
+                <w:szCs w:val="26"/>
+                <w:lang w:val="en-US"/>
+              </w:rPr>
+              <w:t>Đức Trí</w:t>
+            </w:r>
+          </w:p>
+        </w:tc>
+        <w:tc>
+          <w:tcPr>
+            <w:tcW w:w="4531" w:type="dxa"/>
+            <w:vAlign w:val="center"/>
+          </w:tcPr>
+          <w:p>
+            <w:pPr>
+              <w:widowControl w:val="0"/>
+              <w:spacing w:line="240" w:lineRule="auto"/>
+              <w:jc w:val="left"/>
+              <w:rPr>
+                <w:rFonts w:hint="default" w:ascii="Times New Roman" w:hAnsi="Times New Roman" w:cs="Times New Roman"/>
+                <w:sz w:val="26"/>
+                <w:szCs w:val="26"/>
+                <w:vertAlign w:val="baseline"/>
+                <w:lang w:val="vi-VN"/>
+              </w:rPr>
+            </w:pPr>
+            <w:r>
+              <w:rPr>
+                <w:rFonts w:hint="default" w:ascii="Times New Roman" w:hAnsi="Times New Roman" w:cs="Times New Roman"/>
+                <w:sz w:val="26"/>
+                <w:szCs w:val="26"/>
+                <w:vertAlign w:val="baseline"/>
+                <w:lang w:val="vi-VN"/>
+              </w:rPr>
+              <w:t>Configuration Management</w:t>
+            </w:r>
+          </w:p>
+        </w:tc>
+      </w:tr>
+      <w:tr>
+        <w:tblPrEx>
+          <w:tblBorders>
+            <w:top w:val="single" w:color="auto" w:sz="4" w:space="0"/>
+            <w:left w:val="single" w:color="auto" w:sz="4" w:space="0"/>
+            <w:bottom w:val="single" w:color="auto" w:sz="4" w:space="0"/>
+            <w:right w:val="single" w:color="auto" w:sz="4" w:space="0"/>
+            <w:insideH w:val="single" w:color="auto" w:sz="4" w:space="0"/>
+            <w:insideV w:val="single" w:color="auto" w:sz="4" w:space="0"/>
+          </w:tblBorders>
+          <w:tblCellMar>
+            <w:top w:w="0" w:type="dxa"/>
+            <w:left w:w="108" w:type="dxa"/>
+            <w:bottom w:w="0" w:type="dxa"/>
+            <w:right w:w="108" w:type="dxa"/>
+          </w:tblCellMar>
+        </w:tblPrEx>
+        <w:trPr>
+          <w:trHeight w:val="448" w:hRule="atLeast"/>
+        </w:trPr>
+        <w:tc>
+          <w:tcPr>
+            <w:tcW w:w="3991" w:type="dxa"/>
+            <w:shd w:val="clear" w:color="auto" w:fill="auto"/>
+            <w:vAlign w:val="center"/>
+          </w:tcPr>
+          <w:p>
+            <w:pPr>
+              <w:widowControl w:val="0"/>
+              <w:spacing w:line="240" w:lineRule="auto"/>
+              <w:jc w:val="left"/>
+              <w:rPr>
+                <w:rFonts w:hint="default" w:ascii="Times New Roman" w:hAnsi="Times New Roman" w:cs="Times New Roman"/>
+                <w:sz w:val="26"/>
+                <w:szCs w:val="26"/>
+                <w:vertAlign w:val="baseline"/>
+                <w:lang w:val="vi-VN"/>
+              </w:rPr>
+            </w:pPr>
+            <w:r>
+              <w:rPr>
+                <w:rFonts w:hint="default" w:ascii="Times New Roman" w:hAnsi="Times New Roman" w:cs="Times New Roman"/>
+                <w:sz w:val="26"/>
+                <w:szCs w:val="26"/>
+                <w:vertAlign w:val="baseline"/>
+                <w:lang w:val="vi-VN"/>
+              </w:rPr>
+              <w:t>Nguyễn Đức Trí</w:t>
+            </w:r>
+          </w:p>
+        </w:tc>
+        <w:tc>
+          <w:tcPr>
+            <w:tcW w:w="4531" w:type="dxa"/>
+            <w:vAlign w:val="center"/>
+          </w:tcPr>
+          <w:p>
+            <w:pPr>
+              <w:widowControl w:val="0"/>
+              <w:spacing w:line="240" w:lineRule="auto"/>
+              <w:jc w:val="left"/>
+              <w:rPr>
+                <w:rFonts w:hint="default" w:ascii="Times New Roman" w:hAnsi="Times New Roman" w:cs="Times New Roman"/>
+                <w:sz w:val="26"/>
+                <w:szCs w:val="26"/>
+                <w:vertAlign w:val="baseline"/>
+                <w:lang w:val="vi-VN"/>
+              </w:rPr>
+            </w:pPr>
+            <w:r>
+              <w:rPr>
+                <w:rFonts w:hint="default" w:ascii="Times New Roman" w:hAnsi="Times New Roman" w:cs="Times New Roman"/>
+                <w:sz w:val="26"/>
+                <w:szCs w:val="26"/>
+                <w:vertAlign w:val="baseline"/>
+                <w:lang w:val="vi-VN"/>
+              </w:rPr>
+              <w:t>Project Reflection</w:t>
+            </w:r>
+          </w:p>
+        </w:tc>
+      </w:tr>
+      <w:tr>
+        <w:tblPrEx>
+          <w:tblBorders>
+            <w:top w:val="single" w:color="auto" w:sz="4" w:space="0"/>
+            <w:left w:val="single" w:color="auto" w:sz="4" w:space="0"/>
+            <w:bottom w:val="single" w:color="auto" w:sz="4" w:space="0"/>
+            <w:right w:val="single" w:color="auto" w:sz="4" w:space="0"/>
+            <w:insideH w:val="single" w:color="auto" w:sz="4" w:space="0"/>
+            <w:insideV w:val="single" w:color="auto" w:sz="4" w:space="0"/>
+          </w:tblBorders>
+          <w:tblCellMar>
+            <w:top w:w="0" w:type="dxa"/>
+            <w:left w:w="108" w:type="dxa"/>
+            <w:bottom w:w="0" w:type="dxa"/>
+            <w:right w:w="108" w:type="dxa"/>
+          </w:tblCellMar>
+        </w:tblPrEx>
+        <w:trPr>
+          <w:trHeight w:val="448" w:hRule="atLeast"/>
+        </w:trPr>
+        <w:tc>
+          <w:tcPr>
+            <w:tcW w:w="3991" w:type="dxa"/>
+            <w:shd w:val="clear" w:color="auto" w:fill="auto"/>
+            <w:vAlign w:val="center"/>
+          </w:tcPr>
+          <w:p>
+            <w:pPr>
+              <w:widowControl w:val="0"/>
+              <w:spacing w:line="240" w:lineRule="auto"/>
+              <w:jc w:val="left"/>
+              <w:rPr>
+                <w:rFonts w:hint="default" w:ascii="Times New Roman" w:hAnsi="Times New Roman" w:cs="Times New Roman"/>
+                <w:sz w:val="26"/>
+                <w:szCs w:val="26"/>
+                <w:vertAlign w:val="baseline"/>
+                <w:lang w:val="vi-VN"/>
+              </w:rPr>
+            </w:pPr>
+            <w:r>
+              <w:rPr>
+                <w:rFonts w:hint="default" w:ascii="Times New Roman" w:hAnsi="Times New Roman" w:cs="Times New Roman"/>
+                <w:sz w:val="26"/>
+                <w:szCs w:val="26"/>
+                <w:vertAlign w:val="baseline"/>
+                <w:lang w:val="vi-VN"/>
+              </w:rPr>
+              <w:t>Đặng Phước Hoàng Long</w:t>
+            </w:r>
+          </w:p>
+        </w:tc>
+        <w:tc>
+          <w:tcPr>
+            <w:tcW w:w="4531" w:type="dxa"/>
+            <w:vAlign w:val="center"/>
+          </w:tcPr>
+          <w:p>
+            <w:pPr>
+              <w:widowControl w:val="0"/>
+              <w:spacing w:line="240" w:lineRule="auto"/>
+              <w:jc w:val="left"/>
+              <w:rPr>
+                <w:rFonts w:hint="default" w:ascii="Times New Roman" w:hAnsi="Times New Roman" w:cs="Times New Roman"/>
+                <w:sz w:val="26"/>
+                <w:szCs w:val="26"/>
+                <w:vertAlign w:val="baseline"/>
+                <w:lang w:val="vi-VN"/>
+              </w:rPr>
+            </w:pPr>
+            <w:r>
+              <w:rPr>
+                <w:rFonts w:hint="default" w:ascii="Times New Roman" w:hAnsi="Times New Roman" w:cs="Times New Roman"/>
+                <w:sz w:val="26"/>
+                <w:szCs w:val="26"/>
+                <w:vertAlign w:val="baseline"/>
+                <w:lang w:val="vi-VN"/>
+              </w:rPr>
+              <w:t>Tóm Tắt Báo Cá</w:t>
+            </w:r>
+            <w:bookmarkStart w:id="0" w:name="_GoBack"/>
+            <w:bookmarkEnd w:id="0"/>
+            <w:r>
+              <w:rPr>
+                <w:rFonts w:hint="default" w:ascii="Times New Roman" w:hAnsi="Times New Roman" w:cs="Times New Roman"/>
+                <w:sz w:val="26"/>
+                <w:szCs w:val="26"/>
+                <w:vertAlign w:val="baseline"/>
+                <w:lang w:val="vi-VN"/>
+              </w:rPr>
+              <w:t>o</w:t>
             </w:r>
           </w:p>
         </w:tc>
@@ -1007,6 +1709,25 @@
           <w:lang w:val="vi-VN"/>
         </w:rPr>
       </w:pPr>
+    </w:p>
+    <w:p>
+      <w:pPr>
+        <w:rPr>
+          <w:rFonts w:hint="default" w:ascii="Times New Roman" w:hAnsi="Times New Roman" w:cs="Times New Roman"/>
+          <w:sz w:val="26"/>
+          <w:szCs w:val="26"/>
+          <w:lang w:val="vi-VN"/>
+        </w:rPr>
+      </w:pPr>
+      <w:r>
+        <w:rPr>
+          <w:rFonts w:hint="default" w:ascii="Times New Roman" w:hAnsi="Times New Roman" w:cs="Times New Roman"/>
+          <w:sz w:val="26"/>
+          <w:szCs w:val="26"/>
+          <w:lang w:val="vi-VN"/>
+        </w:rPr>
+        <w:br w:type="page"/>
+      </w:r>
     </w:p>
     <w:p>
       <w:pPr>
@@ -1291,7 +2012,7 @@
         <w:tc>
           <w:tcPr>
             <w:tcW w:w="4531" w:type="dxa"/>
-            <w:shd w:val="clear"/>
+            <w:shd w:val="clear" w:color="auto" w:fill="auto"/>
             <w:vAlign w:val="center"/>
           </w:tcPr>
           <w:p>
@@ -1344,7 +2065,6 @@
           <w:tcPr>
             <w:tcW w:w="3991" w:type="dxa"/>
             <w:vMerge w:val="continue"/>
-            <w:tcBorders/>
             <w:vAlign w:val="center"/>
           </w:tcPr>
           <w:p>
@@ -1417,7 +2137,6 @@
           <w:tcPr>
             <w:tcW w:w="3991" w:type="dxa"/>
             <w:vMerge w:val="continue"/>
-            <w:tcBorders/>
             <w:vAlign w:val="center"/>
           </w:tcPr>
           <w:p>
@@ -1490,7 +2209,6 @@
           <w:tcPr>
             <w:tcW w:w="3991" w:type="dxa"/>
             <w:vMerge w:val="continue"/>
-            <w:tcBorders/>
             <w:vAlign w:val="center"/>
           </w:tcPr>
           <w:p>
@@ -1645,7 +2363,6 @@
           <w:tcPr>
             <w:tcW w:w="3991" w:type="dxa"/>
             <w:vMerge w:val="continue"/>
-            <w:tcBorders/>
             <w:vAlign w:val="center"/>
           </w:tcPr>
           <w:p>
@@ -1718,7 +2435,6 @@
           <w:tcPr>
             <w:tcW w:w="3991" w:type="dxa"/>
             <w:vMerge w:val="continue"/>
-            <w:tcBorders/>
             <w:vAlign w:val="center"/>
           </w:tcPr>
           <w:p>
@@ -1791,7 +2507,6 @@
           <w:tcPr>
             <w:tcW w:w="3991" w:type="dxa"/>
             <w:vMerge w:val="continue"/>
-            <w:tcBorders/>
             <w:vAlign w:val="center"/>
           </w:tcPr>
           <w:p>
@@ -1864,7 +2579,6 @@
           <w:tcPr>
             <w:tcW w:w="3991" w:type="dxa"/>
             <w:vMerge w:val="continue"/>
-            <w:tcBorders/>
             <w:vAlign w:val="center"/>
           </w:tcPr>
           <w:p>
@@ -2019,7 +2733,6 @@
           <w:tcPr>
             <w:tcW w:w="3991" w:type="dxa"/>
             <w:vMerge w:val="continue"/>
-            <w:tcBorders/>
             <w:vAlign w:val="center"/>
           </w:tcPr>
           <w:p>
@@ -2092,7 +2805,6 @@
           <w:tcPr>
             <w:tcW w:w="3991" w:type="dxa"/>
             <w:vMerge w:val="continue"/>
-            <w:tcBorders/>
             <w:vAlign w:val="center"/>
           </w:tcPr>
           <w:p>
@@ -2165,7 +2877,6 @@
           <w:tcPr>
             <w:tcW w:w="3991" w:type="dxa"/>
             <w:vMerge w:val="continue"/>
-            <w:tcBorders/>
             <w:vAlign w:val="center"/>
           </w:tcPr>
           <w:p>
@@ -2238,7 +2949,6 @@
           <w:tcPr>
             <w:tcW w:w="3991" w:type="dxa"/>
             <w:vMerge w:val="continue"/>
-            <w:tcBorders/>
             <w:vAlign w:val="center"/>
           </w:tcPr>
           <w:p>
@@ -2311,7 +3021,6 @@
           <w:tcPr>
             <w:tcW w:w="3991" w:type="dxa"/>
             <w:vMerge w:val="continue"/>
-            <w:tcBorders/>
             <w:vAlign w:val="center"/>
           </w:tcPr>
           <w:p>
@@ -2384,7 +3093,6 @@
           <w:tcPr>
             <w:tcW w:w="3991" w:type="dxa"/>
             <w:vMerge w:val="continue"/>
-            <w:tcBorders/>
             <w:vAlign w:val="center"/>
           </w:tcPr>
           <w:p>
@@ -2539,7 +3247,6 @@
           <w:tcPr>
             <w:tcW w:w="3991" w:type="dxa"/>
             <w:vMerge w:val="continue"/>
-            <w:tcBorders/>
             <w:vAlign w:val="center"/>
           </w:tcPr>
           <w:p>
@@ -2612,7 +3319,6 @@
           <w:tcPr>
             <w:tcW w:w="3991" w:type="dxa"/>
             <w:vMerge w:val="continue"/>
-            <w:tcBorders/>
             <w:vAlign w:val="center"/>
           </w:tcPr>
           <w:p>
@@ -2685,7 +3391,6 @@
           <w:tcPr>
             <w:tcW w:w="3991" w:type="dxa"/>
             <w:vMerge w:val="continue"/>
-            <w:tcBorders/>
             <w:vAlign w:val="center"/>
           </w:tcPr>
           <w:p>
@@ -2758,7 +3463,6 @@
           <w:tcPr>
             <w:tcW w:w="3991" w:type="dxa"/>
             <w:vMerge w:val="continue"/>
-            <w:tcBorders/>
             <w:vAlign w:val="center"/>
           </w:tcPr>
           <w:p>
@@ -2831,7 +3535,6 @@
           <w:tcPr>
             <w:tcW w:w="3991" w:type="dxa"/>
             <w:vMerge w:val="continue"/>
-            <w:tcBorders/>
             <w:vAlign w:val="center"/>
           </w:tcPr>
           <w:p>
@@ -2904,7 +3607,6 @@
           <w:tcPr>
             <w:tcW w:w="3991" w:type="dxa"/>
             <w:vMerge w:val="continue"/>
-            <w:tcBorders/>
             <w:vAlign w:val="center"/>
           </w:tcPr>
           <w:p>
@@ -3059,7 +3761,6 @@
           <w:tcPr>
             <w:tcW w:w="3991" w:type="dxa"/>
             <w:vMerge w:val="continue"/>
-            <w:tcBorders/>
             <w:vAlign w:val="center"/>
           </w:tcPr>
           <w:p>
@@ -3132,7 +3833,6 @@
           <w:tcPr>
             <w:tcW w:w="3991" w:type="dxa"/>
             <w:vMerge w:val="continue"/>
-            <w:tcBorders/>
             <w:vAlign w:val="center"/>
           </w:tcPr>
           <w:p>
@@ -3205,7 +3905,6 @@
           <w:tcPr>
             <w:tcW w:w="3991" w:type="dxa"/>
             <w:vMerge w:val="continue"/>
-            <w:tcBorders/>
             <w:vAlign w:val="center"/>
           </w:tcPr>
           <w:p>
@@ -3278,7 +3977,6 @@
           <w:tcPr>
             <w:tcW w:w="3991" w:type="dxa"/>
             <w:vMerge w:val="continue"/>
-            <w:tcBorders/>
             <w:vAlign w:val="center"/>
           </w:tcPr>
           <w:p>
@@ -5141,7 +5839,6 @@
           <w:tcPr>
             <w:tcW w:w="4003" w:type="dxa"/>
             <w:vMerge w:val="continue"/>
-            <w:tcBorders/>
             <w:vAlign w:val="center"/>
           </w:tcPr>
           <w:p>
@@ -5214,7 +5911,6 @@
           <w:tcPr>
             <w:tcW w:w="4003" w:type="dxa"/>
             <w:vMerge w:val="continue"/>
-            <w:tcBorders/>
             <w:vAlign w:val="center"/>
           </w:tcPr>
           <w:p>
@@ -5287,7 +5983,6 @@
           <w:tcPr>
             <w:tcW w:w="4003" w:type="dxa"/>
             <w:vMerge w:val="continue"/>
-            <w:tcBorders/>
             <w:vAlign w:val="center"/>
           </w:tcPr>
           <w:p>
@@ -5360,7 +6055,6 @@
           <w:tcPr>
             <w:tcW w:w="4003" w:type="dxa"/>
             <w:vMerge w:val="continue"/>
-            <w:tcBorders/>
             <w:vAlign w:val="center"/>
           </w:tcPr>
           <w:p>
@@ -5433,7 +6127,6 @@
           <w:tcPr>
             <w:tcW w:w="4003" w:type="dxa"/>
             <w:vMerge w:val="continue"/>
-            <w:tcBorders/>
             <w:vAlign w:val="center"/>
           </w:tcPr>
           <w:p>
@@ -5499,12 +6192,6 @@
             <w:insideH w:val="single" w:color="auto" w:sz="4" w:space="0"/>
             <w:insideV w:val="single" w:color="auto" w:sz="4" w:space="0"/>
           </w:tblBorders>
-          <w:tblCellMar>
-            <w:top w:w="0" w:type="dxa"/>
-            <w:left w:w="108" w:type="dxa"/>
-            <w:bottom w:w="0" w:type="dxa"/>
-            <w:right w:w="108" w:type="dxa"/>
-          </w:tblCellMar>
         </w:tblPrEx>
         <w:trPr>
           <w:trHeight w:val="448" w:hRule="atLeast"/>
@@ -5513,7 +6200,6 @@
           <w:tcPr>
             <w:tcW w:w="4003" w:type="dxa"/>
             <w:vMerge w:val="continue"/>
-            <w:tcBorders/>
             <w:vAlign w:val="center"/>
           </w:tcPr>
           <w:p>
@@ -5705,7 +6391,7 @@
     <w:lsdException w:unhideWhenUsed="0" w:uiPriority="0" w:semiHidden="0" w:name="HTML Sample"/>
     <w:lsdException w:unhideWhenUsed="0" w:uiPriority="0" w:semiHidden="0" w:name="HTML Typewriter"/>
     <w:lsdException w:unhideWhenUsed="0" w:uiPriority="0" w:semiHidden="0" w:name="HTML Variable"/>
-    <w:lsdException w:unhideWhenUsed="0" w:uiPriority="0" w:name="Normal Table"/>
+    <w:lsdException w:qFormat="1" w:unhideWhenUsed="0" w:uiPriority="0" w:name="Normal Table"/>
     <w:lsdException w:unhideWhenUsed="0" w:uiPriority="0" w:semiHidden="0" w:name="annotation subject"/>
     <w:lsdException w:unhideWhenUsed="0" w:uiPriority="0" w:semiHidden="0" w:name="Table Simple 1"/>
     <w:lsdException w:unhideWhenUsed="0" w:uiPriority="0" w:semiHidden="0" w:name="Table Simple 2"/>
@@ -5750,7 +6436,7 @@
     <w:lsdException w:unhideWhenUsed="0" w:uiPriority="0" w:semiHidden="0" w:name="Table Web 2"/>
     <w:lsdException w:unhideWhenUsed="0" w:uiPriority="0" w:semiHidden="0" w:name="Table Web 3"/>
     <w:lsdException w:unhideWhenUsed="0" w:uiPriority="0" w:semiHidden="0" w:name="Balloon Text"/>
-    <w:lsdException w:unhideWhenUsed="0" w:uiPriority="0" w:semiHidden="0" w:name="Table Grid"/>
+    <w:lsdException w:qFormat="1" w:unhideWhenUsed="0" w:uiPriority="0" w:semiHidden="0" w:name="Table Grid"/>
     <w:lsdException w:unhideWhenUsed="0" w:uiPriority="0" w:semiHidden="0" w:name="Table Theme"/>
     <w:lsdException w:unhideWhenUsed="0" w:uiPriority="60" w:semiHidden="0" w:name="Light Shading"/>
     <w:lsdException w:unhideWhenUsed="0" w:uiPriority="61" w:semiHidden="0" w:name="Light List"/>
@@ -5868,6 +6554,7 @@
   <w:style w:type="table" w:default="1" w:styleId="3">
     <w:name w:val="Normal Table"/>
     <w:semiHidden/>
+    <w:qFormat/>
     <w:uiPriority w:val="0"/>
     <w:tblPr>
       <w:tblCellMar>
@@ -5881,10 +6568,30 @@
   <w:style w:type="table" w:styleId="4">
     <w:name w:val="Table Grid"/>
     <w:basedOn w:val="3"/>
+    <w:qFormat/>
     <w:uiPriority w:val="0"/>
     <w:pPr>
       <w:widowControl w:val="0"/>
       <w:jc w:val="both"/>
+    </w:pPr>
+    <w:tblPr>
+      <w:tblBorders>
+        <w:top w:val="single" w:color="auto" w:sz="4" w:space="0"/>
+        <w:left w:val="single" w:color="auto" w:sz="4" w:space="0"/>
+        <w:bottom w:val="single" w:color="auto" w:sz="4" w:space="0"/>
+        <w:right w:val="single" w:color="auto" w:sz="4" w:space="0"/>
+        <w:insideH w:val="single" w:color="auto" w:sz="4" w:space="0"/>
+        <w:insideV w:val="single" w:color="auto" w:sz="4" w:space="0"/>
+      </w:tblBorders>
+    </w:tblPr>
+  </w:style>
+  <w:style w:type="table" w:customStyle="1" w:styleId="5">
+    <w:name w:val="Table Grid1"/>
+    <w:basedOn w:val="3"/>
+    <w:qFormat/>
+    <w:uiPriority w:val="39"/>
+    <w:pPr>
+      <w:spacing w:after="0" w:line="240" w:lineRule="auto"/>
     </w:pPr>
     <w:tblPr>
       <w:tblBorders>

</xml_diff>